<commit_message>
Améliore la rédaction de la note Niger et rend les citations cliquables
- Rédaction resserrée : message principal, enjeux, comparaison des
  scénarios, gains concrets d'une limitation du réchauffement (49 jours
  de chaleur dangereuse évités, pluies extrêmes +17 % au lieu de +43 %),
  position de négociation, limites des données.
- Chaque citation dans le texte ouvre directement la source (DOI ou URL),
  en PDF comme en Word ; liens des références actifs.

Co-Authored-By: Claude Opus 5.5 <noreply@anthropic.com>
Claude-Session: https://claude.ai/code/session_01KUsbuaysKhPQSJCGSc45ce
</commit_message>
<xml_diff>
--- a/devoir-niger/memo-final/word/Niger_Policy_Memo.docx
+++ b/devoir-niger/memo-final/word/Niger_Policy_Memo.docx
@@ -182,7 +182,7 @@
                 <w:rFonts w:ascii="Times New Roman" w:hAnsi="Times New Roman"/>
                 <w:sz w:val="18"/>
               </w:rPr>
-              <w:t xml:space="preserve">What Niger stands to lose, and to gain if warming is limited</w:t>
+              <w:t xml:space="preserve">What Niger stands to lose, and what it gains if warming is limited</w:t>
             </w:r>
           </w:p>
         </w:tc>
@@ -209,7 +209,7 @@
           <w:bCs/>
           <w:b/>
         </w:rPr>
-        <w:t xml:space="preserve">Under current global policies, Niger would face about 91 days a year of dangerous heat by 2100, three</w:t>
+        <w:t xml:space="preserve">By 2100, current global policies would roughly triple the number of days on which heat becomes dangerous</w:t>
       </w:r>
       <w:r>
         <w:rPr>
@@ -223,37 +223,37 @@
           <w:bCs/>
           <w:b/>
         </w:rPr>
-        <w:t xml:space="preserve">times today’s 31; if the world holds warming below 2 °C, that number stabilises at around 42.</w:t>
-      </w:r>
-      <w:r>
-        <w:t xml:space="preserve"> </w:t>
-      </w:r>
-      <w:r>
-        <w:t xml:space="preserve">In an</w:t>
-      </w:r>
-      <w:r>
-        <w:t xml:space="preserve"> </w:t>
-      </w:r>
-      <w:r>
-        <w:t xml:space="preserve">economy where farming and herding employ more than 80 % of people, mostly outdoors, this is the largest</w:t>
-      </w:r>
-      <w:r>
-        <w:t xml:space="preserve"> </w:t>
-      </w:r>
-      <w:r>
-        <w:t xml:space="preserve">avoidable loss. Current policies would also make the heaviest multi-day rains about 43 % more intense,</w:t>
-      </w:r>
-      <w:r>
-        <w:t xml:space="preserve"> </w:t>
-      </w:r>
-      <w:r>
-        <w:t xml:space="preserve">against 17 % below 2 °C. Severe drought months, however, will touch almost the whole country by 2030 in</w:t>
-      </w:r>
-      <w:r>
-        <w:t xml:space="preserve"> </w:t>
-      </w:r>
-      <w:r>
-        <w:t xml:space="preserve">every scenario, so</w:t>
+        <w:t xml:space="preserve">in Niger, from about 31 a year today to 91; holding warming below 2 °C would cap it at about 42.</w:t>
+      </w:r>
+      <w:r>
+        <w:t xml:space="preserve"> </w:t>
+      </w:r>
+      <w:r>
+        <w:t xml:space="preserve">With more</w:t>
+      </w:r>
+      <w:r>
+        <w:t xml:space="preserve"> </w:t>
+      </w:r>
+      <w:r>
+        <w:t xml:space="preserve">than 80 % of Nigeriens working outdoors in farming and herding, this is the largest loss that global</w:t>
+      </w:r>
+      <w:r>
+        <w:t xml:space="preserve"> </w:t>
+      </w:r>
+      <w:r>
+        <w:t xml:space="preserve">mitigation can still prevent. The heaviest multi-day rains would also intensify far more under current</w:t>
+      </w:r>
+      <w:r>
+        <w:t xml:space="preserve"> </w:t>
+      </w:r>
+      <w:r>
+        <w:t xml:space="preserve">policies (+43 %) than below 2 °C (+17 %). Severe drought, by contrast, reaches almost the whole country</w:t>
+      </w:r>
+      <w:r>
+        <w:t xml:space="preserve"> </w:t>
+      </w:r>
+      <w:r>
+        <w:t xml:space="preserve">by 2030 in every scenario.</w:t>
       </w:r>
       <w:r>
         <w:t xml:space="preserve"> </w:t>
@@ -263,7 +263,7 @@
           <w:bCs/>
           <w:b/>
         </w:rPr>
-        <w:t xml:space="preserve">Niger must both push for a rapid global phase-out of emissions and invest in</w:t>
+        <w:t xml:space="preserve">Niger’s national interest is therefore twofold: press for a rapid global</w:t>
       </w:r>
       <w:r>
         <w:rPr>
@@ -277,16 +277,16 @@
           <w:bCs/>
           <w:b/>
         </w:rPr>
-        <w:t xml:space="preserve">adaptation now.</w:t>
+        <w:t xml:space="preserve">phase-out of emissions, and secure the finance to adapt now.</w:t>
       </w:r>
     </w:p>
-    <w:bookmarkStart w:id="20" w:name="Xd6926cfe6af129f79ad24aeee32dcebba184937"/>
+    <w:bookmarkStart w:id="22" w:name="Xd80f144e15fb041c63977807bcfccac165ea994"/>
     <w:p>
       <w:pPr>
         <w:pStyle w:val="Heading1"/>
       </w:pPr>
       <w:r>
-        <w:t xml:space="preserve">1. Why Niger is unusually exposed, and not responsible</w:t>
+        <w:t xml:space="preserve">1. Why the stakes are unusually high for Niger</w:t>
       </w:r>
     </w:p>
     <w:p>
@@ -301,19 +301,30 @@
           <w:bCs/>
           <w:b/>
         </w:rPr>
-        <w:t xml:space="preserve">An open-air economy.</w:t>
-      </w:r>
-      <w:r>
-        <w:t xml:space="preserve"> </w:t>
-      </w:r>
-      <w:r>
-        <w:t xml:space="preserve">Agriculture and livestock account for almost 40 % of GDP and over</w:t>
-      </w:r>
-      <w:r>
-        <w:t xml:space="preserve"> </w:t>
-      </w:r>
-      <w:r>
-        <w:t xml:space="preserve">80 % of jobs, and depend overwhelmingly on rainfall (World Bank, 2024).</w:t>
+        <w:t xml:space="preserve">An economy that works in the open air.</w:t>
+      </w:r>
+      <w:r>
+        <w:t xml:space="preserve"> </w:t>
+      </w:r>
+      <w:r>
+        <w:t xml:space="preserve">Agriculture and livestock generate almost 40 % of GDP</w:t>
+      </w:r>
+      <w:r>
+        <w:t xml:space="preserve"> </w:t>
+      </w:r>
+      <w:r>
+        <w:t xml:space="preserve">and over 80 % of employment, and depend overwhelmingly on rainfall (</w:t>
+      </w:r>
+      <w:hyperlink r:id="rId20">
+        <w:r>
+          <w:rPr>
+            <w:rStyle w:val="Hyperlink"/>
+          </w:rPr>
+          <w:t xml:space="preserve">World Bank, 2024</w:t>
+        </w:r>
+      </w:hyperlink>
+      <w:r>
+        <w:t xml:space="preserve">).</w:t>
       </w:r>
     </w:p>
     <w:p>
@@ -328,19 +339,30 @@
           <w:bCs/>
           <w:b/>
         </w:rPr>
-        <w:t xml:space="preserve">Shocks are already frequent and costly.</w:t>
-      </w:r>
-      <w:r>
-        <w:t xml:space="preserve"> </w:t>
-      </w:r>
-      <w:r>
-        <w:t xml:space="preserve">The 2005 and 2010 droughts triggered national food</w:t>
-      </w:r>
-      <w:r>
-        <w:t xml:space="preserve"> </w:t>
-      </w:r>
-      <w:r>
-        <w:t xml:space="preserve">crises; the 2024 floods killed 339 people and affected more than 1.1 million (AFP, 2024).</w:t>
+        <w:t xml:space="preserve">Shocks that are already frequent and deadly.</w:t>
+      </w:r>
+      <w:r>
+        <w:t xml:space="preserve"> </w:t>
+      </w:r>
+      <w:r>
+        <w:t xml:space="preserve">The 2005 and 2010 droughts triggered national</w:t>
+      </w:r>
+      <w:r>
+        <w:t xml:space="preserve"> </w:t>
+      </w:r>
+      <w:r>
+        <w:t xml:space="preserve">food crises; the 2024 floods killed 339 people and affected more than 1.1 million (</w:t>
+      </w:r>
+      <w:hyperlink r:id="rId21">
+        <w:r>
+          <w:rPr>
+            <w:rStyle w:val="Hyperlink"/>
+          </w:rPr>
+          <w:t xml:space="preserve">AFP, 2024</w:t>
+        </w:r>
+      </w:hyperlink>
+      <w:r>
+        <w:t xml:space="preserve">).</w:t>
       </w:r>
     </w:p>
     <w:p>
@@ -355,29 +377,29 @@
           <w:bCs/>
           <w:b/>
         </w:rPr>
-        <w:t xml:space="preserve">A negligible contributor.</w:t>
-      </w:r>
-      <w:r>
-        <w:t xml:space="preserve"> </w:t>
-      </w:r>
-      <w:r>
-        <w:t xml:space="preserve">Niger emits a tiny share of global greenhouse gases: the losses</w:t>
-      </w:r>
-      <w:r>
-        <w:t xml:space="preserve"> </w:t>
-      </w:r>
-      <w:r>
-        <w:t xml:space="preserve">below are driven by others’ emissions, and can only be limited by others’ cuts.</w:t>
+        <w:t xml:space="preserve">Exposure without responsibility.</w:t>
+      </w:r>
+      <w:r>
+        <w:t xml:space="preserve"> </w:t>
+      </w:r>
+      <w:r>
+        <w:t xml:space="preserve">Niger emits a negligible share of global greenhouse gases.</w:t>
+      </w:r>
+      <w:r>
+        <w:t xml:space="preserve"> </w:t>
+      </w:r>
+      <w:r>
+        <w:t xml:space="preserve">The losses described below are driven by other countries’ emissions and can only be limited by their cuts.</w:t>
       </w:r>
     </w:p>
-    <w:bookmarkEnd w:id="20"/>
-    <w:bookmarkStart w:id="24" w:name="X68231dbfc8e23b70f9b124ce6074d57e95ee308"/>
+    <w:bookmarkEnd w:id="22"/>
+    <w:bookmarkStart w:id="30" w:name="X39e5cabf790fdd760c8b76197e70039a91d430d"/>
     <w:p>
       <w:pPr>
         <w:pStyle w:val="Heading1"/>
       </w:pPr>
       <w:r>
-        <w:t xml:space="preserve">2. Three priority impacts: below 2 °C versus current policies</w:t>
+        <w:t xml:space="preserve">2. Three priority impacts, compared across scenarios</w:t>
       </w:r>
     </w:p>
     <w:p>
@@ -389,7 +411,7 @@
           <w:iCs/>
           <w:i/>
         </w:rPr>
-        <w:t xml:space="preserve">Source: Climate Impact Explorer (CIE), Niger, annual, area-weighted average. NGFS</w:t>
+        <w:t xml:space="preserve">Source:</w:t>
       </w:r>
       <w:r>
         <w:rPr>
@@ -398,19 +420,29 @@
         </w:rPr>
         <w:t xml:space="preserve"> </w:t>
       </w:r>
+      <w:hyperlink r:id="rId23">
+        <w:r>
+          <w:rPr>
+            <w:rStyle w:val="Hyperlink"/>
+            <w:iCs/>
+            <w:i/>
+          </w:rPr>
+          <w:t xml:space="preserve">Climate Impact Explorer</w:t>
+        </w:r>
+      </w:hyperlink>
       <w:r>
         <w:rPr>
           <w:iCs/>
           <w:i/>
         </w:rPr>
-        <w:t xml:space="preserve">“</w:t>
+        <w:t xml:space="preserve"> </w:t>
       </w:r>
       <w:r>
         <w:rPr>
           <w:iCs/>
           <w:i/>
         </w:rPr>
-        <w:t xml:space="preserve">Below</w:t>
+        <w:t xml:space="preserve">(Climate Analytics), Niger, annual values, area-weighted average. NGFS</w:t>
       </w:r>
       <w:r>
         <w:rPr>
@@ -424,84 +456,105 @@
           <w:iCs/>
           <w:i/>
         </w:rPr>
-        <w:t xml:space="preserve">2 °C</w:t>
+        <w:t xml:space="preserve">“</w:t>
       </w:r>
       <w:r>
         <w:rPr>
           <w:iCs/>
           <w:i/>
         </w:rPr>
-        <w:t xml:space="preserve">”</w:t>
+        <w:t xml:space="preserve">Below 2 °C</w:t>
       </w:r>
       <w:r>
         <w:rPr>
           <w:iCs/>
           <w:i/>
         </w:rPr>
-        <w:t xml:space="preserve"> </w:t>
+        <w:t xml:space="preserve">”</w:t>
       </w:r>
       <w:r>
         <w:rPr>
           <w:iCs/>
           <w:i/>
         </w:rPr>
-        <w:t xml:space="preserve">(1.6 °C of global warming in 2100) versus</w:t>
+        <w:t xml:space="preserve"> </w:t>
       </w:r>
       <w:r>
         <w:rPr>
           <w:iCs/>
           <w:i/>
         </w:rPr>
-        <w:t xml:space="preserve"> </w:t>
+        <w:t xml:space="preserve">scenario (1.6 °C of global warming in 2100) versus</w:t>
       </w:r>
       <w:r>
         <w:rPr>
           <w:iCs/>
           <w:i/>
         </w:rPr>
-        <w:t xml:space="preserve">“</w:t>
+        <w:t xml:space="preserve"> </w:t>
       </w:r>
       <w:r>
         <w:rPr>
           <w:iCs/>
           <w:i/>
         </w:rPr>
-        <w:t xml:space="preserve">Current policies</w:t>
+        <w:t xml:space="preserve">“</w:t>
       </w:r>
       <w:r>
         <w:rPr>
           <w:iCs/>
           <w:i/>
         </w:rPr>
-        <w:t xml:space="preserve">”</w:t>
+        <w:t xml:space="preserve">Current policies</w:t>
       </w:r>
       <w:r>
         <w:rPr>
           <w:iCs/>
           <w:i/>
         </w:rPr>
-        <w:t xml:space="preserve"> </w:t>
+        <w:t xml:space="preserve">”</w:t>
       </w:r>
       <w:r>
         <w:rPr>
           <w:iCs/>
           <w:i/>
         </w:rPr>
-        <w:t xml:space="preserve">(2.9 °C). Median of five</w:t>
+        <w:t xml:space="preserve"> </w:t>
       </w:r>
       <w:r>
         <w:rPr>
           <w:iCs/>
           <w:i/>
         </w:rPr>
-        <w:t xml:space="preserve"> </w:t>
+        <w:t xml:space="preserve">(2.9 °C). Median</w:t>
       </w:r>
       <w:r>
         <w:rPr>
           <w:iCs/>
           <w:i/>
         </w:rPr>
-        <w:t xml:space="preserve">climate models, 5–95 % range in brackets; the CIE flags results after 2060 as indicative.</w:t>
+        <w:t xml:space="preserve"> </w:t>
+      </w:r>
+      <w:r>
+        <w:rPr>
+          <w:iCs/>
+          <w:i/>
+        </w:rPr>
+        <w:t xml:space="preserve">of five climate models, with the 5–95 % model range in brackets; the tool flags results after 2060 as</w:t>
+      </w:r>
+      <w:r>
+        <w:rPr>
+          <w:iCs/>
+          <w:i/>
+        </w:rPr>
+        <w:t xml:space="preserve"> </w:t>
+      </w:r>
+      <w:r>
+        <w:rPr>
+          <w:iCs/>
+          <w:i/>
+        </w:rPr>
+        <w:t xml:space="preserve">indicative.</w:t>
       </w:r>
     </w:p>
     <w:tbl>
@@ -686,7 +739,7 @@
                 <w:i/>
                 <w:sz w:val="18"/>
               </w:rPr>
-              <w:t xml:space="preserve">Days per year with heat index above 40 °C</w:t>
+              <w:t xml:space="preserve">Days per year with a heat index above 40 °C</w:t>
             </w:r>
           </w:p>
         </w:tc>
@@ -926,7 +979,7 @@
                 <w:rFonts w:ascii="Times New Roman" w:hAnsi="Times New Roman"/>
                 <w:sz w:val="18"/>
               </w:rPr>
-              <w:t xml:space="preserve">Above this threshold, sustained outdoor work risks heat exhaustion and heat stroke, and most Nigeriens</w:t>
+              <w:t xml:space="preserve">Beyond this threshold, sustained physical work exposes people to heat exhaustion and heat stroke, yet most</w:t>
             </w:r>
             <w:r>
               <w:rPr>
@@ -940,7 +993,7 @@
                 <w:rFonts w:ascii="Times New Roman" w:hAnsi="Times New Roman"/>
                 <w:sz w:val="18"/>
               </w:rPr>
-              <w:t xml:space="preserve">farm, herd or build outdoors without cooling. CIE maps show a rise about twice as large in the populated</w:t>
+              <w:t xml:space="preserve">Nigeriens farm, herd or build outdoors with little access to cooling. The tool’s maps show the increase is about</w:t>
             </w:r>
             <w:r>
               <w:rPr>
@@ -954,7 +1007,7 @@
                 <w:rFonts w:ascii="Times New Roman" w:hAnsi="Times New Roman"/>
                 <w:sz w:val="18"/>
               </w:rPr>
-              <w:t xml:space="preserve">south as in the north (+44 versus +21 days at 2 °C compared with 1 °C of global warming). WASCAL</w:t>
+              <w:t xml:space="preserve">twice as large in the densely populated south as in the north (+44 versus +21 days at 2 °C compared with</w:t>
             </w:r>
             <w:r>
               <w:rPr>
@@ -968,7 +1021,7 @@
                 <w:rFonts w:ascii="Times New Roman" w:hAnsi="Times New Roman"/>
                 <w:sz w:val="18"/>
               </w:rPr>
-              <w:t xml:space="preserve">researchers project heat discomfort for over half of West Africa’s population even at 1.5–2 °C</w:t>
+              <w:t xml:space="preserve">1 °C of global warming). WASCAL researchers already project heat discomfort for more than half of West</w:t>
             </w:r>
             <w:r>
               <w:rPr>
@@ -982,7 +1035,22 @@
                 <w:rFonts w:ascii="Times New Roman" w:hAnsi="Times New Roman"/>
                 <w:sz w:val="18"/>
               </w:rPr>
-              <w:t xml:space="preserve">(Sylla et al., 2018).</w:t>
+              <w:t xml:space="preserve">Africa’s population at 1.5–2 °C (</w:t>
+            </w:r>
+            <w:hyperlink r:id="rId24">
+              <w:r>
+                <w:rPr>
+                  <w:rStyle w:val="Hyperlink"/>
+                </w:rPr>
+                <w:t xml:space="preserve">Sylla et al., 2018</w:t>
+              </w:r>
+            </w:hyperlink>
+            <w:r>
+              <w:rPr>
+                <w:rFonts w:ascii="Times New Roman" w:hAnsi="Times New Roman"/>
+                <w:sz w:val="18"/>
+              </w:rPr>
+              <w:t xml:space="preserve">).</w:t>
             </w:r>
           </w:p>
         </w:tc>
@@ -1279,7 +1347,7 @@
                 <w:rFonts w:ascii="Times New Roman" w:hAnsi="Times New Roman"/>
                 <w:sz w:val="18"/>
               </w:rPr>
-              <w:t xml:space="preserve">SPEI counts evaporation as well as rain, so it captures what heat does to soils, crops and pastures. By</w:t>
+              <w:t xml:space="preserve">Because SPEI accounts for evaporation as well as rainfall, it captures how heat dries out soils, crops and</w:t>
             </w:r>
             <w:r>
               <w:rPr>
@@ -1293,7 +1361,7 @@
                 <w:rFonts w:ascii="Times New Roman" w:hAnsi="Times New Roman"/>
                 <w:sz w:val="18"/>
               </w:rPr>
-              <w:t xml:space="preserve">2030, about 96 % of the country is affected in every scenario: severe drought months become the norm</w:t>
+              <w:t xml:space="preserve">pastures. Around 96 % of the country is affected by 2030 in every scenario, so severe drought months become</w:t>
             </w:r>
             <w:r>
               <w:rPr>
@@ -1307,7 +1375,7 @@
                 <w:rFonts w:ascii="Times New Roman" w:hAnsi="Times New Roman"/>
                 <w:sz w:val="18"/>
               </w:rPr>
-              <w:t xml:space="preserve">whatever the world does. Only a 1.5 °C pathway brings this back down (87 % by 2100). WASCAL crop</w:t>
+              <w:t xml:space="preserve">the norm whatever the world does; only a 1.5 °C pathway brings the share back down (87 % by 2100). WASCAL</w:t>
             </w:r>
             <w:r>
               <w:rPr>
@@ -1321,7 +1389,22 @@
                 <w:rFonts w:ascii="Times New Roman" w:hAnsi="Times New Roman"/>
                 <w:sz w:val="18"/>
               </w:rPr>
-              <w:t xml:space="preserve">modelling projects falling millet yields in most scenarios (Mohamed et al., 2025).</w:t>
+              <w:t xml:space="preserve">crop modelling projects declining millet yields in most scenarios (</w:t>
+            </w:r>
+            <w:hyperlink r:id="rId25">
+              <w:r>
+                <w:rPr>
+                  <w:rStyle w:val="Hyperlink"/>
+                </w:rPr>
+                <w:t xml:space="preserve">Mohamed et al., 2025</w:t>
+              </w:r>
+            </w:hyperlink>
+            <w:r>
+              <w:rPr>
+                <w:rFonts w:ascii="Times New Roman" w:hAnsi="Times New Roman"/>
+                <w:sz w:val="18"/>
+              </w:rPr>
+              <w:t xml:space="preserve">).</w:t>
             </w:r>
           </w:p>
         </w:tc>
@@ -1618,7 +1701,7 @@
                 <w:rFonts w:ascii="Times New Roman" w:hAnsi="Times New Roman"/>
                 <w:sz w:val="18"/>
               </w:rPr>
-              <w:t xml:space="preserve">Heavier downpours on bare, crusted soils flood Niamey and the Niger River valley, where people,</w:t>
+              <w:t xml:space="preserve">Heavier downpours on bare, crusted soils produce the floods that strike Niamey and the Niger River valley, where</w:t>
             </w:r>
             <w:r>
               <w:rPr>
@@ -1632,7 +1715,7 @@
                 <w:rFonts w:ascii="Times New Roman" w:hAnsi="Times New Roman"/>
                 <w:sz w:val="18"/>
               </w:rPr>
-              <w:t xml:space="preserve">infrastructure and irrigated rice are concentrated. Under current policies, even the low end of the model</w:t>
+              <w:t xml:space="preserve">people, infrastructure and irrigated rice are concentrated. Under current policies, even the low end of the</w:t>
             </w:r>
             <w:r>
               <w:rPr>
@@ -1646,7 +1729,7 @@
                 <w:rFonts w:ascii="Times New Roman" w:hAnsi="Times New Roman"/>
                 <w:sz w:val="18"/>
               </w:rPr>
-              <w:t xml:space="preserve">range shows an increase by 2100. Extreme Sahelian storms have already tripled in frequency since 1982</w:t>
+              <w:t xml:space="preserve">model range shows an increase by 2100, and extreme Sahelian storms have already tripled in frequency since 1982</w:t>
             </w:r>
             <w:r>
               <w:rPr>
@@ -1660,7 +1743,22 @@
                 <w:rFonts w:ascii="Times New Roman" w:hAnsi="Times New Roman"/>
                 <w:sz w:val="18"/>
               </w:rPr>
-              <w:t xml:space="preserve">(Taylor et al., 2017).</w:t>
+              <w:t xml:space="preserve">(</w:t>
+            </w:r>
+            <w:hyperlink r:id="rId26">
+              <w:r>
+                <w:rPr>
+                  <w:rStyle w:val="Hyperlink"/>
+                </w:rPr>
+                <w:t xml:space="preserve">Taylor et al., 2017</w:t>
+              </w:r>
+            </w:hyperlink>
+            <w:r>
+              <w:rPr>
+                <w:rFonts w:ascii="Times New Roman" w:hAnsi="Times New Roman"/>
+                <w:sz w:val="18"/>
+              </w:rPr>
+              <w:t xml:space="preserve">).</w:t>
             </w:r>
           </w:p>
         </w:tc>
@@ -1675,18 +1773,18 @@
           <wp:inline>
             <wp:extent cx="5334000" cy="2482040"/>
             <wp:effectExtent b="0" l="0" r="0" t="0"/>
-            <wp:docPr descr="" title="" id="22" name="Picture"/>
+            <wp:docPr descr="" title="" id="28" name="Picture"/>
             <a:graphic>
               <a:graphicData uri="http://schemas.openxmlformats.org/drawingml/2006/picture">
                 <pic:pic>
                   <pic:nvPicPr>
-                    <pic:cNvPr descr="cie_figure.png" id="23" name="Picture"/>
+                    <pic:cNvPr descr="cie_figure.png" id="29" name="Picture"/>
                     <pic:cNvPicPr>
                       <a:picLocks noChangeArrowheads="1" noChangeAspect="1"/>
                     </pic:cNvPicPr>
                   </pic:nvPicPr>
                   <pic:blipFill>
-                    <a:blip r:embed="rId21"/>
+                    <a:blip r:embed="rId27"/>
                     <a:stretch>
                       <a:fillRect/>
                     </a:stretch>
@@ -1742,41 +1840,55 @@
         <w:t xml:space="preserve"> </w:t>
       </w:r>
       <w:r>
-        <w:t xml:space="preserve">The two paths are identical until about 2030, then diverge: by 2100, current</w:t>
-      </w:r>
-      <w:r>
-        <w:t xml:space="preserve"> </w:t>
-      </w:r>
-      <w:r>
-        <w:t xml:space="preserve">policies (blue) lead to about 91 days a year, against 42 below 2 °C (green) and 31 today. The shaded bands</w:t>
-      </w:r>
-      <w:r>
-        <w:t xml:space="preserve"> </w:t>
-      </w:r>
-      <w:r>
-        <w:t xml:space="preserve">(model uncertainty) overlap, but even the low end of the current-policies range (59 days) exceeds the central</w:t>
-      </w:r>
-      <w:r>
-        <w:t xml:space="preserve"> </w:t>
-      </w:r>
-      <w:r>
-        <w:t xml:space="preserve">below-2 °C estimate. Hatched area: results after 2060 are indicative. Source: Climate Impact Explorer,</w:t>
-      </w:r>
-      <w:r>
-        <w:t xml:space="preserve"> </w:t>
-      </w:r>
-      <w:r>
-        <w:t xml:space="preserve">Climate Analytics (ISIMIP data).</w:t>
+        <w:t xml:space="preserve">The two pathways are identical until about 2030 and then diverge. By 2100,</w:t>
+      </w:r>
+      <w:r>
+        <w:t xml:space="preserve"> </w:t>
+      </w:r>
+      <w:r>
+        <w:t xml:space="preserve">current policies (blue) lead to about 91 days a year, against 42 below 2 °C (green) and 31 today. The shaded</w:t>
+      </w:r>
+      <w:r>
+        <w:t xml:space="preserve"> </w:t>
+      </w:r>
+      <w:r>
+        <w:t xml:space="preserve">uncertainty bands overlap, yet even the low end of the current-policies range (59 days) exceeds the central</w:t>
+      </w:r>
+      <w:r>
+        <w:t xml:space="preserve"> </w:t>
+      </w:r>
+      <w:r>
+        <w:t xml:space="preserve">below-2 °C estimate. Hatched area: results after 2060 are indicative. Source:</w:t>
+      </w:r>
+      <w:r>
+        <w:t xml:space="preserve"> </w:t>
+      </w:r>
+      <w:hyperlink r:id="rId23">
+        <w:r>
+          <w:rPr>
+            <w:rStyle w:val="Hyperlink"/>
+          </w:rPr>
+          <w:t xml:space="preserve">Climate Impact Explorer</w:t>
+        </w:r>
+      </w:hyperlink>
+      <w:r>
+        <w:t xml:space="preserve">, Climate Analytics</w:t>
+      </w:r>
+      <w:r>
+        <w:t xml:space="preserve"> </w:t>
+      </w:r>
+      <w:r>
+        <w:t xml:space="preserve">(ISIMIP data).</w:t>
       </w:r>
     </w:p>
-    <w:bookmarkEnd w:id="24"/>
-    <w:bookmarkStart w:id="25" w:name="Xfea160e7a0acdde38fb92e35e7c057650e1debf"/>
+    <w:bookmarkEnd w:id="30"/>
+    <w:bookmarkStart w:id="32" w:name="Xffbbd2a5976d1f58f4ba17879975b42208e7042"/>
     <w:p>
       <w:pPr>
         <w:pStyle w:val="Heading1"/>
       </w:pPr>
       <w:r>
-        <w:t xml:space="preserve">3. Implications for Niger’s national interest</w:t>
+        <w:t xml:space="preserve">3. What limiting warming would change for Niger</w:t>
       </w:r>
     </w:p>
     <w:p>
@@ -1788,37 +1900,60 @@
           <w:bCs/>
           <w:b/>
         </w:rPr>
-        <w:t xml:space="preserve">Heat is the largest avoidable loss.</w:t>
-      </w:r>
-      <w:r>
-        <w:t xml:space="preserve"> </w:t>
-      </w:r>
-      <w:r>
-        <w:t xml:space="preserve">Moving from current policies to a below-2 °C world avoids</w:t>
-      </w:r>
-      <w:r>
-        <w:t xml:space="preserve"> </w:t>
-      </w:r>
-      <w:r>
-        <w:t xml:space="preserve">roughly 50 days of dangerous heat a year by 2100, nearly two months in which outdoor work, livestock and</w:t>
-      </w:r>
-      <w:r>
-        <w:t xml:space="preserve"> </w:t>
-      </w:r>
-      <w:r>
-        <w:t xml:space="preserve">health are at risk. The World Bank (2022) estimates that climate change could cut Niger’s annual GDP by</w:t>
-      </w:r>
-      <w:r>
-        <w:t xml:space="preserve"> </w:t>
-      </w:r>
-      <w:r>
-        <w:t xml:space="preserve">2.2 % (wet, optimistic scenario) to 11.9 % (dry, pessimistic scenario) by 2050, before counting migration</w:t>
-      </w:r>
-      <w:r>
-        <w:t xml:space="preserve"> </w:t>
-      </w:r>
-      <w:r>
-        <w:t xml:space="preserve">or conflict.</w:t>
+        <w:t xml:space="preserve">The gains are large and concentrated where people live.</w:t>
+      </w:r>
+      <w:r>
+        <w:t xml:space="preserve"> </w:t>
+      </w:r>
+      <w:r>
+        <w:t xml:space="preserve">Compared with current policies, a</w:t>
+      </w:r>
+      <w:r>
+        <w:t xml:space="preserve"> </w:t>
+      </w:r>
+      <w:r>
+        <w:t xml:space="preserve">below-2 °C world would spare Niger about 49 days of dangerous heat a year by 2100, nearly two months in</w:t>
+      </w:r>
+      <w:r>
+        <w:t xml:space="preserve"> </w:t>
+      </w:r>
+      <w:r>
+        <w:t xml:space="preserve">which outdoor work, livestock and health are at risk, and would cut the intensification of extreme rainfall</w:t>
+      </w:r>
+      <w:r>
+        <w:t xml:space="preserve"> </w:t>
+      </w:r>
+      <w:r>
+        <w:t xml:space="preserve">from +43 % to +17 %. A 1.5 °C pathway would go further, holding dangerous-heat days near today’s level</w:t>
+      </w:r>
+      <w:r>
+        <w:t xml:space="preserve"> </w:t>
+      </w:r>
+      <w:r>
+        <w:t xml:space="preserve">(32 a year by 2100). The economic stakes are of the same order: climate change could reduce Niger’s annual GDP</w:t>
+      </w:r>
+      <w:r>
+        <w:t xml:space="preserve"> </w:t>
+      </w:r>
+      <w:r>
+        <w:t xml:space="preserve">by 2.2 % in a wet, optimistic scenario and by 11.9 % in a dry, pessimistic one by 2050, before counting</w:t>
+      </w:r>
+      <w:r>
+        <w:t xml:space="preserve"> </w:t>
+      </w:r>
+      <w:r>
+        <w:t xml:space="preserve">migration or conflict (</w:t>
+      </w:r>
+      <w:hyperlink r:id="rId31">
+        <w:r>
+          <w:rPr>
+            <w:rStyle w:val="Hyperlink"/>
+          </w:rPr>
+          <w:t xml:space="preserve">World Bank, 2022</w:t>
+        </w:r>
+      </w:hyperlink>
+      <w:r>
+        <w:t xml:space="preserve">).</w:t>
       </w:r>
     </w:p>
     <w:p>
@@ -1830,73 +1965,49 @@
           <w:bCs/>
           <w:b/>
         </w:rPr>
-        <w:t xml:space="preserve">Drought makes adaptation unavoidable in every scenario.</w:t>
-      </w:r>
-      <w:r>
-        <w:t xml:space="preserve"> </w:t>
-      </w:r>
-      <w:r>
-        <w:t xml:space="preserve">Since severe drought months spread to almost</w:t>
-      </w:r>
-      <w:r>
-        <w:t xml:space="preserve"> </w:t>
-      </w:r>
-      <w:r>
-        <w:t xml:space="preserve">the whole country by 2030 regardless of emissions, Niger cannot wait: drought-tolerant millet and sorghum,</w:t>
-      </w:r>
-      <w:r>
-        <w:t xml:space="preserve"> </w:t>
-      </w:r>
-      <w:r>
-        <w:t xml:space="preserve">water harvesting, early warning and protection of herders’ mobility are needed now. The risk is a cascade:</w:t>
-      </w:r>
-      <w:r>
-        <w:t xml:space="preserve"> </w:t>
-      </w:r>
-      <w:r>
-        <w:t xml:space="preserve">hot, dry year → failed harvests and pastures → higher grain prices and distress sales</w:t>
-      </w:r>
-      <w:r>
-        <w:t xml:space="preserve"> </w:t>
-      </w:r>
-      <w:r>
-        <w:t xml:space="preserve">of livestock → malnutrition, debt and farmer–herder tensions → emergency spending that</w:t>
-      </w:r>
-      <w:r>
-        <w:t xml:space="preserve"> </w:t>
-      </w:r>
-      <w:r>
-        <w:t xml:space="preserve">crowds out investment.</w:t>
-      </w:r>
-    </w:p>
-    <w:p>
-      <w:pPr>
-        <w:pStyle w:val="BodyText"/>
-      </w:pPr>
-      <w:r>
-        <w:rPr>
-          <w:bCs/>
-          <w:b/>
-        </w:rPr>
-        <w:t xml:space="preserve">Floods grow with every tenth of a degree.</w:t>
-      </w:r>
-      <w:r>
-        <w:t xml:space="preserve"> </w:t>
-      </w:r>
-      <w:r>
-        <w:t xml:space="preserve">Extreme rainfall keeps intensifying under current policies</w:t>
-      </w:r>
-      <w:r>
-        <w:t xml:space="preserve"> </w:t>
-      </w:r>
-      <w:r>
-        <w:t xml:space="preserve">(+43 % by 2100) but levels off below 2 °C (+17 %). Limiting warming directly reduces the flood risk</w:t>
-      </w:r>
-      <w:r>
-        <w:t xml:space="preserve"> </w:t>
-      </w:r>
-      <w:r>
-        <w:t xml:space="preserve">facing Niamey and the river valley.</w:t>
+        <w:t xml:space="preserve">Drought makes adaptation urgent in every scenario.</w:t>
+      </w:r>
+      <w:r>
+        <w:t xml:space="preserve"> </w:t>
+      </w:r>
+      <w:r>
+        <w:t xml:space="preserve">Because severe drought months spread to almost the</w:t>
+      </w:r>
+      <w:r>
+        <w:t xml:space="preserve"> </w:t>
+      </w:r>
+      <w:r>
+        <w:t xml:space="preserve">whole country by 2030 regardless of emissions, adaptation cannot wait for the outcome of negotiations:</w:t>
+      </w:r>
+      <w:r>
+        <w:t xml:space="preserve"> </w:t>
+      </w:r>
+      <w:r>
+        <w:t xml:space="preserve">drought-tolerant millet and sorghum, water harvesting, early warning and the protection of herders’ mobility</w:t>
+      </w:r>
+      <w:r>
+        <w:t xml:space="preserve"> </w:t>
+      </w:r>
+      <w:r>
+        <w:t xml:space="preserve">are needed now. The danger lies in a cascade rather than a single number: a hot, dry year → failed</w:t>
+      </w:r>
+      <w:r>
+        <w:t xml:space="preserve"> </w:t>
+      </w:r>
+      <w:r>
+        <w:t xml:space="preserve">harvests and pastures → higher grain prices and distress sales of livestock →</w:t>
+      </w:r>
+      <w:r>
+        <w:t xml:space="preserve"> </w:t>
+      </w:r>
+      <w:r>
+        <w:t xml:space="preserve">malnutrition, household debt and farmer–herder tensions → emergency spending that crowds out</w:t>
+      </w:r>
+      <w:r>
+        <w:t xml:space="preserve"> </w:t>
+      </w:r>
+      <w:r>
+        <w:t xml:space="preserve">investment. Every tenth of a degree avoided makes such years rarer and the adaptation bill smaller.</w:t>
       </w:r>
     </w:p>
     <w:p>
@@ -1920,19 +2031,13 @@
         <w:pStyle w:val="KeyBox"/>
       </w:pPr>
       <w:r>
-        <w:t xml:space="preserve">Defend the 1.5 °C goal: it is the only pathway that brings heat days back to today’s level</w:t>
-      </w:r>
-      <w:r>
-        <w:t xml:space="preserve"> </w:t>
-      </w:r>
-      <w:r>
-        <w:t xml:space="preserve">(32 by 2100) and reverses drought spread; press major emitters for NDCs consistent with a rapid</w:t>
-      </w:r>
-      <w:r>
-        <w:t xml:space="preserve"> </w:t>
-      </w:r>
-      <w:r>
-        <w:t xml:space="preserve">fossil-fuel phase-out.</w:t>
+        <w:t xml:space="preserve">Defend the 1.5 °C goal, the only pathway that keeps dangerous heat near today’s level and reverses</w:t>
+      </w:r>
+      <w:r>
+        <w:t xml:space="preserve"> </w:t>
+      </w:r>
+      <w:r>
+        <w:t xml:space="preserve">the spread of drought, and press major emitters for NDCs consistent with a rapid fossil-fuel phase-out.</w:t>
       </w:r>
     </w:p>
     <w:p>
@@ -1944,7 +2049,13 @@
         <w:pStyle w:val="KeyBox"/>
       </w:pPr>
       <w:r>
-        <w:t xml:space="preserve">Tie Niger’s support to scaled-up, accessible adaptation finance for Least Developed Countries.</w:t>
+        <w:t xml:space="preserve">Link Niger’s support for any agreement to scaled-up adaptation finance with simplified access for Least</w:t>
+      </w:r>
+      <w:r>
+        <w:t xml:space="preserve"> </w:t>
+      </w:r>
+      <w:r>
+        <w:t xml:space="preserve">Developed Countries.</w:t>
       </w:r>
     </w:p>
     <w:p>
@@ -1956,23 +2067,23 @@
         <w:pStyle w:val="KeyBox"/>
       </w:pPr>
       <w:r>
-        <w:t xml:space="preserve">Use the Loss and Damage Fund for droughts and floods, in coalition with the African Group and the</w:t>
-      </w:r>
-      <w:r>
-        <w:t xml:space="preserve"> </w:t>
-      </w:r>
-      <w:r>
-        <w:t xml:space="preserve">LDC group.</w:t>
+        <w:t xml:space="preserve">Use the Loss and Damage Fund for droughts and floods, in coalition with the African Group of Negotiators</w:t>
+      </w:r>
+      <w:r>
+        <w:t xml:space="preserve"> </w:t>
+      </w:r>
+      <w:r>
+        <w:t xml:space="preserve">and the LDC Group.</w:t>
       </w:r>
     </w:p>
-    <w:bookmarkEnd w:id="25"/>
-    <w:bookmarkStart w:id="26" w:name="what-the-evidence-does-and-does-not-say"/>
+    <w:bookmarkEnd w:id="32"/>
+    <w:bookmarkStart w:id="33" w:name="confidence-and-limits-of-the-evidence"/>
     <w:p>
       <w:pPr>
         <w:pStyle w:val="Heading1"/>
       </w:pPr>
       <w:r>
-        <w:t xml:space="preserve">4. What the evidence does, and does not, say</w:t>
+        <w:t xml:space="preserve">4. Confidence and limits of the evidence</w:t>
       </w:r>
     </w:p>
     <w:p>
@@ -1980,43 +2091,49 @@
         <w:pStyle w:val="FirstParagraph"/>
       </w:pPr>
       <w:r>
-        <w:t xml:space="preserve">The direction of change is robust for heat; the size is not: by 2100 under current policies, models span 59</w:t>
-      </w:r>
-      <w:r>
-        <w:t xml:space="preserve"> </w:t>
-      </w:r>
-      <w:r>
-        <w:t xml:space="preserve">to 134 dangerous-heat days. Heat-index values rely on an approximation of humidity during the hottest hour, a</w:t>
-      </w:r>
-      <w:r>
-        <w:t xml:space="preserve"> </w:t>
-      </w:r>
-      <w:r>
-        <w:t xml:space="preserve">limitation the tool itself notes. The drought indicator counts a single month of severe drought, so it</w:t>
-      </w:r>
-      <w:r>
-        <w:t xml:space="preserve"> </w:t>
-      </w:r>
-      <w:r>
-        <w:t xml:space="preserve">saturates and barely separates scenarios. For extreme rainfall, the ranges include no change under low warming</w:t>
-      </w:r>
-      <w:r>
-        <w:t xml:space="preserve"> </w:t>
-      </w:r>
-      <w:r>
-        <w:t xml:space="preserve">but not under current policies by 2100. The tool’s only crop indicators (maize, rice, soy) were set aside</w:t>
-      </w:r>
-      <w:r>
-        <w:t xml:space="preserve"> </w:t>
-      </w:r>
-      <w:r>
-        <w:t xml:space="preserve">because Niger’s staples, millet and sorghum, are not modelled. Finally, these are hazard projections, not</w:t>
-      </w:r>
-      <w:r>
-        <w:t xml:space="preserve"> </w:t>
-      </w:r>
-      <w:r>
-        <w:t xml:space="preserve">forecasts; Niger’s high social vulnerability means real impacts are likely to be larger.</w:t>
+        <w:t xml:space="preserve">The direction of change is robust for heat, but its size is uncertain: under current policies, models span 59 to</w:t>
+      </w:r>
+      <w:r>
+        <w:t xml:space="preserve"> </w:t>
+      </w:r>
+      <w:r>
+        <w:t xml:space="preserve">134 dangerous-heat days in 2100. The heat index relies on an approximation of humidity during the hottest hour,</w:t>
+      </w:r>
+      <w:r>
+        <w:t xml:space="preserve"> </w:t>
+      </w:r>
+      <w:r>
+        <w:t xml:space="preserve">a limitation the tool acknowledges. The drought indicator counts a single month of severe drought, so it</w:t>
+      </w:r>
+      <w:r>
+        <w:t xml:space="preserve"> </w:t>
+      </w:r>
+      <w:r>
+        <w:t xml:space="preserve">saturates and barely separates the scenarios. For extreme rainfall, the model range includes no change under</w:t>
+      </w:r>
+      <w:r>
+        <w:t xml:space="preserve"> </w:t>
+      </w:r>
+      <w:r>
+        <w:t xml:space="preserve">low warming but not under current policies by 2100. The tool’s crop indicators (maize, rice, soy) were</w:t>
+      </w:r>
+      <w:r>
+        <w:t xml:space="preserve"> </w:t>
+      </w:r>
+      <w:r>
+        <w:t xml:space="preserve">deliberately set aside because Niger’s staples, millet and sorghum, are not modelled. Finally, these figures</w:t>
+      </w:r>
+      <w:r>
+        <w:t xml:space="preserve"> </w:t>
+      </w:r>
+      <w:r>
+        <w:t xml:space="preserve">are hazard projections, not forecasts: given Niger’s high social vulnerability, real impacts are likely to be</w:t>
+      </w:r>
+      <w:r>
+        <w:t xml:space="preserve"> </w:t>
+      </w:r>
+      <w:r>
+        <w:t xml:space="preserve">larger.</w:t>
       </w:r>
     </w:p>
     <w:p>
@@ -2024,7 +2141,7 @@
         <w:br w:type="page"/>
       </w:r>
     </w:p>
-    <w:bookmarkEnd w:id="26"/>
+    <w:bookmarkEnd w:id="33"/>
     <w:bookmarkStart w:id="34" w:name="references"/>
     <w:p>
       <w:pPr>
@@ -2057,7 +2174,7 @@
       <w:r>
         <w:t xml:space="preserve"> </w:t>
       </w:r>
-      <w:hyperlink r:id="rId27">
+      <w:hyperlink r:id="rId21">
         <w:r>
           <w:rPr>
             <w:rStyle w:val="Hyperlink"/>
@@ -2090,7 +2207,7 @@
         <w:t xml:space="preserve"> </w:t>
       </w:r>
       <w:r>
-        <w:t xml:space="preserve">dangerous heat risk (HI &gt; 40 °C), area under severe drought (SPEI &lt; −1.5), annual maximum 5-day</w:t>
+        <w:t xml:space="preserve">dangerous heat risk (HI &gt; 40 °C), area under severe drought (SPEI &lt; −1.5) and annual maximum 5-day</w:t>
       </w:r>
       <w:r>
         <w:t xml:space="preserve"> </w:t>
@@ -2101,7 +2218,7 @@
       <w:r>
         <w:t xml:space="preserve"> </w:t>
       </w:r>
-      <w:hyperlink r:id="rId28">
+      <w:hyperlink r:id="rId23">
         <w:r>
           <w:rPr>
             <w:rStyle w:val="Hyperlink"/>
@@ -2145,7 +2262,7 @@
       <w:r>
         <w:t xml:space="preserve"> </w:t>
       </w:r>
-      <w:hyperlink r:id="rId29">
+      <w:hyperlink r:id="rId25">
         <w:r>
           <w:rPr>
             <w:rStyle w:val="Hyperlink"/>
@@ -2189,7 +2306,7 @@
       <w:r>
         <w:t xml:space="preserve"> </w:t>
       </w:r>
-      <w:hyperlink r:id="rId30">
+      <w:hyperlink r:id="rId24">
         <w:r>
           <w:rPr>
             <w:rStyle w:val="Hyperlink"/>
@@ -2233,7 +2350,7 @@
       <w:r>
         <w:t xml:space="preserve"> </w:t>
       </w:r>
-      <w:hyperlink r:id="rId31">
+      <w:hyperlink r:id="rId26">
         <w:r>
           <w:rPr>
             <w:rStyle w:val="Hyperlink"/>
@@ -2271,7 +2388,7 @@
       <w:r>
         <w:t xml:space="preserve"> </w:t>
       </w:r>
-      <w:hyperlink r:id="rId32">
+      <w:hyperlink r:id="rId31">
         <w:r>
           <w:rPr>
             <w:rStyle w:val="Hyperlink"/>
@@ -2296,7 +2413,7 @@
       <w:r>
         <w:t xml:space="preserve"> </w:t>
       </w:r>
-      <w:hyperlink r:id="rId33">
+      <w:hyperlink r:id="rId20">
         <w:r>
           <w:rPr>
             <w:rStyle w:val="Hyperlink"/>
@@ -3201,7 +3318,8 @@
     <w:name w:val="Hyperlink"/>
     <w:basedOn w:val="BodyTextChar"/>
     <w:rPr>
-      <w:color w:themeColor="accent1" w:val="4F81BD"/>
+      <w:color w:val="1F4E9A"/>
+      <w:u w:val="none"/>
     </w:rPr>
   </w:style>
   <w:style w:styleId="TOCHeading" w:type="paragraph">

</xml_diff>

<commit_message>
Applique le format demandé à la note Niger : Times New Roman 12 pt, interligne 1,5, texte justifié
- PDF compilé avec LuaLaTeX : Times New Roman si disponible, sinon
  Liberation Serif (métriques identiques) ; tableau sécable (xltabular).
- Word : Times New Roman 12 pt, interligne 1,5, justifié ; tableaux,
  légendes et références en interligne simple.

Co-Authored-By: Claude Opus 5.5 <noreply@anthropic.com>
Claude-Session: https://claude.ai/code/session_01KUsbuaysKhPQSJCGSc45ce
</commit_message>
<xml_diff>
--- a/devoir-niger/memo-final/word/Niger_Policy_Memo.docx
+++ b/devoir-niger/memo-final/word/Niger_Policy_Memo.docx
@@ -37,8 +37,8 @@
         <w:tblLayout w:type="fixed"/>
       </w:tblPr>
       <w:tblGrid>
-        <w:gridCol w:w="4876"/>
-        <w:gridCol w:w="4876"/>
+        <w:gridCol w:w="4536"/>
+        <w:gridCol w:w="4536"/>
       </w:tblGrid>
       <w:tr>
         <w:trPr>
@@ -46,12 +46,12 @@
         </w:trPr>
         <w:tc>
           <w:tcPr>
-            <w:tcW w:type="dxa" w:w="4876"/>
+            <w:tcW w:type="dxa" w:w="4535"/>
           </w:tcPr>
           <w:p>
             <w:pPr>
               <w:pStyle w:val="Compact"/>
-              <w:spacing w:after="20" w:before="20"/>
+              <w:spacing w:after="20" w:before="20" w:line="240" w:lineRule="auto"/>
               <w:jc w:val="left"/>
             </w:pPr>
             <w:r>
@@ -59,21 +59,21 @@
                 <w:bCs/>
                 <w:rFonts w:ascii="Times New Roman" w:hAnsi="Times New Roman"/>
                 <w:b/>
-                <w:sz w:val="18"/>
+                <w:sz w:val="20"/>
               </w:rPr>
               <w:t xml:space="preserve">To:</w:t>
             </w:r>
             <w:r>
               <w:rPr>
                 <w:rFonts w:ascii="Times New Roman" w:hAnsi="Times New Roman"/>
-                <w:sz w:val="18"/>
+                <w:sz w:val="20"/>
               </w:rPr>
               <w:t xml:space="preserve"> </w:t>
             </w:r>
             <w:r>
               <w:rPr>
                 <w:rFonts w:ascii="Times New Roman" w:hAnsi="Times New Roman"/>
-                <w:sz w:val="18"/>
+                <w:sz w:val="20"/>
               </w:rPr>
               <w:t xml:space="preserve">Minister of Environment, Head of Niger’s UNFCCC delegation</w:t>
             </w:r>
@@ -81,12 +81,12 @@
         </w:tc>
         <w:tc>
           <w:tcPr>
-            <w:tcW w:type="dxa" w:w="4876"/>
+            <w:tcW w:type="dxa" w:w="4535"/>
           </w:tcPr>
           <w:p>
             <w:pPr>
               <w:pStyle w:val="Compact"/>
-              <w:spacing w:after="20" w:before="20"/>
+              <w:spacing w:after="20" w:before="20" w:line="240" w:lineRule="auto"/>
               <w:jc w:val="left"/>
             </w:pPr>
             <w:r>
@@ -94,21 +94,21 @@
                 <w:bCs/>
                 <w:rFonts w:ascii="Times New Roman" w:hAnsi="Times New Roman"/>
                 <w:b/>
-                <w:sz w:val="18"/>
+                <w:sz w:val="20"/>
               </w:rPr>
               <w:t xml:space="preserve">From:</w:t>
             </w:r>
             <w:r>
               <w:rPr>
                 <w:rFonts w:ascii="Times New Roman" w:hAnsi="Times New Roman"/>
-                <w:sz w:val="18"/>
+                <w:sz w:val="20"/>
               </w:rPr>
               <w:t xml:space="preserve"> </w:t>
             </w:r>
             <w:r>
               <w:rPr>
                 <w:rFonts w:ascii="Times New Roman" w:hAnsi="Times New Roman"/>
-                <w:sz w:val="18"/>
+                <w:sz w:val="20"/>
               </w:rPr>
               <w:t xml:space="preserve">KOUAME Koffi Fidèle, Climate Adviser</w:t>
             </w:r>
@@ -118,12 +118,12 @@
       <w:tr>
         <w:tc>
           <w:tcPr>
-            <w:tcW w:type="dxa" w:w="4876"/>
+            <w:tcW w:type="dxa" w:w="4535"/>
           </w:tcPr>
           <w:p>
             <w:pPr>
               <w:pStyle w:val="Compact"/>
-              <w:spacing w:after="20" w:before="20"/>
+              <w:spacing w:after="20" w:before="20" w:line="240" w:lineRule="auto"/>
               <w:jc w:val="left"/>
             </w:pPr>
             <w:r>
@@ -131,21 +131,21 @@
                 <w:bCs/>
                 <w:rFonts w:ascii="Times New Roman" w:hAnsi="Times New Roman"/>
                 <w:b/>
-                <w:sz w:val="18"/>
+                <w:sz w:val="20"/>
               </w:rPr>
               <w:t xml:space="preserve">Date:</w:t>
             </w:r>
             <w:r>
               <w:rPr>
                 <w:rFonts w:ascii="Times New Roman" w:hAnsi="Times New Roman"/>
-                <w:sz w:val="18"/>
+                <w:sz w:val="20"/>
               </w:rPr>
               <w:t xml:space="preserve"> </w:t>
             </w:r>
             <w:r>
               <w:rPr>
                 <w:rFonts w:ascii="Times New Roman" w:hAnsi="Times New Roman"/>
-                <w:sz w:val="18"/>
+                <w:sz w:val="20"/>
               </w:rPr>
               <w:t xml:space="preserve">14 October 2026</w:t>
             </w:r>
@@ -153,12 +153,12 @@
         </w:tc>
         <w:tc>
           <w:tcPr>
-            <w:tcW w:type="dxa" w:w="4876"/>
+            <w:tcW w:type="dxa" w:w="4535"/>
           </w:tcPr>
           <w:p>
             <w:pPr>
               <w:pStyle w:val="Compact"/>
-              <w:spacing w:after="20" w:before="20"/>
+              <w:spacing w:after="20" w:before="20" w:line="240" w:lineRule="auto"/>
               <w:jc w:val="left"/>
             </w:pPr>
             <w:r>
@@ -166,21 +166,21 @@
                 <w:bCs/>
                 <w:rFonts w:ascii="Times New Roman" w:hAnsi="Times New Roman"/>
                 <w:b/>
-                <w:sz w:val="18"/>
+                <w:sz w:val="20"/>
               </w:rPr>
               <w:t xml:space="preserve">Subject:</w:t>
             </w:r>
             <w:r>
               <w:rPr>
                 <w:rFonts w:ascii="Times New Roman" w:hAnsi="Times New Roman"/>
-                <w:sz w:val="18"/>
+                <w:sz w:val="20"/>
               </w:rPr>
               <w:t xml:space="preserve"> </w:t>
             </w:r>
             <w:r>
               <w:rPr>
                 <w:rFonts w:ascii="Times New Roman" w:hAnsi="Times New Roman"/>
-                <w:sz w:val="18"/>
+                <w:sz w:val="20"/>
               </w:rPr>
               <w:t xml:space="preserve">What Niger stands to lose, and what it gains if warming is limited</w:t>
             </w:r>
@@ -574,11 +574,11 @@
         <w:tblLayout w:type="fixed"/>
       </w:tblPr>
       <w:tblGrid>
-        <w:gridCol w:w="1644"/>
-        <w:gridCol w:w="907"/>
-        <w:gridCol w:w="1304"/>
-        <w:gridCol w:w="1304"/>
-        <w:gridCol w:w="4592"/>
+        <w:gridCol w:w="1360"/>
+        <w:gridCol w:w="793"/>
+        <w:gridCol w:w="1332"/>
+        <w:gridCol w:w="1332"/>
+        <w:gridCol w:w="4252"/>
       </w:tblGrid>
       <w:tr>
         <w:trPr>
@@ -586,7 +586,7 @@
         </w:trPr>
         <w:tc>
           <w:tcPr>
-            <w:tcW w:type="dxa" w:w="1644"/>
+            <w:tcW w:type="dxa" w:w="1361"/>
             <w:tcBorders>
               <w:bottom w:val="single" w:sz="6" w:color="000000"/>
             </w:tcBorders>
@@ -594,7 +594,7 @@
           <w:p>
             <w:pPr>
               <w:pStyle w:val="Compact"/>
-              <w:spacing w:after="20" w:before="20"/>
+              <w:spacing w:after="20" w:before="20" w:line="240" w:lineRule="auto"/>
               <w:jc w:val="left"/>
             </w:pPr>
             <w:r>
@@ -602,7 +602,7 @@
                 <w:bCs/>
                 <w:rFonts w:ascii="Times New Roman" w:hAnsi="Times New Roman"/>
                 <w:b/>
-                <w:sz w:val="18"/>
+                <w:sz w:val="20"/>
               </w:rPr>
               <w:t xml:space="preserve">Impact (CIE indicator)</w:t>
             </w:r>
@@ -610,7 +610,7 @@
         </w:tc>
         <w:tc>
           <w:tcPr>
-            <w:tcW w:type="dxa" w:w="907"/>
+            <w:tcW w:type="dxa" w:w="794"/>
             <w:tcBorders>
               <w:bottom w:val="single" w:sz="6" w:color="000000"/>
             </w:tcBorders>
@@ -618,7 +618,7 @@
           <w:p>
             <w:pPr>
               <w:pStyle w:val="Compact"/>
-              <w:spacing w:after="20" w:before="20"/>
+              <w:spacing w:after="20" w:before="20" w:line="240" w:lineRule="auto"/>
               <w:jc w:val="center"/>
             </w:pPr>
             <w:r>
@@ -626,7 +626,7 @@
                 <w:bCs/>
                 <w:rFonts w:ascii="Times New Roman" w:hAnsi="Times New Roman"/>
                 <w:b/>
-                <w:sz w:val="18"/>
+                <w:sz w:val="20"/>
               </w:rPr>
               <w:t xml:space="preserve">Today (2020)</w:t>
             </w:r>
@@ -634,7 +634,7 @@
         </w:tc>
         <w:tc>
           <w:tcPr>
-            <w:tcW w:type="dxa" w:w="1304"/>
+            <w:tcW w:type="dxa" w:w="1332"/>
             <w:tcBorders>
               <w:bottom w:val="single" w:sz="6" w:color="000000"/>
             </w:tcBorders>
@@ -642,7 +642,7 @@
           <w:p>
             <w:pPr>
               <w:pStyle w:val="Compact"/>
-              <w:spacing w:after="20" w:before="20"/>
+              <w:spacing w:after="20" w:before="20" w:line="240" w:lineRule="auto"/>
               <w:jc w:val="center"/>
             </w:pPr>
             <w:r>
@@ -650,7 +650,7 @@
                 <w:bCs/>
                 <w:rFonts w:ascii="Times New Roman" w:hAnsi="Times New Roman"/>
                 <w:b/>
-                <w:sz w:val="18"/>
+                <w:sz w:val="20"/>
               </w:rPr>
               <w:t xml:space="preserve">Below 2 °C</w:t>
             </w:r>
@@ -658,7 +658,7 @@
         </w:tc>
         <w:tc>
           <w:tcPr>
-            <w:tcW w:type="dxa" w:w="1304"/>
+            <w:tcW w:type="dxa" w:w="1332"/>
             <w:tcBorders>
               <w:bottom w:val="single" w:sz="6" w:color="000000"/>
             </w:tcBorders>
@@ -666,7 +666,7 @@
           <w:p>
             <w:pPr>
               <w:pStyle w:val="Compact"/>
-              <w:spacing w:after="20" w:before="20"/>
+              <w:spacing w:after="20" w:before="20" w:line="240" w:lineRule="auto"/>
               <w:jc w:val="center"/>
             </w:pPr>
             <w:r>
@@ -674,7 +674,7 @@
                 <w:bCs/>
                 <w:rFonts w:ascii="Times New Roman" w:hAnsi="Times New Roman"/>
                 <w:b/>
-                <w:sz w:val="18"/>
+                <w:sz w:val="20"/>
               </w:rPr>
               <w:t xml:space="preserve">Current policies</w:t>
             </w:r>
@@ -682,7 +682,7 @@
         </w:tc>
         <w:tc>
           <w:tcPr>
-            <w:tcW w:type="dxa" w:w="4592"/>
+            <w:tcW w:type="dxa" w:w="4252"/>
             <w:tcBorders>
               <w:bottom w:val="single" w:sz="6" w:color="000000"/>
             </w:tcBorders>
@@ -690,7 +690,7 @@
           <w:p>
             <w:pPr>
               <w:pStyle w:val="Compact"/>
-              <w:spacing w:after="20" w:before="20"/>
+              <w:spacing w:after="20" w:before="20" w:line="240" w:lineRule="auto"/>
               <w:jc w:val="left"/>
             </w:pPr>
             <w:r>
@@ -698,7 +698,7 @@
                 <w:bCs/>
                 <w:rFonts w:ascii="Times New Roman" w:hAnsi="Times New Roman"/>
                 <w:b/>
-                <w:sz w:val="18"/>
+                <w:sz w:val="20"/>
               </w:rPr>
               <w:t xml:space="preserve">Why it matters for Niger</w:t>
             </w:r>
@@ -708,12 +708,12 @@
       <w:tr>
         <w:tc>
           <w:tcPr>
-            <w:tcW w:type="dxa" w:w="1644"/>
+            <w:tcW w:type="dxa" w:w="1361"/>
           </w:tcPr>
           <w:p>
             <w:pPr>
               <w:pStyle w:val="Compact"/>
-              <w:spacing w:after="20" w:before="20"/>
+              <w:spacing w:after="20" w:before="20" w:line="240" w:lineRule="auto"/>
               <w:jc w:val="left"/>
             </w:pPr>
             <w:r>
@@ -721,14 +721,14 @@
                 <w:bCs/>
                 <w:rFonts w:ascii="Times New Roman" w:hAnsi="Times New Roman"/>
                 <w:b/>
-                <w:sz w:val="18"/>
+                <w:sz w:val="20"/>
               </w:rPr>
               <w:t xml:space="preserve">1. Dangerous heat</w:t>
             </w:r>
             <w:r>
               <w:rPr>
                 <w:rFonts w:ascii="Times New Roman" w:hAnsi="Times New Roman"/>
-                <w:sz w:val="18"/>
+                <w:sz w:val="20"/>
               </w:rPr>
               <w:br/>
             </w:r>
@@ -737,7 +737,7 @@
                 <w:iCs/>
                 <w:rFonts w:ascii="Times New Roman" w:hAnsi="Times New Roman"/>
                 <w:i/>
-                <w:sz w:val="18"/>
+                <w:sz w:val="20"/>
               </w:rPr>
               <w:t xml:space="preserve">Days per year with a heat index above 40 °C</w:t>
             </w:r>
@@ -745,12 +745,12 @@
         </w:tc>
         <w:tc>
           <w:tcPr>
-            <w:tcW w:type="dxa" w:w="907"/>
+            <w:tcW w:type="dxa" w:w="794"/>
           </w:tcPr>
           <w:p>
             <w:pPr>
               <w:pStyle w:val="Compact"/>
-              <w:spacing w:after="20" w:before="20"/>
+              <w:spacing w:after="20" w:before="20" w:line="240" w:lineRule="auto"/>
               <w:jc w:val="center"/>
             </w:pPr>
             <w:r>
@@ -758,21 +758,21 @@
                 <w:bCs/>
                 <w:rFonts w:ascii="Times New Roman" w:hAnsi="Times New Roman"/>
                 <w:b/>
-                <w:sz w:val="18"/>
+                <w:sz w:val="20"/>
               </w:rPr>
               <w:t xml:space="preserve">31 days</w:t>
             </w:r>
             <w:r>
               <w:rPr>
                 <w:rFonts w:ascii="Times New Roman" w:hAnsi="Times New Roman"/>
-                <w:sz w:val="18"/>
+                <w:sz w:val="20"/>
               </w:rPr>
               <w:br/>
             </w:r>
             <w:r>
               <w:rPr>
                 <w:rFonts w:ascii="Times New Roman" w:hAnsi="Times New Roman"/>
-                <w:sz w:val="18"/>
+                <w:sz w:val="20"/>
               </w:rPr>
               <w:t xml:space="preserve">[25–38]</w:t>
             </w:r>
@@ -780,25 +780,25 @@
         </w:tc>
         <w:tc>
           <w:tcPr>
-            <w:tcW w:type="dxa" w:w="1304"/>
+            <w:tcW w:type="dxa" w:w="1332"/>
           </w:tcPr>
           <w:p>
             <w:pPr>
               <w:pStyle w:val="Compact"/>
-              <w:spacing w:after="20" w:before="20"/>
+              <w:spacing w:after="20" w:before="20" w:line="240" w:lineRule="auto"/>
               <w:jc w:val="center"/>
             </w:pPr>
             <w:r>
               <w:rPr>
                 <w:rFonts w:ascii="Times New Roman" w:hAnsi="Times New Roman"/>
-                <w:sz w:val="18"/>
+                <w:sz w:val="20"/>
               </w:rPr>
               <w:t xml:space="preserve">2050:</w:t>
             </w:r>
             <w:r>
               <w:rPr>
                 <w:rFonts w:ascii="Times New Roman" w:hAnsi="Times New Roman"/>
-                <w:sz w:val="18"/>
+                <w:sz w:val="20"/>
               </w:rPr>
               <w:t xml:space="preserve"> </w:t>
             </w:r>
@@ -807,42 +807,42 @@
                 <w:bCs/>
                 <w:rFonts w:ascii="Times New Roman" w:hAnsi="Times New Roman"/>
                 <w:b/>
-                <w:sz w:val="18"/>
+                <w:sz w:val="20"/>
               </w:rPr>
               <w:t xml:space="preserve">45</w:t>
             </w:r>
             <w:r>
               <w:rPr>
                 <w:rFonts w:ascii="Times New Roman" w:hAnsi="Times New Roman"/>
-                <w:sz w:val="18"/>
+                <w:sz w:val="20"/>
               </w:rPr>
               <w:br/>
             </w:r>
             <w:r>
               <w:rPr>
                 <w:rFonts w:ascii="Times New Roman" w:hAnsi="Times New Roman"/>
-                <w:sz w:val="18"/>
+                <w:sz w:val="20"/>
               </w:rPr>
               <w:t xml:space="preserve">[33–69]</w:t>
             </w:r>
             <w:r>
               <w:rPr>
                 <w:rFonts w:ascii="Times New Roman" w:hAnsi="Times New Roman"/>
-                <w:sz w:val="18"/>
+                <w:sz w:val="20"/>
               </w:rPr>
               <w:br/>
             </w:r>
             <w:r>
               <w:rPr>
                 <w:rFonts w:ascii="Times New Roman" w:hAnsi="Times New Roman"/>
-                <w:sz w:val="18"/>
+                <w:sz w:val="20"/>
               </w:rPr>
               <w:t xml:space="preserve">2100:</w:t>
             </w:r>
             <w:r>
               <w:rPr>
                 <w:rFonts w:ascii="Times New Roman" w:hAnsi="Times New Roman"/>
-                <w:sz w:val="18"/>
+                <w:sz w:val="20"/>
               </w:rPr>
               <w:t xml:space="preserve"> </w:t>
             </w:r>
@@ -851,21 +851,21 @@
                 <w:bCs/>
                 <w:rFonts w:ascii="Times New Roman" w:hAnsi="Times New Roman"/>
                 <w:b/>
-                <w:sz w:val="18"/>
+                <w:sz w:val="20"/>
               </w:rPr>
               <w:t xml:space="preserve">42</w:t>
             </w:r>
             <w:r>
               <w:rPr>
                 <w:rFonts w:ascii="Times New Roman" w:hAnsi="Times New Roman"/>
-                <w:sz w:val="18"/>
+                <w:sz w:val="20"/>
               </w:rPr>
               <w:br/>
             </w:r>
             <w:r>
               <w:rPr>
                 <w:rFonts w:ascii="Times New Roman" w:hAnsi="Times New Roman"/>
-                <w:sz w:val="18"/>
+                <w:sz w:val="20"/>
               </w:rPr>
               <w:t xml:space="preserve">[29–72]</w:t>
             </w:r>
@@ -873,25 +873,25 @@
         </w:tc>
         <w:tc>
           <w:tcPr>
-            <w:tcW w:type="dxa" w:w="1304"/>
+            <w:tcW w:type="dxa" w:w="1332"/>
           </w:tcPr>
           <w:p>
             <w:pPr>
               <w:pStyle w:val="Compact"/>
-              <w:spacing w:after="20" w:before="20"/>
+              <w:spacing w:after="20" w:before="20" w:line="240" w:lineRule="auto"/>
               <w:jc w:val="center"/>
             </w:pPr>
             <w:r>
               <w:rPr>
                 <w:rFonts w:ascii="Times New Roman" w:hAnsi="Times New Roman"/>
-                <w:sz w:val="18"/>
+                <w:sz w:val="20"/>
               </w:rPr>
               <w:t xml:space="preserve">2050:</w:t>
             </w:r>
             <w:r>
               <w:rPr>
                 <w:rFonts w:ascii="Times New Roman" w:hAnsi="Times New Roman"/>
-                <w:sz w:val="18"/>
+                <w:sz w:val="20"/>
               </w:rPr>
               <w:t xml:space="preserve"> </w:t>
             </w:r>
@@ -900,42 +900,42 @@
                 <w:bCs/>
                 <w:rFonts w:ascii="Times New Roman" w:hAnsi="Times New Roman"/>
                 <w:b/>
-                <w:sz w:val="18"/>
+                <w:sz w:val="20"/>
               </w:rPr>
               <w:t xml:space="preserve">54</w:t>
             </w:r>
             <w:r>
               <w:rPr>
                 <w:rFonts w:ascii="Times New Roman" w:hAnsi="Times New Roman"/>
-                <w:sz w:val="18"/>
+                <w:sz w:val="20"/>
               </w:rPr>
               <w:br/>
             </w:r>
             <w:r>
               <w:rPr>
                 <w:rFonts w:ascii="Times New Roman" w:hAnsi="Times New Roman"/>
-                <w:sz w:val="18"/>
+                <w:sz w:val="20"/>
               </w:rPr>
               <w:t xml:space="preserve">[41–84]</w:t>
             </w:r>
             <w:r>
               <w:rPr>
                 <w:rFonts w:ascii="Times New Roman" w:hAnsi="Times New Roman"/>
-                <w:sz w:val="18"/>
+                <w:sz w:val="20"/>
               </w:rPr>
               <w:br/>
             </w:r>
             <w:r>
               <w:rPr>
                 <w:rFonts w:ascii="Times New Roman" w:hAnsi="Times New Roman"/>
-                <w:sz w:val="18"/>
+                <w:sz w:val="20"/>
               </w:rPr>
               <w:t xml:space="preserve">2100:</w:t>
             </w:r>
             <w:r>
               <w:rPr>
                 <w:rFonts w:ascii="Times New Roman" w:hAnsi="Times New Roman"/>
-                <w:sz w:val="18"/>
+                <w:sz w:val="20"/>
               </w:rPr>
               <w:t xml:space="preserve"> </w:t>
             </w:r>
@@ -944,21 +944,21 @@
                 <w:bCs/>
                 <w:rFonts w:ascii="Times New Roman" w:hAnsi="Times New Roman"/>
                 <w:b/>
-                <w:sz w:val="18"/>
+                <w:sz w:val="20"/>
               </w:rPr>
               <w:t xml:space="preserve">91</w:t>
             </w:r>
             <w:r>
               <w:rPr>
                 <w:rFonts w:ascii="Times New Roman" w:hAnsi="Times New Roman"/>
-                <w:sz w:val="18"/>
+                <w:sz w:val="20"/>
               </w:rPr>
               <w:br/>
             </w:r>
             <w:r>
               <w:rPr>
                 <w:rFonts w:ascii="Times New Roman" w:hAnsi="Times New Roman"/>
-                <w:sz w:val="18"/>
+                <w:sz w:val="20"/>
               </w:rPr>
               <w:t xml:space="preserve">[59–134]</w:t>
             </w:r>
@@ -966,74 +966,74 @@
         </w:tc>
         <w:tc>
           <w:tcPr>
-            <w:tcW w:type="dxa" w:w="4592"/>
+            <w:tcW w:type="dxa" w:w="4252"/>
           </w:tcPr>
           <w:p>
             <w:pPr>
               <w:pStyle w:val="Compact"/>
-              <w:spacing w:after="20" w:before="20"/>
+              <w:spacing w:after="20" w:before="20" w:line="240" w:lineRule="auto"/>
               <w:jc w:val="left"/>
             </w:pPr>
             <w:r>
               <w:rPr>
                 <w:rFonts w:ascii="Times New Roman" w:hAnsi="Times New Roman"/>
-                <w:sz w:val="18"/>
+                <w:sz w:val="20"/>
               </w:rPr>
               <w:t xml:space="preserve">Beyond this threshold, sustained physical work exposes people to heat exhaustion and heat stroke, yet most</w:t>
             </w:r>
             <w:r>
               <w:rPr>
                 <w:rFonts w:ascii="Times New Roman" w:hAnsi="Times New Roman"/>
-                <w:sz w:val="18"/>
+                <w:sz w:val="20"/>
               </w:rPr>
               <w:t xml:space="preserve"> </w:t>
             </w:r>
             <w:r>
               <w:rPr>
                 <w:rFonts w:ascii="Times New Roman" w:hAnsi="Times New Roman"/>
-                <w:sz w:val="18"/>
+                <w:sz w:val="20"/>
               </w:rPr>
               <w:t xml:space="preserve">Nigeriens farm, herd or build outdoors with little access to cooling. The tool’s maps show the increase is about</w:t>
             </w:r>
             <w:r>
               <w:rPr>
                 <w:rFonts w:ascii="Times New Roman" w:hAnsi="Times New Roman"/>
-                <w:sz w:val="18"/>
+                <w:sz w:val="20"/>
               </w:rPr>
               <w:t xml:space="preserve"> </w:t>
             </w:r>
             <w:r>
               <w:rPr>
                 <w:rFonts w:ascii="Times New Roman" w:hAnsi="Times New Roman"/>
-                <w:sz w:val="18"/>
+                <w:sz w:val="20"/>
               </w:rPr>
               <w:t xml:space="preserve">twice as large in the densely populated south as in the north (+44 versus +21 days at 2 °C compared with</w:t>
             </w:r>
             <w:r>
               <w:rPr>
                 <w:rFonts w:ascii="Times New Roman" w:hAnsi="Times New Roman"/>
-                <w:sz w:val="18"/>
+                <w:sz w:val="20"/>
               </w:rPr>
               <w:t xml:space="preserve"> </w:t>
             </w:r>
             <w:r>
               <w:rPr>
                 <w:rFonts w:ascii="Times New Roman" w:hAnsi="Times New Roman"/>
-                <w:sz w:val="18"/>
+                <w:sz w:val="20"/>
               </w:rPr>
               <w:t xml:space="preserve">1 °C of global warming). WASCAL researchers already project heat discomfort for more than half of West</w:t>
             </w:r>
             <w:r>
               <w:rPr>
                 <w:rFonts w:ascii="Times New Roman" w:hAnsi="Times New Roman"/>
-                <w:sz w:val="18"/>
+                <w:sz w:val="20"/>
               </w:rPr>
               <w:t xml:space="preserve"> </w:t>
             </w:r>
             <w:r>
               <w:rPr>
                 <w:rFonts w:ascii="Times New Roman" w:hAnsi="Times New Roman"/>
-                <w:sz w:val="18"/>
+                <w:sz w:val="20"/>
               </w:rPr>
               <w:t xml:space="preserve">Africa’s population at 1.5–2 °C (</w:t>
             </w:r>
@@ -1048,7 +1048,7 @@
             <w:r>
               <w:rPr>
                 <w:rFonts w:ascii="Times New Roman" w:hAnsi="Times New Roman"/>
-                <w:sz w:val="18"/>
+                <w:sz w:val="20"/>
               </w:rPr>
               <w:t xml:space="preserve">).</w:t>
             </w:r>
@@ -1058,12 +1058,12 @@
       <w:tr>
         <w:tc>
           <w:tcPr>
-            <w:tcW w:type="dxa" w:w="1644"/>
+            <w:tcW w:type="dxa" w:w="1361"/>
           </w:tcPr>
           <w:p>
             <w:pPr>
               <w:pStyle w:val="Compact"/>
-              <w:spacing w:after="20" w:before="20"/>
+              <w:spacing w:after="20" w:before="20" w:line="240" w:lineRule="auto"/>
               <w:jc w:val="left"/>
             </w:pPr>
             <w:r>
@@ -1071,14 +1071,14 @@
                 <w:bCs/>
                 <w:rFonts w:ascii="Times New Roman" w:hAnsi="Times New Roman"/>
                 <w:b/>
-                <w:sz w:val="18"/>
+                <w:sz w:val="20"/>
               </w:rPr>
               <w:t xml:space="preserve">2. Severe drought</w:t>
             </w:r>
             <w:r>
               <w:rPr>
                 <w:rFonts w:ascii="Times New Roman" w:hAnsi="Times New Roman"/>
-                <w:sz w:val="18"/>
+                <w:sz w:val="20"/>
               </w:rPr>
               <w:br/>
             </w:r>
@@ -1087,7 +1087,7 @@
                 <w:iCs/>
                 <w:rFonts w:ascii="Times New Roman" w:hAnsi="Times New Roman"/>
                 <w:i/>
-                <w:sz w:val="18"/>
+                <w:sz w:val="20"/>
               </w:rPr>
               <w:t xml:space="preserve">Share of land with at least one month of SPEI</w:t>
             </w:r>
@@ -1096,7 +1096,7 @@
                 <w:iCs/>
                 <w:rFonts w:ascii="Times New Roman" w:hAnsi="Times New Roman"/>
                 <w:i/>
-                <w:sz w:val="18"/>
+                <w:sz w:val="20"/>
               </w:rPr>
               <w:t xml:space="preserve"> </w:t>
             </w:r>
@@ -1105,7 +1105,7 @@
                 <w:iCs/>
                 <w:rFonts w:ascii="Times New Roman" w:hAnsi="Times New Roman"/>
                 <w:i/>
-                <w:sz w:val="18"/>
+                <w:sz w:val="20"/>
               </w:rPr>
               <w:t xml:space="preserve">below −1.5 (%)</w:t>
             </w:r>
@@ -1113,12 +1113,12 @@
         </w:tc>
         <w:tc>
           <w:tcPr>
-            <w:tcW w:type="dxa" w:w="907"/>
+            <w:tcW w:type="dxa" w:w="794"/>
           </w:tcPr>
           <w:p>
             <w:pPr>
               <w:pStyle w:val="Compact"/>
-              <w:spacing w:after="20" w:before="20"/>
+              <w:spacing w:after="20" w:before="20" w:line="240" w:lineRule="auto"/>
               <w:jc w:val="center"/>
             </w:pPr>
             <w:r>
@@ -1126,21 +1126,21 @@
                 <w:bCs/>
                 <w:rFonts w:ascii="Times New Roman" w:hAnsi="Times New Roman"/>
                 <w:b/>
-                <w:sz w:val="18"/>
+                <w:sz w:val="20"/>
               </w:rPr>
               <w:t xml:space="preserve">84 %</w:t>
             </w:r>
             <w:r>
               <w:rPr>
                 <w:rFonts w:ascii="Times New Roman" w:hAnsi="Times New Roman"/>
-                <w:sz w:val="18"/>
+                <w:sz w:val="20"/>
               </w:rPr>
               <w:br/>
             </w:r>
             <w:r>
               <w:rPr>
                 <w:rFonts w:ascii="Times New Roman" w:hAnsi="Times New Roman"/>
-                <w:sz w:val="18"/>
+                <w:sz w:val="20"/>
               </w:rPr>
               <w:t xml:space="preserve">[72–97]</w:t>
             </w:r>
@@ -1148,25 +1148,25 @@
         </w:tc>
         <w:tc>
           <w:tcPr>
-            <w:tcW w:type="dxa" w:w="1304"/>
+            <w:tcW w:type="dxa" w:w="1332"/>
           </w:tcPr>
           <w:p>
             <w:pPr>
               <w:pStyle w:val="Compact"/>
-              <w:spacing w:after="20" w:before="20"/>
+              <w:spacing w:after="20" w:before="20" w:line="240" w:lineRule="auto"/>
               <w:jc w:val="center"/>
             </w:pPr>
             <w:r>
               <w:rPr>
                 <w:rFonts w:ascii="Times New Roman" w:hAnsi="Times New Roman"/>
-                <w:sz w:val="18"/>
+                <w:sz w:val="20"/>
               </w:rPr>
               <w:t xml:space="preserve">2050:</w:t>
             </w:r>
             <w:r>
               <w:rPr>
                 <w:rFonts w:ascii="Times New Roman" w:hAnsi="Times New Roman"/>
-                <w:sz w:val="18"/>
+                <w:sz w:val="20"/>
               </w:rPr>
               <w:t xml:space="preserve"> </w:t>
             </w:r>
@@ -1175,42 +1175,42 @@
                 <w:bCs/>
                 <w:rFonts w:ascii="Times New Roman" w:hAnsi="Times New Roman"/>
                 <w:b/>
-                <w:sz w:val="18"/>
+                <w:sz w:val="20"/>
               </w:rPr>
               <w:t xml:space="preserve">98 %</w:t>
             </w:r>
             <w:r>
               <w:rPr>
                 <w:rFonts w:ascii="Times New Roman" w:hAnsi="Times New Roman"/>
-                <w:sz w:val="18"/>
+                <w:sz w:val="20"/>
               </w:rPr>
               <w:br/>
             </w:r>
             <w:r>
               <w:rPr>
                 <w:rFonts w:ascii="Times New Roman" w:hAnsi="Times New Roman"/>
-                <w:sz w:val="18"/>
+                <w:sz w:val="20"/>
               </w:rPr>
               <w:t xml:space="preserve">[85–100]</w:t>
             </w:r>
             <w:r>
               <w:rPr>
                 <w:rFonts w:ascii="Times New Roman" w:hAnsi="Times New Roman"/>
-                <w:sz w:val="18"/>
+                <w:sz w:val="20"/>
               </w:rPr>
               <w:br/>
             </w:r>
             <w:r>
               <w:rPr>
                 <w:rFonts w:ascii="Times New Roman" w:hAnsi="Times New Roman"/>
-                <w:sz w:val="18"/>
+                <w:sz w:val="20"/>
               </w:rPr>
               <w:t xml:space="preserve">2100:</w:t>
             </w:r>
             <w:r>
               <w:rPr>
                 <w:rFonts w:ascii="Times New Roman" w:hAnsi="Times New Roman"/>
-                <w:sz w:val="18"/>
+                <w:sz w:val="20"/>
               </w:rPr>
               <w:t xml:space="preserve"> </w:t>
             </w:r>
@@ -1219,21 +1219,21 @@
                 <w:bCs/>
                 <w:rFonts w:ascii="Times New Roman" w:hAnsi="Times New Roman"/>
                 <w:b/>
-                <w:sz w:val="18"/>
+                <w:sz w:val="20"/>
               </w:rPr>
               <w:t xml:space="preserve">98 %</w:t>
             </w:r>
             <w:r>
               <w:rPr>
                 <w:rFonts w:ascii="Times New Roman" w:hAnsi="Times New Roman"/>
-                <w:sz w:val="18"/>
+                <w:sz w:val="20"/>
               </w:rPr>
               <w:br/>
             </w:r>
             <w:r>
               <w:rPr>
                 <w:rFonts w:ascii="Times New Roman" w:hAnsi="Times New Roman"/>
-                <w:sz w:val="18"/>
+                <w:sz w:val="20"/>
               </w:rPr>
               <w:t xml:space="preserve">[81–100]</w:t>
             </w:r>
@@ -1241,25 +1241,25 @@
         </w:tc>
         <w:tc>
           <w:tcPr>
-            <w:tcW w:type="dxa" w:w="1304"/>
+            <w:tcW w:type="dxa" w:w="1332"/>
           </w:tcPr>
           <w:p>
             <w:pPr>
               <w:pStyle w:val="Compact"/>
-              <w:spacing w:after="20" w:before="20"/>
+              <w:spacing w:after="20" w:before="20" w:line="240" w:lineRule="auto"/>
               <w:jc w:val="center"/>
             </w:pPr>
             <w:r>
               <w:rPr>
                 <w:rFonts w:ascii="Times New Roman" w:hAnsi="Times New Roman"/>
-                <w:sz w:val="18"/>
+                <w:sz w:val="20"/>
               </w:rPr>
               <w:t xml:space="preserve">2050:</w:t>
             </w:r>
             <w:r>
               <w:rPr>
                 <w:rFonts w:ascii="Times New Roman" w:hAnsi="Times New Roman"/>
-                <w:sz w:val="18"/>
+                <w:sz w:val="20"/>
               </w:rPr>
               <w:t xml:space="preserve"> </w:t>
             </w:r>
@@ -1268,42 +1268,42 @@
                 <w:bCs/>
                 <w:rFonts w:ascii="Times New Roman" w:hAnsi="Times New Roman"/>
                 <w:b/>
-                <w:sz w:val="18"/>
+                <w:sz w:val="20"/>
               </w:rPr>
               <w:t xml:space="preserve">≈100 %</w:t>
             </w:r>
             <w:r>
               <w:rPr>
                 <w:rFonts w:ascii="Times New Roman" w:hAnsi="Times New Roman"/>
-                <w:sz w:val="18"/>
+                <w:sz w:val="20"/>
               </w:rPr>
               <w:br/>
             </w:r>
             <w:r>
               <w:rPr>
                 <w:rFonts w:ascii="Times New Roman" w:hAnsi="Times New Roman"/>
-                <w:sz w:val="18"/>
+                <w:sz w:val="20"/>
               </w:rPr>
               <w:t xml:space="preserve">[96–100]</w:t>
             </w:r>
             <w:r>
               <w:rPr>
                 <w:rFonts w:ascii="Times New Roman" w:hAnsi="Times New Roman"/>
-                <w:sz w:val="18"/>
+                <w:sz w:val="20"/>
               </w:rPr>
               <w:br/>
             </w:r>
             <w:r>
               <w:rPr>
                 <w:rFonts w:ascii="Times New Roman" w:hAnsi="Times New Roman"/>
-                <w:sz w:val="18"/>
+                <w:sz w:val="20"/>
               </w:rPr>
               <w:t xml:space="preserve">2100:</w:t>
             </w:r>
             <w:r>
               <w:rPr>
                 <w:rFonts w:ascii="Times New Roman" w:hAnsi="Times New Roman"/>
-                <w:sz w:val="18"/>
+                <w:sz w:val="20"/>
               </w:rPr>
               <w:t xml:space="preserve"> </w:t>
             </w:r>
@@ -1312,21 +1312,21 @@
                 <w:bCs/>
                 <w:rFonts w:ascii="Times New Roman" w:hAnsi="Times New Roman"/>
                 <w:b/>
-                <w:sz w:val="18"/>
+                <w:sz w:val="20"/>
               </w:rPr>
               <w:t xml:space="preserve">100 %</w:t>
             </w:r>
             <w:r>
               <w:rPr>
                 <w:rFonts w:ascii="Times New Roman" w:hAnsi="Times New Roman"/>
-                <w:sz w:val="18"/>
+                <w:sz w:val="20"/>
               </w:rPr>
               <w:br/>
             </w:r>
             <w:r>
               <w:rPr>
                 <w:rFonts w:ascii="Times New Roman" w:hAnsi="Times New Roman"/>
-                <w:sz w:val="18"/>
+                <w:sz w:val="20"/>
               </w:rPr>
               <w:t xml:space="preserve">[98–100]</w:t>
             </w:r>
@@ -1334,60 +1334,60 @@
         </w:tc>
         <w:tc>
           <w:tcPr>
-            <w:tcW w:type="dxa" w:w="4592"/>
+            <w:tcW w:type="dxa" w:w="4252"/>
           </w:tcPr>
           <w:p>
             <w:pPr>
               <w:pStyle w:val="Compact"/>
-              <w:spacing w:after="20" w:before="20"/>
+              <w:spacing w:after="20" w:before="20" w:line="240" w:lineRule="auto"/>
               <w:jc w:val="left"/>
             </w:pPr>
             <w:r>
               <w:rPr>
                 <w:rFonts w:ascii="Times New Roman" w:hAnsi="Times New Roman"/>
-                <w:sz w:val="18"/>
+                <w:sz w:val="20"/>
               </w:rPr>
               <w:t xml:space="preserve">Because SPEI accounts for evaporation as well as rainfall, it captures how heat dries out soils, crops and</w:t>
             </w:r>
             <w:r>
               <w:rPr>
                 <w:rFonts w:ascii="Times New Roman" w:hAnsi="Times New Roman"/>
-                <w:sz w:val="18"/>
+                <w:sz w:val="20"/>
               </w:rPr>
               <w:t xml:space="preserve"> </w:t>
             </w:r>
             <w:r>
               <w:rPr>
                 <w:rFonts w:ascii="Times New Roman" w:hAnsi="Times New Roman"/>
-                <w:sz w:val="18"/>
+                <w:sz w:val="20"/>
               </w:rPr>
               <w:t xml:space="preserve">pastures. Around 96 % of the country is affected by 2030 in every scenario, so severe drought months become</w:t>
             </w:r>
             <w:r>
               <w:rPr>
                 <w:rFonts w:ascii="Times New Roman" w:hAnsi="Times New Roman"/>
-                <w:sz w:val="18"/>
+                <w:sz w:val="20"/>
               </w:rPr>
               <w:t xml:space="preserve"> </w:t>
             </w:r>
             <w:r>
               <w:rPr>
                 <w:rFonts w:ascii="Times New Roman" w:hAnsi="Times New Roman"/>
-                <w:sz w:val="18"/>
+                <w:sz w:val="20"/>
               </w:rPr>
               <w:t xml:space="preserve">the norm whatever the world does; only a 1.5 °C pathway brings the share back down (87 % by 2100). WASCAL</w:t>
             </w:r>
             <w:r>
               <w:rPr>
                 <w:rFonts w:ascii="Times New Roman" w:hAnsi="Times New Roman"/>
-                <w:sz w:val="18"/>
+                <w:sz w:val="20"/>
               </w:rPr>
               <w:t xml:space="preserve"> </w:t>
             </w:r>
             <w:r>
               <w:rPr>
                 <w:rFonts w:ascii="Times New Roman" w:hAnsi="Times New Roman"/>
-                <w:sz w:val="18"/>
+                <w:sz w:val="20"/>
               </w:rPr>
               <w:t xml:space="preserve">crop modelling projects declining millet yields in most scenarios (</w:t>
             </w:r>
@@ -1402,7 +1402,7 @@
             <w:r>
               <w:rPr>
                 <w:rFonts w:ascii="Times New Roman" w:hAnsi="Times New Roman"/>
-                <w:sz w:val="18"/>
+                <w:sz w:val="20"/>
               </w:rPr>
               <w:t xml:space="preserve">).</w:t>
             </w:r>
@@ -1412,12 +1412,12 @@
       <w:tr>
         <w:tc>
           <w:tcPr>
-            <w:tcW w:type="dxa" w:w="1644"/>
+            <w:tcW w:type="dxa" w:w="1361"/>
           </w:tcPr>
           <w:p>
             <w:pPr>
               <w:pStyle w:val="Compact"/>
-              <w:spacing w:after="20" w:before="20"/>
+              <w:spacing w:after="20" w:before="20" w:line="240" w:lineRule="auto"/>
               <w:jc w:val="left"/>
             </w:pPr>
             <w:r>
@@ -1425,14 +1425,14 @@
                 <w:bCs/>
                 <w:rFonts w:ascii="Times New Roman" w:hAnsi="Times New Roman"/>
                 <w:b/>
-                <w:sz w:val="18"/>
+                <w:sz w:val="20"/>
               </w:rPr>
               <w:t xml:space="preserve">3. Extreme rainfall</w:t>
             </w:r>
             <w:r>
               <w:rPr>
                 <w:rFonts w:ascii="Times New Roman" w:hAnsi="Times New Roman"/>
-                <w:sz w:val="18"/>
+                <w:sz w:val="20"/>
               </w:rPr>
               <w:br/>
             </w:r>
@@ -1441,7 +1441,7 @@
                 <w:iCs/>
                 <w:rFonts w:ascii="Times New Roman" w:hAnsi="Times New Roman"/>
                 <w:i/>
-                <w:sz w:val="18"/>
+                <w:sz w:val="20"/>
               </w:rPr>
               <w:t xml:space="preserve">Annual maximum 5-day precipitation, change from</w:t>
             </w:r>
@@ -1450,7 +1450,7 @@
                 <w:iCs/>
                 <w:rFonts w:ascii="Times New Roman" w:hAnsi="Times New Roman"/>
                 <w:i/>
-                <w:sz w:val="18"/>
+                <w:sz w:val="20"/>
               </w:rPr>
               <w:t xml:space="preserve"> </w:t>
             </w:r>
@@ -1459,7 +1459,7 @@
                 <w:iCs/>
                 <w:rFonts w:ascii="Times New Roman" w:hAnsi="Times New Roman"/>
                 <w:i/>
-                <w:sz w:val="18"/>
+                <w:sz w:val="20"/>
               </w:rPr>
               <w:t xml:space="preserve">1995–2014 (%)</w:t>
             </w:r>
@@ -1467,12 +1467,12 @@
         </w:tc>
         <w:tc>
           <w:tcPr>
-            <w:tcW w:type="dxa" w:w="907"/>
+            <w:tcW w:type="dxa" w:w="794"/>
           </w:tcPr>
           <w:p>
             <w:pPr>
               <w:pStyle w:val="Compact"/>
-              <w:spacing w:after="20" w:before="20"/>
+              <w:spacing w:after="20" w:before="20" w:line="240" w:lineRule="auto"/>
               <w:jc w:val="center"/>
             </w:pPr>
             <w:r>
@@ -1480,21 +1480,21 @@
                 <w:bCs/>
                 <w:rFonts w:ascii="Times New Roman" w:hAnsi="Times New Roman"/>
                 <w:b/>
-                <w:sz w:val="18"/>
+                <w:sz w:val="20"/>
               </w:rPr>
               <w:t xml:space="preserve">+8 %</w:t>
             </w:r>
             <w:r>
               <w:rPr>
                 <w:rFonts w:ascii="Times New Roman" w:hAnsi="Times New Roman"/>
-                <w:sz w:val="18"/>
+                <w:sz w:val="20"/>
               </w:rPr>
               <w:br/>
             </w:r>
             <w:r>
               <w:rPr>
                 <w:rFonts w:ascii="Times New Roman" w:hAnsi="Times New Roman"/>
-                <w:sz w:val="18"/>
+                <w:sz w:val="20"/>
               </w:rPr>
               <w:t xml:space="preserve">[−7 to +29]</w:t>
             </w:r>
@@ -1502,25 +1502,25 @@
         </w:tc>
         <w:tc>
           <w:tcPr>
-            <w:tcW w:type="dxa" w:w="1304"/>
+            <w:tcW w:type="dxa" w:w="1332"/>
           </w:tcPr>
           <w:p>
             <w:pPr>
               <w:pStyle w:val="Compact"/>
-              <w:spacing w:after="20" w:before="20"/>
+              <w:spacing w:after="20" w:before="20" w:line="240" w:lineRule="auto"/>
               <w:jc w:val="center"/>
             </w:pPr>
             <w:r>
               <w:rPr>
                 <w:rFonts w:ascii="Times New Roman" w:hAnsi="Times New Roman"/>
-                <w:sz w:val="18"/>
+                <w:sz w:val="20"/>
               </w:rPr>
               <w:t xml:space="preserve">2050:</w:t>
             </w:r>
             <w:r>
               <w:rPr>
                 <w:rFonts w:ascii="Times New Roman" w:hAnsi="Times New Roman"/>
-                <w:sz w:val="18"/>
+                <w:sz w:val="20"/>
               </w:rPr>
               <w:t xml:space="preserve"> </w:t>
             </w:r>
@@ -1529,42 +1529,42 @@
                 <w:bCs/>
                 <w:rFonts w:ascii="Times New Roman" w:hAnsi="Times New Roman"/>
                 <w:b/>
-                <w:sz w:val="18"/>
+                <w:sz w:val="20"/>
               </w:rPr>
               <w:t xml:space="preserve">+18 %</w:t>
             </w:r>
             <w:r>
               <w:rPr>
                 <w:rFonts w:ascii="Times New Roman" w:hAnsi="Times New Roman"/>
-                <w:sz w:val="18"/>
+                <w:sz w:val="20"/>
               </w:rPr>
               <w:br/>
             </w:r>
             <w:r>
               <w:rPr>
                 <w:rFonts w:ascii="Times New Roman" w:hAnsi="Times New Roman"/>
-                <w:sz w:val="18"/>
+                <w:sz w:val="20"/>
               </w:rPr>
               <w:t xml:space="preserve">[0 to +55]</w:t>
             </w:r>
             <w:r>
               <w:rPr>
                 <w:rFonts w:ascii="Times New Roman" w:hAnsi="Times New Roman"/>
-                <w:sz w:val="18"/>
+                <w:sz w:val="20"/>
               </w:rPr>
               <w:br/>
             </w:r>
             <w:r>
               <w:rPr>
                 <w:rFonts w:ascii="Times New Roman" w:hAnsi="Times New Roman"/>
-                <w:sz w:val="18"/>
+                <w:sz w:val="20"/>
               </w:rPr>
               <w:t xml:space="preserve">2100:</w:t>
             </w:r>
             <w:r>
               <w:rPr>
                 <w:rFonts w:ascii="Times New Roman" w:hAnsi="Times New Roman"/>
-                <w:sz w:val="18"/>
+                <w:sz w:val="20"/>
               </w:rPr>
               <w:t xml:space="preserve"> </w:t>
             </w:r>
@@ -1573,21 +1573,21 @@
                 <w:bCs/>
                 <w:rFonts w:ascii="Times New Roman" w:hAnsi="Times New Roman"/>
                 <w:b/>
-                <w:sz w:val="18"/>
+                <w:sz w:val="20"/>
               </w:rPr>
               <w:t xml:space="preserve">+17 %</w:t>
             </w:r>
             <w:r>
               <w:rPr>
                 <w:rFonts w:ascii="Times New Roman" w:hAnsi="Times New Roman"/>
-                <w:sz w:val="18"/>
+                <w:sz w:val="20"/>
               </w:rPr>
               <w:br/>
             </w:r>
             <w:r>
               <w:rPr>
                 <w:rFonts w:ascii="Times New Roman" w:hAnsi="Times New Roman"/>
-                <w:sz w:val="18"/>
+                <w:sz w:val="20"/>
               </w:rPr>
               <w:t xml:space="preserve">[−1 to +54]</w:t>
             </w:r>
@@ -1595,25 +1595,25 @@
         </w:tc>
         <w:tc>
           <w:tcPr>
-            <w:tcW w:type="dxa" w:w="1304"/>
+            <w:tcW w:type="dxa" w:w="1332"/>
           </w:tcPr>
           <w:p>
             <w:pPr>
               <w:pStyle w:val="Compact"/>
-              <w:spacing w:after="20" w:before="20"/>
+              <w:spacing w:after="20" w:before="20" w:line="240" w:lineRule="auto"/>
               <w:jc w:val="center"/>
             </w:pPr>
             <w:r>
               <w:rPr>
                 <w:rFonts w:ascii="Times New Roman" w:hAnsi="Times New Roman"/>
-                <w:sz w:val="18"/>
+                <w:sz w:val="20"/>
               </w:rPr>
               <w:t xml:space="preserve">2050:</w:t>
             </w:r>
             <w:r>
               <w:rPr>
                 <w:rFonts w:ascii="Times New Roman" w:hAnsi="Times New Roman"/>
-                <w:sz w:val="18"/>
+                <w:sz w:val="20"/>
               </w:rPr>
               <w:t xml:space="preserve"> </w:t>
             </w:r>
@@ -1622,42 +1622,42 @@
                 <w:bCs/>
                 <w:rFonts w:ascii="Times New Roman" w:hAnsi="Times New Roman"/>
                 <w:b/>
-                <w:sz w:val="18"/>
+                <w:sz w:val="20"/>
               </w:rPr>
               <w:t xml:space="preserve">+24 %</w:t>
             </w:r>
             <w:r>
               <w:rPr>
                 <w:rFonts w:ascii="Times New Roman" w:hAnsi="Times New Roman"/>
-                <w:sz w:val="18"/>
+                <w:sz w:val="20"/>
               </w:rPr>
               <w:br/>
             </w:r>
             <w:r>
               <w:rPr>
                 <w:rFonts w:ascii="Times New Roman" w:hAnsi="Times New Roman"/>
-                <w:sz w:val="18"/>
+                <w:sz w:val="20"/>
               </w:rPr>
               <w:t xml:space="preserve">[−1 to +67]</w:t>
             </w:r>
             <w:r>
               <w:rPr>
                 <w:rFonts w:ascii="Times New Roman" w:hAnsi="Times New Roman"/>
-                <w:sz w:val="18"/>
+                <w:sz w:val="20"/>
               </w:rPr>
               <w:br/>
             </w:r>
             <w:r>
               <w:rPr>
                 <w:rFonts w:ascii="Times New Roman" w:hAnsi="Times New Roman"/>
-                <w:sz w:val="18"/>
+                <w:sz w:val="20"/>
               </w:rPr>
               <w:t xml:space="preserve">2100:</w:t>
             </w:r>
             <w:r>
               <w:rPr>
                 <w:rFonts w:ascii="Times New Roman" w:hAnsi="Times New Roman"/>
-                <w:sz w:val="18"/>
+                <w:sz w:val="20"/>
               </w:rPr>
               <w:t xml:space="preserve"> </w:t>
             </w:r>
@@ -1666,21 +1666,21 @@
                 <w:bCs/>
                 <w:rFonts w:ascii="Times New Roman" w:hAnsi="Times New Roman"/>
                 <w:b/>
-                <w:sz w:val="18"/>
+                <w:sz w:val="20"/>
               </w:rPr>
               <w:t xml:space="preserve">+43 %</w:t>
             </w:r>
             <w:r>
               <w:rPr>
                 <w:rFonts w:ascii="Times New Roman" w:hAnsi="Times New Roman"/>
-                <w:sz w:val="18"/>
+                <w:sz w:val="20"/>
               </w:rPr>
               <w:br/>
             </w:r>
             <w:r>
               <w:rPr>
                 <w:rFonts w:ascii="Times New Roman" w:hAnsi="Times New Roman"/>
-                <w:sz w:val="18"/>
+                <w:sz w:val="20"/>
               </w:rPr>
               <w:t xml:space="preserve">[+5 to +110]</w:t>
             </w:r>
@@ -1688,60 +1688,60 @@
         </w:tc>
         <w:tc>
           <w:tcPr>
-            <w:tcW w:type="dxa" w:w="4592"/>
+            <w:tcW w:type="dxa" w:w="4252"/>
           </w:tcPr>
           <w:p>
             <w:pPr>
               <w:pStyle w:val="Compact"/>
-              <w:spacing w:after="20" w:before="20"/>
+              <w:spacing w:after="20" w:before="20" w:line="240" w:lineRule="auto"/>
               <w:jc w:val="left"/>
             </w:pPr>
             <w:r>
               <w:rPr>
                 <w:rFonts w:ascii="Times New Roman" w:hAnsi="Times New Roman"/>
-                <w:sz w:val="18"/>
+                <w:sz w:val="20"/>
               </w:rPr>
               <w:t xml:space="preserve">Heavier downpours on bare, crusted soils produce the floods that strike Niamey and the Niger River valley, where</w:t>
             </w:r>
             <w:r>
               <w:rPr>
                 <w:rFonts w:ascii="Times New Roman" w:hAnsi="Times New Roman"/>
-                <w:sz w:val="18"/>
+                <w:sz w:val="20"/>
               </w:rPr>
               <w:t xml:space="preserve"> </w:t>
             </w:r>
             <w:r>
               <w:rPr>
                 <w:rFonts w:ascii="Times New Roman" w:hAnsi="Times New Roman"/>
-                <w:sz w:val="18"/>
+                <w:sz w:val="20"/>
               </w:rPr>
               <w:t xml:space="preserve">people, infrastructure and irrigated rice are concentrated. Under current policies, even the low end of the</w:t>
             </w:r>
             <w:r>
               <w:rPr>
                 <w:rFonts w:ascii="Times New Roman" w:hAnsi="Times New Roman"/>
-                <w:sz w:val="18"/>
+                <w:sz w:val="20"/>
               </w:rPr>
               <w:t xml:space="preserve"> </w:t>
             </w:r>
             <w:r>
               <w:rPr>
                 <w:rFonts w:ascii="Times New Roman" w:hAnsi="Times New Roman"/>
-                <w:sz w:val="18"/>
+                <w:sz w:val="20"/>
               </w:rPr>
               <w:t xml:space="preserve">model range shows an increase by 2100, and extreme Sahelian storms have already tripled in frequency since 1982</w:t>
             </w:r>
             <w:r>
               <w:rPr>
                 <w:rFonts w:ascii="Times New Roman" w:hAnsi="Times New Roman"/>
-                <w:sz w:val="18"/>
+                <w:sz w:val="20"/>
               </w:rPr>
               <w:t xml:space="preserve"> </w:t>
             </w:r>
             <w:r>
               <w:rPr>
                 <w:rFonts w:ascii="Times New Roman" w:hAnsi="Times New Roman"/>
-                <w:sz w:val="18"/>
+                <w:sz w:val="20"/>
               </w:rPr>
               <w:t xml:space="preserve">(</w:t>
             </w:r>
@@ -1756,7 +1756,7 @@
             <w:r>
               <w:rPr>
                 <w:rFonts w:ascii="Times New Roman" w:hAnsi="Times New Roman"/>
-                <w:sz w:val="18"/>
+                <w:sz w:val="20"/>
               </w:rPr>
               <w:t xml:space="preserve">).</w:t>
             </w:r>
@@ -1814,6 +1814,8 @@
     <w:p>
       <w:pPr>
         <w:pStyle w:val="ImageCaption"/>
+        <w:spacing w:line="240" w:lineRule="auto" w:after="120"/>
+        <w:jc w:val="both"/>
       </w:pPr>
       <w:r>
         <w:rPr>
@@ -2154,6 +2156,8 @@
     <w:p>
       <w:pPr>
         <w:pStyle w:val="FirstParagraph"/>
+        <w:spacing w:line="240" w:lineRule="auto" w:after="120"/>
+        <w:jc w:val="left"/>
       </w:pPr>
       <w:r>
         <w:t xml:space="preserve">AFP (2024, 9 October). Niger ups flood toll to 339 dead, more than 1 million affected.</w:t>
@@ -2186,6 +2190,8 @@
     <w:p>
       <w:pPr>
         <w:pStyle w:val="BodyText"/>
+        <w:spacing w:line="240" w:lineRule="auto" w:after="120"/>
+        <w:jc w:val="left"/>
       </w:pPr>
       <w:r>
         <w:t xml:space="preserve">Climate Analytics (2026).</w:t>
@@ -2236,6 +2242,8 @@
     <w:p>
       <w:pPr>
         <w:pStyle w:val="BodyText"/>
+        <w:spacing w:line="240" w:lineRule="auto" w:after="120"/>
+        <w:jc w:val="left"/>
       </w:pPr>
       <w:r>
         <w:t xml:space="preserve">Mohamed, A. M. L., Salack, S., Mkuhlani, S., Chemura, A., et al. (2025). Impact of climate change on</w:t>
@@ -2274,6 +2282,8 @@
     <w:p>
       <w:pPr>
         <w:pStyle w:val="BodyText"/>
+        <w:spacing w:line="240" w:lineRule="auto" w:after="120"/>
+        <w:jc w:val="left"/>
       </w:pPr>
       <w:r>
         <w:t xml:space="preserve">Sylla, M. B., Faye, A., Giorgi, F., Diedhiou, A., &amp; Kunstmann, H. (2018). Projected heat stress under</w:t>
@@ -2318,6 +2328,8 @@
     <w:p>
       <w:pPr>
         <w:pStyle w:val="BodyText"/>
+        <w:spacing w:line="240" w:lineRule="auto" w:after="120"/>
+        <w:jc w:val="left"/>
       </w:pPr>
       <w:r>
         <w:t xml:space="preserve">Taylor, C. M., Belušić, D., Guichard, F., Parker, D. J., Vischel, T., Bock, O., Harris, P. P.,</w:t>
@@ -2362,6 +2374,8 @@
     <w:p>
       <w:pPr>
         <w:pStyle w:val="BodyText"/>
+        <w:spacing w:line="240" w:lineRule="auto" w:after="120"/>
+        <w:jc w:val="left"/>
       </w:pPr>
       <w:r>
         <w:t xml:space="preserve">World Bank (2022).</w:t>
@@ -2400,6 +2414,8 @@
     <w:p>
       <w:pPr>
         <w:pStyle w:val="BodyText"/>
+        <w:spacing w:line="240" w:lineRule="auto" w:after="120"/>
+        <w:jc w:val="left"/>
       </w:pPr>
       <w:r>
         <w:t xml:space="preserve">World Bank (2024, 28 June). The World Bank supports food security and climate resilience for households</w:t>
@@ -2427,7 +2443,7 @@
       <w:headerReference w:type="default" r:id="rId9"/>
       <w:footerReference w:type="default" r:id="rId10"/>
       <w:pgSz w:h="16838" w:w="11906"/>
-      <w:pgMar w:top="1077" w:bottom="964" w:left="1077" w:right="1077"/>
+      <w:pgMar w:top="1417" w:bottom="1417" w:left="1417" w:right="1417"/>
     </w:sectPr>
   </w:body>
 </w:document>
@@ -2494,7 +2510,7 @@
     <w:pPr>
       <w:pStyle w:val="Header"/>
       <w:tabs>
-        <w:tab w:pos="9752" w:val="right"/>
+        <w:tab w:pos="9072" w:val="right"/>
       </w:tabs>
       <w:pBdr>
         <w:bottom w:val="single" w:sz="6" w:space="1" w:color="000000"/>
@@ -2821,12 +2837,13 @@
     <w:name w:val="Normal"/>
     <w:qFormat/>
     <w:pPr>
-      <w:spacing w:after="60" w:before="0" w:line="240" w:lineRule="auto"/>
+      <w:spacing w:after="120" w:before="0" w:line="360" w:lineRule="auto"/>
+      <w:jc w:val="both"/>
     </w:pPr>
     <w:rPr>
       <w:rFonts w:ascii="Times New Roman" w:cs="Times New Roman" w:eastAsia="Times New Roman" w:hAnsi="Times New Roman"/>
       <w:color w:val="000000"/>
-      <w:sz w:val="21"/>
+      <w:sz w:val="24"/>
     </w:rPr>
   </w:style>
   <w:style w:styleId="BodyText" w:type="paragraph">
@@ -2834,13 +2851,14 @@
     <w:basedOn w:val="Normal"/>
     <w:link w:val="BodyTextChar"/>
     <w:pPr>
-      <w:spacing w:after="60" w:before="0" w:line="240" w:lineRule="auto"/>
+      <w:spacing w:after="120" w:before="0" w:line="360" w:lineRule="auto"/>
+      <w:jc w:val="both"/>
     </w:pPr>
     <w:qFormat/>
     <w:rPr>
       <w:rFonts w:ascii="Times New Roman" w:cs="Times New Roman" w:eastAsia="Times New Roman" w:hAnsi="Times New Roman"/>
       <w:color w:val="000000"/>
-      <w:sz w:val="21"/>
+      <w:sz w:val="24"/>
     </w:rPr>
   </w:style>
   <w:style w:customStyle="1" w:styleId="FirstParagraph" w:type="paragraph">
@@ -2849,12 +2867,13 @@
     <w:next w:val="BodyText"/>
     <w:qFormat/>
     <w:pPr>
-      <w:spacing w:after="60" w:before="0" w:line="240" w:lineRule="auto"/>
+      <w:spacing w:after="120" w:before="0" w:line="360" w:lineRule="auto"/>
+      <w:jc w:val="both"/>
     </w:pPr>
     <w:rPr>
       <w:rFonts w:ascii="Times New Roman" w:cs="Times New Roman" w:eastAsia="Times New Roman" w:hAnsi="Times New Roman"/>
       <w:color w:val="000000"/>
-      <w:sz w:val="21"/>
+      <w:sz w:val="24"/>
     </w:rPr>
   </w:style>
   <w:style w:customStyle="1" w:styleId="Compact" w:type="paragraph">
@@ -2862,12 +2881,13 @@
     <w:basedOn w:val="BodyText"/>
     <w:qFormat/>
     <w:pPr>
-      <w:spacing w:after="60" w:before="0" w:line="240" w:lineRule="auto"/>
+      <w:spacing w:after="120" w:before="0" w:line="360" w:lineRule="auto"/>
+      <w:jc w:val="both"/>
     </w:pPr>
     <w:rPr>
       <w:rFonts w:ascii="Times New Roman" w:cs="Times New Roman" w:eastAsia="Times New Roman" w:hAnsi="Times New Roman"/>
       <w:color w:val="000000"/>
-      <w:sz w:val="21"/>
+      <w:sz w:val="24"/>
     </w:rPr>
   </w:style>
   <w:style w:styleId="Title" w:type="paragraph">
@@ -2980,7 +3000,7 @@
     <w:pPr>
       <w:keepNext/>
       <w:keepLines/>
-      <w:spacing w:after="60" w:before="160"/>
+      <w:spacing w:after="80" w:before="240" w:line="276" w:lineRule="auto"/>
       <w:outlineLvl w:val="0"/>
     </w:pPr>
     <w:rPr>
@@ -2988,7 +3008,7 @@
       <w:b/>
       <w:bCs/>
       <w:color w:val="000000"/>
-      <w:sz w:val="25"/>
+      <w:sz w:val="26"/>
       <w:szCs w:val="32"/>
     </w:rPr>
   </w:style>
@@ -3002,7 +3022,7 @@
     <w:pPr>
       <w:keepNext/>
       <w:keepLines/>
-      <w:spacing w:after="60" w:before="160"/>
+      <w:spacing w:after="80" w:before="240" w:line="276" w:lineRule="auto"/>
       <w:outlineLvl w:val="1"/>
     </w:pPr>
     <w:rPr>
@@ -3024,7 +3044,7 @@
     <w:pPr>
       <w:keepNext/>
       <w:keepLines/>
-      <w:spacing w:after="60" w:before="160"/>
+      <w:spacing w:after="80" w:before="240" w:line="276" w:lineRule="auto"/>
       <w:outlineLvl w:val="2"/>
     </w:pPr>
     <w:rPr>
@@ -3032,7 +3052,7 @@
       <w:b/>
       <w:bCs/>
       <w:color w:val="000000"/>
-      <w:sz w:val="22"/>
+      <w:sz w:val="24"/>
       <w:szCs w:val="24"/>
     </w:rPr>
   </w:style>
@@ -3167,13 +3187,14 @@
     <w:unhideWhenUsed/>
     <w:qFormat/>
     <w:pPr>
-      <w:spacing w:after="60" w:before="0" w:line="240" w:lineRule="auto"/>
+      <w:spacing w:after="120" w:before="0" w:line="360" w:lineRule="auto"/>
       <w:ind w:firstLine="0" w:left="480" w:right="480"/>
+      <w:jc w:val="both"/>
     </w:pPr>
     <w:rPr>
       <w:rFonts w:ascii="Times New Roman" w:cs="Times New Roman" w:eastAsia="Times New Roman" w:hAnsi="Times New Roman"/>
       <w:color w:val="000000"/>
-      <w:sz w:val="21"/>
+      <w:sz w:val="24"/>
     </w:rPr>
   </w:style>
   <w:style w:styleId="FootnoteText" w:type="paragraph">
@@ -3352,17 +3373,18 @@
     <w:name w:val="Key Box"/>
     <w:basedOn w:val="Normal"/>
     <w:pPr>
+      <w:spacing w:after="40" w:line="360" w:lineRule="auto"/>
+      <w:ind w:left="170"/>
+      <w:jc w:val="both"/>
       <w:pBdr>
         <w:left w:color="000000" w:space="6" w:sz="18" w:val="single"/>
       </w:pBdr>
       <w:shd w:color="auto" w:fill="EFEFEF" w:val="clear"/>
-      <w:spacing w:after="40"/>
-      <w:ind w:left="170"/>
     </w:pPr>
     <w:rPr>
       <w:rFonts w:ascii="Times New Roman" w:cs="Times New Roman" w:eastAsia="Times New Roman" w:hAnsi="Times New Roman"/>
       <w:color w:val="000000"/>
-      <w:sz w:val="21"/>
+      <w:sz w:val="24"/>
     </w:rPr>
   </w:style>
   <w:style w:customStyle="1" w:styleId="KeyBoxTitle" w:type="paragraph">
@@ -3380,7 +3402,7 @@
       <w:rFonts w:ascii="Times New Roman" w:cs="Times New Roman" w:eastAsia="Times New Roman" w:hAnsi="Times New Roman"/>
       <w:b/>
       <w:color w:val="000000"/>
-      <w:sz w:val="22"/>
+      <w:sz w:val="24"/>
     </w:rPr>
   </w:style>
   <w:style w:customStyle="1" w:styleId="Centered" w:type="paragraph">

</xml_diff>

<commit_message>
Ajoute la version condensée de 2 pages de la note Niger (PDF et Word)
- niger_policy_memo_2p.tex : même format (Times New Roman 12 pt,
  interligne 1,5, justifié), marges de 2 cm, note de 2 pages et page de
  références ; citations cliquables.
- Script Word paramétrable (source, marges, largeurs de colonnes) ;
  notes de source des tableaux en petit et en interligne simple.

Co-Authored-By: Claude Opus 5.5 <noreply@anthropic.com>
Claude-Session: https://claude.ai/code/session_01KUsbuaysKhPQSJCGSc45ce
</commit_message>
<xml_diff>
--- a/devoir-niger/memo-final/word/Niger_Policy_Memo.docx
+++ b/devoir-niger/memo-final/word/Niger_Policy_Memo.docx
@@ -405,11 +405,13 @@
     <w:p>
       <w:pPr>
         <w:pStyle w:val="FirstParagraph"/>
+        <w:spacing w:line="240" w:lineRule="auto"/>
       </w:pPr>
       <w:r>
         <w:rPr>
           <w:iCs/>
           <w:i/>
+          <w:sz w:val="20"/>
         </w:rPr>
         <w:t xml:space="preserve">Source:</w:t>
       </w:r>
@@ -417,6 +419,7 @@
         <w:rPr>
           <w:iCs/>
           <w:i/>
+          <w:sz w:val="20"/>
         </w:rPr>
         <w:t xml:space="preserve"> </w:t>
       </w:r>
@@ -434,6 +437,7 @@
         <w:rPr>
           <w:iCs/>
           <w:i/>
+          <w:sz w:val="20"/>
         </w:rPr>
         <w:t xml:space="preserve"> </w:t>
       </w:r>
@@ -441,6 +445,7 @@
         <w:rPr>
           <w:iCs/>
           <w:i/>
+          <w:sz w:val="20"/>
         </w:rPr>
         <w:t xml:space="preserve">(Climate Analytics), Niger, annual values, area-weighted average. NGFS</w:t>
       </w:r>
@@ -448,6 +453,7 @@
         <w:rPr>
           <w:iCs/>
           <w:i/>
+          <w:sz w:val="20"/>
         </w:rPr>
         <w:t xml:space="preserve"> </w:t>
       </w:r>
@@ -455,6 +461,7 @@
         <w:rPr>
           <w:iCs/>
           <w:i/>
+          <w:sz w:val="20"/>
         </w:rPr>
         <w:t xml:space="preserve">“</w:t>
       </w:r>
@@ -462,6 +469,7 @@
         <w:rPr>
           <w:iCs/>
           <w:i/>
+          <w:sz w:val="20"/>
         </w:rPr>
         <w:t xml:space="preserve">Below 2 °C</w:t>
       </w:r>
@@ -469,6 +477,7 @@
         <w:rPr>
           <w:iCs/>
           <w:i/>
+          <w:sz w:val="20"/>
         </w:rPr>
         <w:t xml:space="preserve">”</w:t>
       </w:r>
@@ -476,6 +485,7 @@
         <w:rPr>
           <w:iCs/>
           <w:i/>
+          <w:sz w:val="20"/>
         </w:rPr>
         <w:t xml:space="preserve"> </w:t>
       </w:r>
@@ -483,6 +493,7 @@
         <w:rPr>
           <w:iCs/>
           <w:i/>
+          <w:sz w:val="20"/>
         </w:rPr>
         <w:t xml:space="preserve">scenario (1.6 °C of global warming in 2100) versus</w:t>
       </w:r>
@@ -490,6 +501,7 @@
         <w:rPr>
           <w:iCs/>
           <w:i/>
+          <w:sz w:val="20"/>
         </w:rPr>
         <w:t xml:space="preserve"> </w:t>
       </w:r>
@@ -497,6 +509,7 @@
         <w:rPr>
           <w:iCs/>
           <w:i/>
+          <w:sz w:val="20"/>
         </w:rPr>
         <w:t xml:space="preserve">“</w:t>
       </w:r>
@@ -504,6 +517,7 @@
         <w:rPr>
           <w:iCs/>
           <w:i/>
+          <w:sz w:val="20"/>
         </w:rPr>
         <w:t xml:space="preserve">Current policies</w:t>
       </w:r>
@@ -511,6 +525,7 @@
         <w:rPr>
           <w:iCs/>
           <w:i/>
+          <w:sz w:val="20"/>
         </w:rPr>
         <w:t xml:space="preserve">”</w:t>
       </w:r>
@@ -518,6 +533,7 @@
         <w:rPr>
           <w:iCs/>
           <w:i/>
+          <w:sz w:val="20"/>
         </w:rPr>
         <w:t xml:space="preserve"> </w:t>
       </w:r>
@@ -525,6 +541,7 @@
         <w:rPr>
           <w:iCs/>
           <w:i/>
+          <w:sz w:val="20"/>
         </w:rPr>
         <w:t xml:space="preserve">(2.9 °C). Median</w:t>
       </w:r>
@@ -532,6 +549,7 @@
         <w:rPr>
           <w:iCs/>
           <w:i/>
+          <w:sz w:val="20"/>
         </w:rPr>
         <w:t xml:space="preserve"> </w:t>
       </w:r>
@@ -539,6 +557,7 @@
         <w:rPr>
           <w:iCs/>
           <w:i/>
+          <w:sz w:val="20"/>
         </w:rPr>
         <w:t xml:space="preserve">of five climate models, with the 5–95 % model range in brackets; the tool flags results after 2060 as</w:t>
       </w:r>
@@ -546,6 +565,7 @@
         <w:rPr>
           <w:iCs/>
           <w:i/>
+          <w:sz w:val="20"/>
         </w:rPr>
         <w:t xml:space="preserve"> </w:t>
       </w:r>
@@ -553,6 +573,7 @@
         <w:rPr>
           <w:iCs/>
           <w:i/>
+          <w:sz w:val="20"/>
         </w:rPr>
         <w:t xml:space="preserve">indicative.</w:t>
       </w:r>

</xml_diff>

<commit_message>
Réécrit la note Niger en style de note ministérielle et met les citations en noir
- Style sobre : résumé, situation, impacts projetés, évaluation,
  recommandations, limites ; paragraphes numérotés en continu, phrases
  courtes, sans encadrés ni flèches.
- Citations et liens en noir, toujours cliquables (PDF et Word).
- Word : numérotation continue des paragraphes, recommandations (a)-(d),
  références sur une nouvelle page sans page blanche.

Co-Authored-By: Claude Opus 5.5 <noreply@anthropic.com>
Claude-Session: https://claude.ai/code/session_01KUsbuaysKhPQSJCGSc45ce
</commit_message>
<xml_diff>
--- a/devoir-niger/memo-final/word/Niger_Policy_Memo.docx
+++ b/devoir-niger/memo-final/word/Niger_Policy_Memo.docx
@@ -182,111 +182,61 @@
                 <w:rFonts w:ascii="Times New Roman" w:hAnsi="Times New Roman"/>
                 <w:sz w:val="20"/>
               </w:rPr>
-              <w:t xml:space="preserve">What Niger stands to lose, and what it gains if warming is limited</w:t>
+              <w:t xml:space="preserve">Climate risks for Niger and the case for limiting global warming</w:t>
             </w:r>
           </w:p>
         </w:tc>
       </w:tr>
     </w:tbl>
+    <w:bookmarkStart w:id="20" w:name="summary"/>
     <w:p>
       <w:pPr>
-        <w:pStyle w:val="KeyBoxTitle"/>
-      </w:pPr>
-      <w:r>
-        <w:rPr>
-          <w:bCs/>
-          <w:b/>
-        </w:rPr>
-        <w:t xml:space="preserve">Key message</w:t>
+        <w:pStyle w:val="Heading1"/>
+      </w:pPr>
+      <w:r>
+        <w:t xml:space="preserve">Summary</w:t>
       </w:r>
     </w:p>
     <w:p>
       <w:pPr>
-        <w:pStyle w:val="KeyBox"/>
-      </w:pPr>
-      <w:r>
-        <w:rPr>
-          <w:bCs/>
-          <w:b/>
-        </w:rPr>
-        <w:t xml:space="preserve">By 2100, current global policies would roughly triple the number of days on which heat becomes dangerous</w:t>
-      </w:r>
-      <w:r>
-        <w:rPr>
-          <w:bCs/>
-          <w:b/>
-        </w:rPr>
-        <w:t xml:space="preserve"> </w:t>
-      </w:r>
-      <w:r>
-        <w:rPr>
-          <w:bCs/>
-          <w:b/>
-        </w:rPr>
-        <w:t xml:space="preserve">in Niger, from about 31 a year today to 91; holding warming below 2 °C would cap it at about 42.</w:t>
-      </w:r>
-      <w:r>
-        <w:t xml:space="preserve"> </w:t>
-      </w:r>
-      <w:r>
-        <w:t xml:space="preserve">With more</w:t>
-      </w:r>
-      <w:r>
-        <w:t xml:space="preserve"> </w:t>
-      </w:r>
-      <w:r>
-        <w:t xml:space="preserve">than 80 % of Nigeriens working outdoors in farming and herding, this is the largest loss that global</w:t>
-      </w:r>
-      <w:r>
-        <w:t xml:space="preserve"> </w:t>
-      </w:r>
-      <w:r>
-        <w:t xml:space="preserve">mitigation can still prevent. The heaviest multi-day rains would also intensify far more under current</w:t>
-      </w:r>
-      <w:r>
-        <w:t xml:space="preserve"> </w:t>
-      </w:r>
-      <w:r>
-        <w:t xml:space="preserve">policies (+43 %) than below 2 °C (+17 %). Severe drought, by contrast, reaches almost the whole country</w:t>
-      </w:r>
-      <w:r>
-        <w:t xml:space="preserve"> </w:t>
-      </w:r>
-      <w:r>
-        <w:t xml:space="preserve">by 2030 in every scenario.</w:t>
-      </w:r>
-      <w:r>
-        <w:t xml:space="preserve"> </w:t>
-      </w:r>
-      <w:r>
-        <w:rPr>
-          <w:bCs/>
-          <w:b/>
-        </w:rPr>
-        <w:t xml:space="preserve">Niger’s national interest is therefore twofold: press for a rapid global</w:t>
-      </w:r>
-      <w:r>
-        <w:rPr>
-          <w:bCs/>
-          <w:b/>
-        </w:rPr>
-        <w:t xml:space="preserve"> </w:t>
-      </w:r>
-      <w:r>
-        <w:rPr>
-          <w:bCs/>
-          <w:b/>
-        </w:rPr>
-        <w:t xml:space="preserve">phase-out of emissions, and secure the finance to adapt now.</w:t>
+        <w:pStyle w:val="FirstParagraph"/>
+      </w:pPr>
+      <w:r>
+        <w:t xml:space="preserve">Niger faces a sharp rise in dangerous heat. Under current global policies, days of dangerous heat would</w:t>
+      </w:r>
+      <w:r>
+        <w:t xml:space="preserve"> </w:t>
+      </w:r>
+      <w:r>
+        <w:t xml:space="preserve">increase from 31 a year today to 91 by 2100. If warming stays below 2 °C, they would stay near 42. Extreme</w:t>
+      </w:r>
+      <w:r>
+        <w:t xml:space="preserve"> </w:t>
+      </w:r>
+      <w:r>
+        <w:t xml:space="preserve">rainfall would also intensify much more under current policies. Severe drought will affect almost the whole</w:t>
+      </w:r>
+      <w:r>
+        <w:t xml:space="preserve"> </w:t>
+      </w:r>
+      <w:r>
+        <w:t xml:space="preserve">country by 2030 in all scenarios. Niger should therefore support rapid global emission cuts and seek</w:t>
+      </w:r>
+      <w:r>
+        <w:t xml:space="preserve"> </w:t>
+      </w:r>
+      <w:r>
+        <w:t xml:space="preserve">adaptation finance now.</w:t>
       </w:r>
     </w:p>
-    <w:bookmarkStart w:id="22" w:name="Xd80f144e15fb041c63977807bcfccac165ea994"/>
+    <w:bookmarkEnd w:id="20"/>
+    <w:bookmarkStart w:id="23" w:name="a.-situation"/>
     <w:p>
       <w:pPr>
         <w:pStyle w:val="Heading1"/>
       </w:pPr>
       <w:r>
-        <w:t xml:space="preserve">1. Why the stakes are unusually high for Niger</w:t>
+        <w:t xml:space="preserve">A. Situation</w:t>
       </w:r>
     </w:p>
     <w:p>
@@ -297,25 +247,15 @@
         </w:numPr>
       </w:pPr>
       <w:r>
-        <w:rPr>
-          <w:bCs/>
-          <w:b/>
-        </w:rPr>
-        <w:t xml:space="preserve">An economy that works in the open air.</w:t>
-      </w:r>
-      <w:r>
-        <w:t xml:space="preserve"> </w:t>
-      </w:r>
-      <w:r>
-        <w:t xml:space="preserve">Agriculture and livestock generate almost 40 % of GDP</w:t>
-      </w:r>
-      <w:r>
-        <w:t xml:space="preserve"> </w:t>
-      </w:r>
-      <w:r>
-        <w:t xml:space="preserve">and over 80 % of employment, and depend overwhelmingly on rainfall (</w:t>
-      </w:r>
-      <w:hyperlink r:id="rId20">
+        <w:t xml:space="preserve">Agriculture and livestock generate almost 40 % of GDP and over 80 % of jobs. Both depend on</w:t>
+      </w:r>
+      <w:r>
+        <w:t xml:space="preserve"> </w:t>
+      </w:r>
+      <w:r>
+        <w:t xml:space="preserve">rainfall, and most of this work is done outdoors (</w:t>
+      </w:r>
+      <w:hyperlink r:id="rId21">
         <w:r>
           <w:rPr>
             <w:rStyle w:val="Hyperlink"/>
@@ -335,25 +275,15 @@
         </w:numPr>
       </w:pPr>
       <w:r>
-        <w:rPr>
-          <w:bCs/>
-          <w:b/>
-        </w:rPr>
-        <w:t xml:space="preserve">Shocks that are already frequent and deadly.</w:t>
-      </w:r>
-      <w:r>
-        <w:t xml:space="preserve"> </w:t>
-      </w:r>
-      <w:r>
-        <w:t xml:space="preserve">The 2005 and 2010 droughts triggered national</w:t>
-      </w:r>
-      <w:r>
-        <w:t xml:space="preserve"> </w:t>
-      </w:r>
-      <w:r>
-        <w:t xml:space="preserve">food crises; the 2024 floods killed 339 people and affected more than 1.1 million (</w:t>
-      </w:r>
-      <w:hyperlink r:id="rId21">
+        <w:t xml:space="preserve">Climate shocks are already severe. The 2005 and 2010 droughts caused national food crises. The 2024</w:t>
+      </w:r>
+      <w:r>
+        <w:t xml:space="preserve"> </w:t>
+      </w:r>
+      <w:r>
+        <w:t xml:space="preserve">floods killed 339 people and affected more than 1.1 million (</w:t>
+      </w:r>
+      <w:hyperlink r:id="rId22">
         <w:r>
           <w:rPr>
             <w:rStyle w:val="Hyperlink"/>
@@ -373,209 +303,193 @@
         </w:numPr>
       </w:pPr>
       <w:r>
+        <w:t xml:space="preserve">Niger’s share of global emissions is negligible. Its exposure therefore depends on the emissions of</w:t>
+      </w:r>
+      <w:r>
+        <w:t xml:space="preserve"> </w:t>
+      </w:r>
+      <w:r>
+        <w:t xml:space="preserve">other countries.</w:t>
+      </w:r>
+    </w:p>
+    <w:bookmarkEnd w:id="23"/>
+    <w:bookmarkStart w:id="31" w:name="b.-projected-impacts"/>
+    <w:p>
+      <w:pPr>
+        <w:pStyle w:val="Heading1"/>
+      </w:pPr>
+      <w:r>
+        <w:t xml:space="preserve">B. Projected impacts</w:t>
+      </w:r>
+    </w:p>
+    <w:p>
+      <w:pPr>
+        <w:numPr>
+          <w:ilvl w:val="0"/>
+          <w:numId w:val="1002"/>
+        </w:numPr>
+      </w:pPr>
+      <w:r>
         <w:rPr>
           <w:bCs/>
           <w:b/>
         </w:rPr>
-        <w:t xml:space="preserve">Exposure without responsibility.</w:t>
-      </w:r>
-      <w:r>
-        <w:t xml:space="preserve"> </w:t>
-      </w:r>
-      <w:r>
-        <w:t xml:space="preserve">Niger emits a negligible share of global greenhouse gases.</w:t>
-      </w:r>
-      <w:r>
-        <w:t xml:space="preserve"> </w:t>
-      </w:r>
-      <w:r>
-        <w:t xml:space="preserve">The losses described below are driven by other countries’ emissions and can only be limited by their cuts.</w:t>
-      </w:r>
-    </w:p>
-    <w:bookmarkEnd w:id="22"/>
-    <w:bookmarkStart w:id="30" w:name="X39e5cabf790fdd760c8b76197e70039a91d430d"/>
-    <w:p>
-      <w:pPr>
-        <w:pStyle w:val="Heading1"/>
-      </w:pPr>
-      <w:r>
-        <w:t xml:space="preserve">2. Three priority impacts, compared across scenarios</w:t>
-      </w:r>
-    </w:p>
-    <w:p>
-      <w:pPr>
-        <w:pStyle w:val="FirstParagraph"/>
-        <w:spacing w:line="240" w:lineRule="auto"/>
-      </w:pPr>
-      <w:r>
-        <w:rPr>
-          <w:iCs/>
-          <w:i/>
-          <w:sz w:val="20"/>
-        </w:rPr>
-        <w:t xml:space="preserve">Source:</w:t>
-      </w:r>
-      <w:r>
-        <w:rPr>
-          <w:iCs/>
-          <w:i/>
-          <w:sz w:val="20"/>
-        </w:rPr>
-        <w:t xml:space="preserve"> </w:t>
-      </w:r>
-      <w:hyperlink r:id="rId23">
+        <w:t xml:space="preserve">Heat (Table 1, Figure 1).</w:t>
+      </w:r>
+      <w:r>
+        <w:t xml:space="preserve"> </w:t>
+      </w:r>
+      <w:r>
+        <w:t xml:space="preserve">Dangerous-heat days triple under current policies, from 31 to 91 a year by 2100. Below</w:t>
+      </w:r>
+      <w:r>
+        <w:t xml:space="preserve"> </w:t>
+      </w:r>
+      <w:r>
+        <w:t xml:space="preserve">2 °C, they stabilise near 42. Above this heat-index threshold, sustained outdoor work exposes people to</w:t>
+      </w:r>
+      <w:r>
+        <w:t xml:space="preserve"> </w:t>
+      </w:r>
+      <w:r>
+        <w:t xml:space="preserve">heat exhaustion and heat stroke. The increase is about twice as large in the populated south as in the</w:t>
+      </w:r>
+      <w:r>
+        <w:t xml:space="preserve"> </w:t>
+      </w:r>
+      <w:r>
+        <w:t xml:space="preserve">north (+44 against +21 days at 2 °C compared with 1 °C of global warming). WASCAL researchers</w:t>
+      </w:r>
+      <w:r>
+        <w:t xml:space="preserve"> </w:t>
+      </w:r>
+      <w:r>
+        <w:t xml:space="preserve">project heat discomfort for over half of West Africa’s population at 1.5 to 2 °C (</w:t>
+      </w:r>
+      <w:hyperlink r:id="rId24">
         <w:r>
           <w:rPr>
             <w:rStyle w:val="Hyperlink"/>
-            <w:iCs/>
-            <w:i/>
           </w:rPr>
-          <w:t xml:space="preserve">Climate Impact Explorer</w:t>
+          <w:t xml:space="preserve">Sylla et al., 2018</w:t>
         </w:r>
       </w:hyperlink>
       <w:r>
+        <w:t xml:space="preserve">).</w:t>
+      </w:r>
+    </w:p>
+    <w:p>
+      <w:pPr>
+        <w:numPr>
+          <w:ilvl w:val="0"/>
+          <w:numId w:val="1002"/>
+        </w:numPr>
+      </w:pPr>
+      <w:r>
         <w:rPr>
-          <w:iCs/>
-          <w:i/>
+          <w:bCs/>
+          <w:b/>
+        </w:rPr>
+        <w:t xml:space="preserve">Drought.</w:t>
+      </w:r>
+      <w:r>
+        <w:t xml:space="preserve"> </w:t>
+      </w:r>
+      <w:r>
+        <w:t xml:space="preserve">The indicator includes evaporation, so it shows how heat dries soils and pastures.</w:t>
+      </w:r>
+      <w:r>
+        <w:t xml:space="preserve"> </w:t>
+      </w:r>
+      <w:r>
+        <w:t xml:space="preserve">About 96 % of the land is affected by 2030 in all scenarios. Limiting warming to 2 °C does not</w:t>
+      </w:r>
+      <w:r>
+        <w:t xml:space="preserve"> </w:t>
+      </w:r>
+      <w:r>
+        <w:t xml:space="preserve">change this. Only a 1.5 °C pathway reduces the share, to 87 % by 2100. Millet yields are expected</w:t>
+      </w:r>
+      <w:r>
+        <w:t xml:space="preserve"> </w:t>
+      </w:r>
+      <w:r>
+        <w:t xml:space="preserve">to fall in most scenarios (</w:t>
+      </w:r>
+      <w:hyperlink r:id="rId25">
+        <w:r>
+          <w:rPr>
+            <w:rStyle w:val="Hyperlink"/>
+          </w:rPr>
+          <w:t xml:space="preserve">Mohamed et al., 2025</w:t>
+        </w:r>
+      </w:hyperlink>
+      <w:r>
+        <w:t xml:space="preserve">).</w:t>
+      </w:r>
+    </w:p>
+    <w:p>
+      <w:pPr>
+        <w:numPr>
+          <w:ilvl w:val="0"/>
+          <w:numId w:val="1002"/>
+        </w:numPr>
+      </w:pPr>
+      <w:r>
+        <w:rPr>
+          <w:bCs/>
+          <w:b/>
+        </w:rPr>
+        <w:t xml:space="preserve">Rainfall.</w:t>
+      </w:r>
+      <w:r>
+        <w:t xml:space="preserve"> </w:t>
+      </w:r>
+      <w:r>
+        <w:t xml:space="preserve">Extreme rainfall rises by 43 % under current policies by 2100, against 17 % below</w:t>
+      </w:r>
+      <w:r>
+        <w:t xml:space="preserve"> </w:t>
+      </w:r>
+      <w:r>
+        <w:t xml:space="preserve">2 °C. Even the low end of the current-policies range shows an increase. Flood risk therefore grows in</w:t>
+      </w:r>
+      <w:r>
+        <w:t xml:space="preserve"> </w:t>
+      </w:r>
+      <w:r>
+        <w:t xml:space="preserve">Niamey and the Niger River valley, where people, infrastructure and irrigated rice are concentrated.</w:t>
+      </w:r>
+      <w:r>
+        <w:t xml:space="preserve"> </w:t>
+      </w:r>
+      <w:r>
+        <w:t xml:space="preserve">Extreme Sahelian storms have already tripled since 1982 (</w:t>
+      </w:r>
+      <w:hyperlink r:id="rId26">
+        <w:r>
+          <w:rPr>
+            <w:rStyle w:val="Hyperlink"/>
+          </w:rPr>
+          <w:t xml:space="preserve">Taylor et al., 2017</w:t>
+        </w:r>
+      </w:hyperlink>
+      <w:r>
+        <w:t xml:space="preserve">).</w:t>
+      </w:r>
+    </w:p>
+    <w:p>
+      <w:pPr>
+        <w:pStyle w:val="FirstParagraph"/>
+        <w:spacing w:line="240" w:lineRule="auto"/>
+      </w:pPr>
+      <w:r>
+        <w:rPr>
+          <w:bCs/>
+          <w:b/>
           <w:sz w:val="20"/>
         </w:rPr>
-        <w:t xml:space="preserve"> </w:t>
-      </w:r>
-      <w:r>
-        <w:rPr>
-          <w:iCs/>
-          <w:i/>
-          <w:sz w:val="20"/>
-        </w:rPr>
-        <w:t xml:space="preserve">(Climate Analytics), Niger, annual values, area-weighted average. NGFS</w:t>
-      </w:r>
-      <w:r>
-        <w:rPr>
-          <w:iCs/>
-          <w:i/>
-          <w:sz w:val="20"/>
-        </w:rPr>
-        <w:t xml:space="preserve"> </w:t>
-      </w:r>
-      <w:r>
-        <w:rPr>
-          <w:iCs/>
-          <w:i/>
-          <w:sz w:val="20"/>
-        </w:rPr>
-        <w:t xml:space="preserve">“</w:t>
-      </w:r>
-      <w:r>
-        <w:rPr>
-          <w:iCs/>
-          <w:i/>
-          <w:sz w:val="20"/>
-        </w:rPr>
-        <w:t xml:space="preserve">Below 2 °C</w:t>
-      </w:r>
-      <w:r>
-        <w:rPr>
-          <w:iCs/>
-          <w:i/>
-          <w:sz w:val="20"/>
-        </w:rPr>
-        <w:t xml:space="preserve">”</w:t>
-      </w:r>
-      <w:r>
-        <w:rPr>
-          <w:iCs/>
-          <w:i/>
-          <w:sz w:val="20"/>
-        </w:rPr>
-        <w:t xml:space="preserve"> </w:t>
-      </w:r>
-      <w:r>
-        <w:rPr>
-          <w:iCs/>
-          <w:i/>
-          <w:sz w:val="20"/>
-        </w:rPr>
-        <w:t xml:space="preserve">scenario (1.6 °C of global warming in 2100) versus</w:t>
-      </w:r>
-      <w:r>
-        <w:rPr>
-          <w:iCs/>
-          <w:i/>
-          <w:sz w:val="20"/>
-        </w:rPr>
-        <w:t xml:space="preserve"> </w:t>
-      </w:r>
-      <w:r>
-        <w:rPr>
-          <w:iCs/>
-          <w:i/>
-          <w:sz w:val="20"/>
-        </w:rPr>
-        <w:t xml:space="preserve">“</w:t>
-      </w:r>
-      <w:r>
-        <w:rPr>
-          <w:iCs/>
-          <w:i/>
-          <w:sz w:val="20"/>
-        </w:rPr>
-        <w:t xml:space="preserve">Current policies</w:t>
-      </w:r>
-      <w:r>
-        <w:rPr>
-          <w:iCs/>
-          <w:i/>
-          <w:sz w:val="20"/>
-        </w:rPr>
-        <w:t xml:space="preserve">”</w:t>
-      </w:r>
-      <w:r>
-        <w:rPr>
-          <w:iCs/>
-          <w:i/>
-          <w:sz w:val="20"/>
-        </w:rPr>
-        <w:t xml:space="preserve"> </w:t>
-      </w:r>
-      <w:r>
-        <w:rPr>
-          <w:iCs/>
-          <w:i/>
-          <w:sz w:val="20"/>
-        </w:rPr>
-        <w:t xml:space="preserve">(2.9 °C). Median</w:t>
-      </w:r>
-      <w:r>
-        <w:rPr>
-          <w:iCs/>
-          <w:i/>
-          <w:sz w:val="20"/>
-        </w:rPr>
-        <w:t xml:space="preserve"> </w:t>
-      </w:r>
-      <w:r>
-        <w:rPr>
-          <w:iCs/>
-          <w:i/>
-          <w:sz w:val="20"/>
-        </w:rPr>
-        <w:t xml:space="preserve">of five climate models, with the 5–95 % model range in brackets; the tool flags results after 2060 as</w:t>
-      </w:r>
-      <w:r>
-        <w:rPr>
-          <w:iCs/>
-          <w:i/>
-          <w:sz w:val="20"/>
-        </w:rPr>
-        <w:t xml:space="preserve"> </w:t>
-      </w:r>
-      <w:r>
-        <w:rPr>
-          <w:iCs/>
-          <w:i/>
-          <w:sz w:val="20"/>
-        </w:rPr>
-        <w:t xml:space="preserve">indicative.</w:t>
+        <w:t xml:space="preserve">Table 1. Projected change in three climate impacts for Niger</w:t>
       </w:r>
     </w:p>
     <w:tbl>
@@ -595,11 +509,12 @@
         <w:tblLayout w:type="fixed"/>
       </w:tblPr>
       <w:tblGrid>
-        <w:gridCol w:w="1360"/>
-        <w:gridCol w:w="793"/>
-        <w:gridCol w:w="1332"/>
-        <w:gridCol w:w="1332"/>
-        <w:gridCol w:w="4252"/>
+        <w:gridCol w:w="2494"/>
+        <w:gridCol w:w="1020"/>
+        <w:gridCol w:w="1389"/>
+        <w:gridCol w:w="1389"/>
+        <w:gridCol w:w="1389"/>
+        <w:gridCol w:w="1389"/>
       </w:tblGrid>
       <w:tr>
         <w:trPr>
@@ -607,7 +522,7 @@
         </w:trPr>
         <w:tc>
           <w:tcPr>
-            <w:tcW w:type="dxa" w:w="1361"/>
+            <w:tcW w:type="dxa" w:w="2494"/>
             <w:tcBorders>
               <w:bottom w:val="single" w:sz="6" w:color="000000"/>
             </w:tcBorders>
@@ -631,7 +546,7 @@
         </w:tc>
         <w:tc>
           <w:tcPr>
-            <w:tcW w:type="dxa" w:w="794"/>
+            <w:tcW w:type="dxa" w:w="1020"/>
             <w:tcBorders>
               <w:bottom w:val="single" w:sz="6" w:color="000000"/>
             </w:tcBorders>
@@ -655,7 +570,7 @@
         </w:tc>
         <w:tc>
           <w:tcPr>
-            <w:tcW w:type="dxa" w:w="1332"/>
+            <w:tcW w:type="dxa" w:w="1389"/>
             <w:tcBorders>
               <w:bottom w:val="single" w:sz="6" w:color="000000"/>
             </w:tcBorders>
@@ -673,13 +588,13 @@
                 <w:b/>
                 <w:sz w:val="20"/>
               </w:rPr>
-              <w:t xml:space="preserve">Below 2 °C</w:t>
+              <w:t xml:space="preserve">2050, below 2 °C</w:t>
             </w:r>
           </w:p>
         </w:tc>
         <w:tc>
           <w:tcPr>
-            <w:tcW w:type="dxa" w:w="1332"/>
+            <w:tcW w:type="dxa" w:w="1389"/>
             <w:tcBorders>
               <w:bottom w:val="single" w:sz="6" w:color="000000"/>
             </w:tcBorders>
@@ -697,13 +612,13 @@
                 <w:b/>
                 <w:sz w:val="20"/>
               </w:rPr>
-              <w:t xml:space="preserve">Current policies</w:t>
+              <w:t xml:space="preserve">2050, current policies</w:t>
             </w:r>
           </w:p>
         </w:tc>
         <w:tc>
           <w:tcPr>
-            <w:tcW w:type="dxa" w:w="4252"/>
+            <w:tcW w:type="dxa" w:w="1389"/>
             <w:tcBorders>
               <w:bottom w:val="single" w:sz="6" w:color="000000"/>
             </w:tcBorders>
@@ -712,7 +627,7 @@
             <w:pPr>
               <w:pStyle w:val="Compact"/>
               <w:spacing w:after="20" w:before="20" w:line="240" w:lineRule="auto"/>
-              <w:jc w:val="left"/>
+              <w:jc w:val="center"/>
             </w:pPr>
             <w:r>
               <w:rPr>
@@ -721,7 +636,31 @@
                 <w:b/>
                 <w:sz w:val="20"/>
               </w:rPr>
-              <w:t xml:space="preserve">Why it matters for Niger</w:t>
+              <w:t xml:space="preserve">2100, below 2 °C</w:t>
+            </w:r>
+          </w:p>
+        </w:tc>
+        <w:tc>
+          <w:tcPr>
+            <w:tcW w:type="dxa" w:w="1389"/>
+            <w:tcBorders>
+              <w:bottom w:val="single" w:sz="6" w:color="000000"/>
+            </w:tcBorders>
+          </w:tcPr>
+          <w:p>
+            <w:pPr>
+              <w:pStyle w:val="Compact"/>
+              <w:spacing w:after="20" w:before="20" w:line="240" w:lineRule="auto"/>
+              <w:jc w:val="center"/>
+            </w:pPr>
+            <w:r>
+              <w:rPr>
+                <w:bCs/>
+                <w:rFonts w:ascii="Times New Roman" w:hAnsi="Times New Roman"/>
+                <w:b/>
+                <w:sz w:val="20"/>
+              </w:rPr>
+              <w:t xml:space="preserve">2100, current policies</w:t>
             </w:r>
           </w:p>
         </w:tc>
@@ -729,7 +668,7 @@
       <w:tr>
         <w:tc>
           <w:tcPr>
-            <w:tcW w:type="dxa" w:w="1361"/>
+            <w:tcW w:type="dxa" w:w="2494"/>
           </w:tcPr>
           <w:p>
             <w:pPr>
@@ -739,34 +678,16 @@
             </w:pPr>
             <w:r>
               <w:rPr>
-                <w:bCs/>
-                <w:rFonts w:ascii="Times New Roman" w:hAnsi="Times New Roman"/>
-                <w:b/>
-                <w:sz w:val="20"/>
-              </w:rPr>
-              <w:t xml:space="preserve">1. Dangerous heat</w:t>
-            </w:r>
-            <w:r>
-              <w:rPr>
-                <w:rFonts w:ascii="Times New Roman" w:hAnsi="Times New Roman"/>
-                <w:sz w:val="20"/>
-              </w:rPr>
-              <w:br/>
-            </w:r>
-            <w:r>
-              <w:rPr>
-                <w:iCs/>
-                <w:rFonts w:ascii="Times New Roman" w:hAnsi="Times New Roman"/>
-                <w:i/>
-                <w:sz w:val="20"/>
-              </w:rPr>
-              <w:t xml:space="preserve">Days per year with a heat index above 40 °C</w:t>
+                <w:rFonts w:ascii="Times New Roman" w:hAnsi="Times New Roman"/>
+                <w:sz w:val="20"/>
+              </w:rPr>
+              <w:t xml:space="preserve">Dangerous heat (days per year with heat index above 40 °C)</w:t>
             </w:r>
           </w:p>
         </w:tc>
         <w:tc>
           <w:tcPr>
-            <w:tcW w:type="dxa" w:w="794"/>
+            <w:tcW w:type="dxa" w:w="1020"/>
           </w:tcPr>
           <w:p>
             <w:pPr>
@@ -776,12 +697,10 @@
             </w:pPr>
             <w:r>
               <w:rPr>
-                <w:bCs/>
-                <w:rFonts w:ascii="Times New Roman" w:hAnsi="Times New Roman"/>
-                <w:b/>
-                <w:sz w:val="20"/>
-              </w:rPr>
-              <w:t xml:space="preserve">31 days</w:t>
+                <w:rFonts w:ascii="Times New Roman" w:hAnsi="Times New Roman"/>
+                <w:sz w:val="20"/>
+              </w:rPr>
+              <w:t xml:space="preserve">31</w:t>
             </w:r>
             <w:r>
               <w:rPr>
@@ -801,7 +720,7 @@
         </w:tc>
         <w:tc>
           <w:tcPr>
-            <w:tcW w:type="dxa" w:w="1332"/>
+            <w:tcW w:type="dxa" w:w="1389"/>
           </w:tcPr>
           <w:p>
             <w:pPr>
@@ -814,22 +733,6 @@
                 <w:rFonts w:ascii="Times New Roman" w:hAnsi="Times New Roman"/>
                 <w:sz w:val="20"/>
               </w:rPr>
-              <w:t xml:space="preserve">2050:</w:t>
-            </w:r>
-            <w:r>
-              <w:rPr>
-                <w:rFonts w:ascii="Times New Roman" w:hAnsi="Times New Roman"/>
-                <w:sz w:val="20"/>
-              </w:rPr>
-              <w:t xml:space="preserve"> </w:t>
-            </w:r>
-            <w:r>
-              <w:rPr>
-                <w:bCs/>
-                <w:rFonts w:ascii="Times New Roman" w:hAnsi="Times New Roman"/>
-                <w:b/>
-                <w:sz w:val="20"/>
-              </w:rPr>
               <w:t xml:space="preserve">45</w:t>
             </w:r>
             <w:r>
@@ -845,56 +748,12 @@
                 <w:sz w:val="20"/>
               </w:rPr>
               <w:t xml:space="preserve">[33–69]</w:t>
-            </w:r>
-            <w:r>
-              <w:rPr>
-                <w:rFonts w:ascii="Times New Roman" w:hAnsi="Times New Roman"/>
-                <w:sz w:val="20"/>
-              </w:rPr>
-              <w:br/>
-            </w:r>
-            <w:r>
-              <w:rPr>
-                <w:rFonts w:ascii="Times New Roman" w:hAnsi="Times New Roman"/>
-                <w:sz w:val="20"/>
-              </w:rPr>
-              <w:t xml:space="preserve">2100:</w:t>
-            </w:r>
-            <w:r>
-              <w:rPr>
-                <w:rFonts w:ascii="Times New Roman" w:hAnsi="Times New Roman"/>
-                <w:sz w:val="20"/>
-              </w:rPr>
-              <w:t xml:space="preserve"> </w:t>
-            </w:r>
-            <w:r>
-              <w:rPr>
-                <w:bCs/>
-                <w:rFonts w:ascii="Times New Roman" w:hAnsi="Times New Roman"/>
-                <w:b/>
-                <w:sz w:val="20"/>
-              </w:rPr>
-              <w:t xml:space="preserve">42</w:t>
-            </w:r>
-            <w:r>
-              <w:rPr>
-                <w:rFonts w:ascii="Times New Roman" w:hAnsi="Times New Roman"/>
-                <w:sz w:val="20"/>
-              </w:rPr>
-              <w:br/>
-            </w:r>
-            <w:r>
-              <w:rPr>
-                <w:rFonts w:ascii="Times New Roman" w:hAnsi="Times New Roman"/>
-                <w:sz w:val="20"/>
-              </w:rPr>
-              <w:t xml:space="preserve">[29–72]</w:t>
             </w:r>
           </w:p>
         </w:tc>
         <w:tc>
           <w:tcPr>
-            <w:tcW w:type="dxa" w:w="1332"/>
+            <w:tcW w:type="dxa" w:w="1389"/>
           </w:tcPr>
           <w:p>
             <w:pPr>
@@ -907,22 +766,6 @@
                 <w:rFonts w:ascii="Times New Roman" w:hAnsi="Times New Roman"/>
                 <w:sz w:val="20"/>
               </w:rPr>
-              <w:t xml:space="preserve">2050:</w:t>
-            </w:r>
-            <w:r>
-              <w:rPr>
-                <w:rFonts w:ascii="Times New Roman" w:hAnsi="Times New Roman"/>
-                <w:sz w:val="20"/>
-              </w:rPr>
-              <w:t xml:space="preserve"> </w:t>
-            </w:r>
-            <w:r>
-              <w:rPr>
-                <w:bCs/>
-                <w:rFonts w:ascii="Times New Roman" w:hAnsi="Times New Roman"/>
-                <w:b/>
-                <w:sz w:val="20"/>
-              </w:rPr>
               <w:t xml:space="preserve">54</w:t>
             </w:r>
             <w:r>
@@ -938,56 +781,80 @@
                 <w:sz w:val="20"/>
               </w:rPr>
               <w:t xml:space="preserve">[41–84]</w:t>
-            </w:r>
-            <w:r>
-              <w:rPr>
-                <w:rFonts w:ascii="Times New Roman" w:hAnsi="Times New Roman"/>
-                <w:sz w:val="20"/>
-              </w:rPr>
-              <w:br/>
-            </w:r>
-            <w:r>
-              <w:rPr>
-                <w:rFonts w:ascii="Times New Roman" w:hAnsi="Times New Roman"/>
-                <w:sz w:val="20"/>
-              </w:rPr>
-              <w:t xml:space="preserve">2100:</w:t>
-            </w:r>
-            <w:r>
-              <w:rPr>
-                <w:rFonts w:ascii="Times New Roman" w:hAnsi="Times New Roman"/>
-                <w:sz w:val="20"/>
-              </w:rPr>
-              <w:t xml:space="preserve"> </w:t>
-            </w:r>
-            <w:r>
-              <w:rPr>
-                <w:bCs/>
-                <w:rFonts w:ascii="Times New Roman" w:hAnsi="Times New Roman"/>
-                <w:b/>
-                <w:sz w:val="20"/>
-              </w:rPr>
-              <w:t xml:space="preserve">91</w:t>
-            </w:r>
-            <w:r>
-              <w:rPr>
-                <w:rFonts w:ascii="Times New Roman" w:hAnsi="Times New Roman"/>
-                <w:sz w:val="20"/>
-              </w:rPr>
-              <w:br/>
-            </w:r>
-            <w:r>
-              <w:rPr>
-                <w:rFonts w:ascii="Times New Roman" w:hAnsi="Times New Roman"/>
-                <w:sz w:val="20"/>
-              </w:rPr>
-              <w:t xml:space="preserve">[59–134]</w:t>
             </w:r>
           </w:p>
         </w:tc>
         <w:tc>
           <w:tcPr>
-            <w:tcW w:type="dxa" w:w="4252"/>
+            <w:tcW w:type="dxa" w:w="1389"/>
+          </w:tcPr>
+          <w:p>
+            <w:pPr>
+              <w:pStyle w:val="Compact"/>
+              <w:spacing w:after="20" w:before="20" w:line="240" w:lineRule="auto"/>
+              <w:jc w:val="center"/>
+            </w:pPr>
+            <w:r>
+              <w:rPr>
+                <w:rFonts w:ascii="Times New Roman" w:hAnsi="Times New Roman"/>
+                <w:sz w:val="20"/>
+              </w:rPr>
+              <w:t xml:space="preserve">42</w:t>
+            </w:r>
+            <w:r>
+              <w:rPr>
+                <w:rFonts w:ascii="Times New Roman" w:hAnsi="Times New Roman"/>
+                <w:sz w:val="20"/>
+              </w:rPr>
+              <w:br/>
+            </w:r>
+            <w:r>
+              <w:rPr>
+                <w:rFonts w:ascii="Times New Roman" w:hAnsi="Times New Roman"/>
+                <w:sz w:val="20"/>
+              </w:rPr>
+              <w:t xml:space="preserve">[29–72]</w:t>
+            </w:r>
+          </w:p>
+        </w:tc>
+        <w:tc>
+          <w:tcPr>
+            <w:tcW w:type="dxa" w:w="1389"/>
+          </w:tcPr>
+          <w:p>
+            <w:pPr>
+              <w:pStyle w:val="Compact"/>
+              <w:spacing w:after="20" w:before="20" w:line="240" w:lineRule="auto"/>
+              <w:jc w:val="center"/>
+            </w:pPr>
+            <w:r>
+              <w:rPr>
+                <w:rFonts w:ascii="Times New Roman" w:hAnsi="Times New Roman"/>
+                <w:sz w:val="20"/>
+              </w:rPr>
+              <w:t xml:space="preserve">91</w:t>
+            </w:r>
+            <w:r>
+              <w:rPr>
+                <w:rFonts w:ascii="Times New Roman" w:hAnsi="Times New Roman"/>
+                <w:sz w:val="20"/>
+              </w:rPr>
+              <w:br/>
+            </w:r>
+            <w:r>
+              <w:rPr>
+                <w:rFonts w:ascii="Times New Roman" w:hAnsi="Times New Roman"/>
+                <w:sz w:val="20"/>
+              </w:rPr>
+              <w:t xml:space="preserve">[59–134]</w:t>
+            </w:r>
+          </w:p>
+        </w:tc>
+      </w:tr>
+      <w:tr>
+        <w:tc>
+          <w:tcPr>
+            <w:tcW w:type="dxa" w:w="2494"/>
           </w:tcPr>
           <w:p>
             <w:pPr>
@@ -1000,78 +867,172 @@
                 <w:rFonts w:ascii="Times New Roman" w:hAnsi="Times New Roman"/>
                 <w:sz w:val="20"/>
               </w:rPr>
-              <w:t xml:space="preserve">Beyond this threshold, sustained physical work exposes people to heat exhaustion and heat stroke, yet most</w:t>
-            </w:r>
-            <w:r>
-              <w:rPr>
-                <w:rFonts w:ascii="Times New Roman" w:hAnsi="Times New Roman"/>
-                <w:sz w:val="20"/>
-              </w:rPr>
-              <w:t xml:space="preserve"> </w:t>
-            </w:r>
-            <w:r>
-              <w:rPr>
-                <w:rFonts w:ascii="Times New Roman" w:hAnsi="Times New Roman"/>
-                <w:sz w:val="20"/>
-              </w:rPr>
-              <w:t xml:space="preserve">Nigeriens farm, herd or build outdoors with little access to cooling. The tool’s maps show the increase is about</w:t>
-            </w:r>
-            <w:r>
-              <w:rPr>
-                <w:rFonts w:ascii="Times New Roman" w:hAnsi="Times New Roman"/>
-                <w:sz w:val="20"/>
-              </w:rPr>
-              <w:t xml:space="preserve"> </w:t>
-            </w:r>
-            <w:r>
-              <w:rPr>
-                <w:rFonts w:ascii="Times New Roman" w:hAnsi="Times New Roman"/>
-                <w:sz w:val="20"/>
-              </w:rPr>
-              <w:t xml:space="preserve">twice as large in the densely populated south as in the north (+44 versus +21 days at 2 °C compared with</w:t>
-            </w:r>
-            <w:r>
-              <w:rPr>
-                <w:rFonts w:ascii="Times New Roman" w:hAnsi="Times New Roman"/>
-                <w:sz w:val="20"/>
-              </w:rPr>
-              <w:t xml:space="preserve"> </w:t>
-            </w:r>
-            <w:r>
-              <w:rPr>
-                <w:rFonts w:ascii="Times New Roman" w:hAnsi="Times New Roman"/>
-                <w:sz w:val="20"/>
-              </w:rPr>
-              <w:t xml:space="preserve">1 °C of global warming). WASCAL researchers already project heat discomfort for more than half of West</w:t>
-            </w:r>
-            <w:r>
-              <w:rPr>
-                <w:rFonts w:ascii="Times New Roman" w:hAnsi="Times New Roman"/>
-                <w:sz w:val="20"/>
-              </w:rPr>
-              <w:t xml:space="preserve"> </w:t>
-            </w:r>
-            <w:r>
-              <w:rPr>
-                <w:rFonts w:ascii="Times New Roman" w:hAnsi="Times New Roman"/>
-                <w:sz w:val="20"/>
-              </w:rPr>
-              <w:t xml:space="preserve">Africa’s population at 1.5–2 °C (</w:t>
-            </w:r>
-            <w:hyperlink r:id="rId24">
-              <w:r>
-                <w:rPr>
-                  <w:rStyle w:val="Hyperlink"/>
-                </w:rPr>
-                <w:t xml:space="preserve">Sylla et al., 2018</w:t>
-              </w:r>
-            </w:hyperlink>
-            <w:r>
-              <w:rPr>
-                <w:rFonts w:ascii="Times New Roman" w:hAnsi="Times New Roman"/>
-                <w:sz w:val="20"/>
-              </w:rPr>
-              <w:t xml:space="preserve">).</w:t>
+              <w:t xml:space="preserve">Severe drought (share of land with at least one month of SPEI below −1.5)</w:t>
+            </w:r>
+          </w:p>
+        </w:tc>
+        <w:tc>
+          <w:tcPr>
+            <w:tcW w:type="dxa" w:w="1020"/>
+          </w:tcPr>
+          <w:p>
+            <w:pPr>
+              <w:pStyle w:val="Compact"/>
+              <w:spacing w:after="20" w:before="20" w:line="240" w:lineRule="auto"/>
+              <w:jc w:val="center"/>
+            </w:pPr>
+            <w:r>
+              <w:rPr>
+                <w:rFonts w:ascii="Times New Roman" w:hAnsi="Times New Roman"/>
+                <w:sz w:val="20"/>
+              </w:rPr>
+              <w:t xml:space="preserve">84 %</w:t>
+            </w:r>
+            <w:r>
+              <w:rPr>
+                <w:rFonts w:ascii="Times New Roman" w:hAnsi="Times New Roman"/>
+                <w:sz w:val="20"/>
+              </w:rPr>
+              <w:br/>
+            </w:r>
+            <w:r>
+              <w:rPr>
+                <w:rFonts w:ascii="Times New Roman" w:hAnsi="Times New Roman"/>
+                <w:sz w:val="20"/>
+              </w:rPr>
+              <w:t xml:space="preserve">[72–97]</w:t>
+            </w:r>
+          </w:p>
+        </w:tc>
+        <w:tc>
+          <w:tcPr>
+            <w:tcW w:type="dxa" w:w="1389"/>
+          </w:tcPr>
+          <w:p>
+            <w:pPr>
+              <w:pStyle w:val="Compact"/>
+              <w:spacing w:after="20" w:before="20" w:line="240" w:lineRule="auto"/>
+              <w:jc w:val="center"/>
+            </w:pPr>
+            <w:r>
+              <w:rPr>
+                <w:rFonts w:ascii="Times New Roman" w:hAnsi="Times New Roman"/>
+                <w:sz w:val="20"/>
+              </w:rPr>
+              <w:t xml:space="preserve">98 %</w:t>
+            </w:r>
+            <w:r>
+              <w:rPr>
+                <w:rFonts w:ascii="Times New Roman" w:hAnsi="Times New Roman"/>
+                <w:sz w:val="20"/>
+              </w:rPr>
+              <w:br/>
+            </w:r>
+            <w:r>
+              <w:rPr>
+                <w:rFonts w:ascii="Times New Roman" w:hAnsi="Times New Roman"/>
+                <w:sz w:val="20"/>
+              </w:rPr>
+              <w:t xml:space="preserve">[85–100]</w:t>
+            </w:r>
+          </w:p>
+        </w:tc>
+        <w:tc>
+          <w:tcPr>
+            <w:tcW w:type="dxa" w:w="1389"/>
+          </w:tcPr>
+          <w:p>
+            <w:pPr>
+              <w:pStyle w:val="Compact"/>
+              <w:spacing w:after="20" w:before="20" w:line="240" w:lineRule="auto"/>
+              <w:jc w:val="center"/>
+            </w:pPr>
+            <w:r>
+              <w:rPr>
+                <w:rFonts w:ascii="Times New Roman" w:hAnsi="Times New Roman"/>
+                <w:sz w:val="20"/>
+              </w:rPr>
+              <w:t xml:space="preserve">≈100 %</w:t>
+            </w:r>
+            <w:r>
+              <w:rPr>
+                <w:rFonts w:ascii="Times New Roman" w:hAnsi="Times New Roman"/>
+                <w:sz w:val="20"/>
+              </w:rPr>
+              <w:br/>
+            </w:r>
+            <w:r>
+              <w:rPr>
+                <w:rFonts w:ascii="Times New Roman" w:hAnsi="Times New Roman"/>
+                <w:sz w:val="20"/>
+              </w:rPr>
+              <w:t xml:space="preserve">[96–100]</w:t>
+            </w:r>
+          </w:p>
+        </w:tc>
+        <w:tc>
+          <w:tcPr>
+            <w:tcW w:type="dxa" w:w="1389"/>
+          </w:tcPr>
+          <w:p>
+            <w:pPr>
+              <w:pStyle w:val="Compact"/>
+              <w:spacing w:after="20" w:before="20" w:line="240" w:lineRule="auto"/>
+              <w:jc w:val="center"/>
+            </w:pPr>
+            <w:r>
+              <w:rPr>
+                <w:rFonts w:ascii="Times New Roman" w:hAnsi="Times New Roman"/>
+                <w:sz w:val="20"/>
+              </w:rPr>
+              <w:t xml:space="preserve">98 %</w:t>
+            </w:r>
+            <w:r>
+              <w:rPr>
+                <w:rFonts w:ascii="Times New Roman" w:hAnsi="Times New Roman"/>
+                <w:sz w:val="20"/>
+              </w:rPr>
+              <w:br/>
+            </w:r>
+            <w:r>
+              <w:rPr>
+                <w:rFonts w:ascii="Times New Roman" w:hAnsi="Times New Roman"/>
+                <w:sz w:val="20"/>
+              </w:rPr>
+              <w:t xml:space="preserve">[81–100]</w:t>
+            </w:r>
+          </w:p>
+        </w:tc>
+        <w:tc>
+          <w:tcPr>
+            <w:tcW w:type="dxa" w:w="1389"/>
+          </w:tcPr>
+          <w:p>
+            <w:pPr>
+              <w:pStyle w:val="Compact"/>
+              <w:spacing w:after="20" w:before="20" w:line="240" w:lineRule="auto"/>
+              <w:jc w:val="center"/>
+            </w:pPr>
+            <w:r>
+              <w:rPr>
+                <w:rFonts w:ascii="Times New Roman" w:hAnsi="Times New Roman"/>
+                <w:sz w:val="20"/>
+              </w:rPr>
+              <w:t xml:space="preserve">100 %</w:t>
+            </w:r>
+            <w:r>
+              <w:rPr>
+                <w:rFonts w:ascii="Times New Roman" w:hAnsi="Times New Roman"/>
+                <w:sz w:val="20"/>
+              </w:rPr>
+              <w:br/>
+            </w:r>
+            <w:r>
+              <w:rPr>
+                <w:rFonts w:ascii="Times New Roman" w:hAnsi="Times New Roman"/>
+                <w:sz w:val="20"/>
+              </w:rPr>
+              <w:t xml:space="preserve">[98–100]</w:t>
             </w:r>
           </w:p>
         </w:tc>
@@ -1079,7 +1040,7 @@
       <w:tr>
         <w:tc>
           <w:tcPr>
-            <w:tcW w:type="dxa" w:w="1361"/>
+            <w:tcW w:type="dxa" w:w="2494"/>
           </w:tcPr>
           <w:p>
             <w:pPr>
@@ -1089,52 +1050,16 @@
             </w:pPr>
             <w:r>
               <w:rPr>
-                <w:bCs/>
-                <w:rFonts w:ascii="Times New Roman" w:hAnsi="Times New Roman"/>
-                <w:b/>
-                <w:sz w:val="20"/>
-              </w:rPr>
-              <w:t xml:space="preserve">2. Severe drought</w:t>
-            </w:r>
-            <w:r>
-              <w:rPr>
-                <w:rFonts w:ascii="Times New Roman" w:hAnsi="Times New Roman"/>
-                <w:sz w:val="20"/>
-              </w:rPr>
-              <w:br/>
-            </w:r>
-            <w:r>
-              <w:rPr>
-                <w:iCs/>
-                <w:rFonts w:ascii="Times New Roman" w:hAnsi="Times New Roman"/>
-                <w:i/>
-                <w:sz w:val="20"/>
-              </w:rPr>
-              <w:t xml:space="preserve">Share of land with at least one month of SPEI</w:t>
-            </w:r>
-            <w:r>
-              <w:rPr>
-                <w:iCs/>
-                <w:rFonts w:ascii="Times New Roman" w:hAnsi="Times New Roman"/>
-                <w:i/>
-                <w:sz w:val="20"/>
-              </w:rPr>
-              <w:t xml:space="preserve"> </w:t>
-            </w:r>
-            <w:r>
-              <w:rPr>
-                <w:iCs/>
-                <w:rFonts w:ascii="Times New Roman" w:hAnsi="Times New Roman"/>
-                <w:i/>
-                <w:sz w:val="20"/>
-              </w:rPr>
-              <w:t xml:space="preserve">below −1.5 (%)</w:t>
+                <w:rFonts w:ascii="Times New Roman" w:hAnsi="Times New Roman"/>
+                <w:sz w:val="20"/>
+              </w:rPr>
+              <w:t xml:space="preserve">Extreme rainfall (annual maximum 5-day rainfall, change from 1995–2014)</w:t>
             </w:r>
           </w:p>
         </w:tc>
         <w:tc>
           <w:tcPr>
-            <w:tcW w:type="dxa" w:w="794"/>
+            <w:tcW w:type="dxa" w:w="1020"/>
           </w:tcPr>
           <w:p>
             <w:pPr>
@@ -1144,12 +1069,10 @@
             </w:pPr>
             <w:r>
               <w:rPr>
-                <w:bCs/>
-                <w:rFonts w:ascii="Times New Roman" w:hAnsi="Times New Roman"/>
-                <w:b/>
-                <w:sz w:val="20"/>
-              </w:rPr>
-              <w:t xml:space="preserve">84 %</w:t>
+                <w:rFonts w:ascii="Times New Roman" w:hAnsi="Times New Roman"/>
+                <w:sz w:val="20"/>
+              </w:rPr>
+              <w:t xml:space="preserve">+8 %</w:t>
             </w:r>
             <w:r>
               <w:rPr>
@@ -1163,13 +1086,13 @@
                 <w:rFonts w:ascii="Times New Roman" w:hAnsi="Times New Roman"/>
                 <w:sz w:val="20"/>
               </w:rPr>
-              <w:t xml:space="preserve">[72–97]</w:t>
+              <w:t xml:space="preserve">[−7, +29]</w:t>
             </w:r>
           </w:p>
         </w:tc>
         <w:tc>
           <w:tcPr>
-            <w:tcW w:type="dxa" w:w="1332"/>
+            <w:tcW w:type="dxa" w:w="1389"/>
           </w:tcPr>
           <w:p>
             <w:pPr>
@@ -1182,23 +1105,7 @@
                 <w:rFonts w:ascii="Times New Roman" w:hAnsi="Times New Roman"/>
                 <w:sz w:val="20"/>
               </w:rPr>
-              <w:t xml:space="preserve">2050:</w:t>
-            </w:r>
-            <w:r>
-              <w:rPr>
-                <w:rFonts w:ascii="Times New Roman" w:hAnsi="Times New Roman"/>
-                <w:sz w:val="20"/>
-              </w:rPr>
-              <w:t xml:space="preserve"> </w:t>
-            </w:r>
-            <w:r>
-              <w:rPr>
-                <w:bCs/>
-                <w:rFonts w:ascii="Times New Roman" w:hAnsi="Times New Roman"/>
-                <w:b/>
-                <w:sz w:val="20"/>
-              </w:rPr>
-              <w:t xml:space="preserve">98 %</w:t>
+              <w:t xml:space="preserve">+18 %</w:t>
             </w:r>
             <w:r>
               <w:rPr>
@@ -1212,57 +1119,13 @@
                 <w:rFonts w:ascii="Times New Roman" w:hAnsi="Times New Roman"/>
                 <w:sz w:val="20"/>
               </w:rPr>
-              <w:t xml:space="preserve">[85–100]</w:t>
-            </w:r>
-            <w:r>
-              <w:rPr>
-                <w:rFonts w:ascii="Times New Roman" w:hAnsi="Times New Roman"/>
-                <w:sz w:val="20"/>
-              </w:rPr>
-              <w:br/>
-            </w:r>
-            <w:r>
-              <w:rPr>
-                <w:rFonts w:ascii="Times New Roman" w:hAnsi="Times New Roman"/>
-                <w:sz w:val="20"/>
-              </w:rPr>
-              <w:t xml:space="preserve">2100:</w:t>
-            </w:r>
-            <w:r>
-              <w:rPr>
-                <w:rFonts w:ascii="Times New Roman" w:hAnsi="Times New Roman"/>
-                <w:sz w:val="20"/>
-              </w:rPr>
-              <w:t xml:space="preserve"> </w:t>
-            </w:r>
-            <w:r>
-              <w:rPr>
-                <w:bCs/>
-                <w:rFonts w:ascii="Times New Roman" w:hAnsi="Times New Roman"/>
-                <w:b/>
-                <w:sz w:val="20"/>
-              </w:rPr>
-              <w:t xml:space="preserve">98 %</w:t>
-            </w:r>
-            <w:r>
-              <w:rPr>
-                <w:rFonts w:ascii="Times New Roman" w:hAnsi="Times New Roman"/>
-                <w:sz w:val="20"/>
-              </w:rPr>
-              <w:br/>
-            </w:r>
-            <w:r>
-              <w:rPr>
-                <w:rFonts w:ascii="Times New Roman" w:hAnsi="Times New Roman"/>
-                <w:sz w:val="20"/>
-              </w:rPr>
-              <w:t xml:space="preserve">[81–100]</w:t>
+              <w:t xml:space="preserve">[0, +55]</w:t>
             </w:r>
           </w:p>
         </w:tc>
         <w:tc>
           <w:tcPr>
-            <w:tcW w:type="dxa" w:w="1332"/>
+            <w:tcW w:type="dxa" w:w="1389"/>
           </w:tcPr>
           <w:p>
             <w:pPr>
@@ -1275,23 +1138,7 @@
                 <w:rFonts w:ascii="Times New Roman" w:hAnsi="Times New Roman"/>
                 <w:sz w:val="20"/>
               </w:rPr>
-              <w:t xml:space="preserve">2050:</w:t>
-            </w:r>
-            <w:r>
-              <w:rPr>
-                <w:rFonts w:ascii="Times New Roman" w:hAnsi="Times New Roman"/>
-                <w:sz w:val="20"/>
-              </w:rPr>
-              <w:t xml:space="preserve"> </w:t>
-            </w:r>
-            <w:r>
-              <w:rPr>
-                <w:bCs/>
-                <w:rFonts w:ascii="Times New Roman" w:hAnsi="Times New Roman"/>
-                <w:b/>
-                <w:sz w:val="20"/>
-              </w:rPr>
-              <w:t xml:space="preserve">≈100 %</w:t>
+              <w:t xml:space="preserve">+24 %</w:t>
             </w:r>
             <w:r>
               <w:rPr>
@@ -1305,190 +1152,13 @@
                 <w:rFonts w:ascii="Times New Roman" w:hAnsi="Times New Roman"/>
                 <w:sz w:val="20"/>
               </w:rPr>
-              <w:t xml:space="preserve">[96–100]</w:t>
-            </w:r>
-            <w:r>
-              <w:rPr>
-                <w:rFonts w:ascii="Times New Roman" w:hAnsi="Times New Roman"/>
-                <w:sz w:val="20"/>
-              </w:rPr>
-              <w:br/>
-            </w:r>
-            <w:r>
-              <w:rPr>
-                <w:rFonts w:ascii="Times New Roman" w:hAnsi="Times New Roman"/>
-                <w:sz w:val="20"/>
-              </w:rPr>
-              <w:t xml:space="preserve">2100:</w:t>
-            </w:r>
-            <w:r>
-              <w:rPr>
-                <w:rFonts w:ascii="Times New Roman" w:hAnsi="Times New Roman"/>
-                <w:sz w:val="20"/>
-              </w:rPr>
-              <w:t xml:space="preserve"> </w:t>
-            </w:r>
-            <w:r>
-              <w:rPr>
-                <w:bCs/>
-                <w:rFonts w:ascii="Times New Roman" w:hAnsi="Times New Roman"/>
-                <w:b/>
-                <w:sz w:val="20"/>
-              </w:rPr>
-              <w:t xml:space="preserve">100 %</w:t>
-            </w:r>
-            <w:r>
-              <w:rPr>
-                <w:rFonts w:ascii="Times New Roman" w:hAnsi="Times New Roman"/>
-                <w:sz w:val="20"/>
-              </w:rPr>
-              <w:br/>
-            </w:r>
-            <w:r>
-              <w:rPr>
-                <w:rFonts w:ascii="Times New Roman" w:hAnsi="Times New Roman"/>
-                <w:sz w:val="20"/>
-              </w:rPr>
-              <w:t xml:space="preserve">[98–100]</w:t>
+              <w:t xml:space="preserve">[−1, +67]</w:t>
             </w:r>
           </w:p>
         </w:tc>
         <w:tc>
           <w:tcPr>
-            <w:tcW w:type="dxa" w:w="4252"/>
-          </w:tcPr>
-          <w:p>
-            <w:pPr>
-              <w:pStyle w:val="Compact"/>
-              <w:spacing w:after="20" w:before="20" w:line="240" w:lineRule="auto"/>
-              <w:jc w:val="left"/>
-            </w:pPr>
-            <w:r>
-              <w:rPr>
-                <w:rFonts w:ascii="Times New Roman" w:hAnsi="Times New Roman"/>
-                <w:sz w:val="20"/>
-              </w:rPr>
-              <w:t xml:space="preserve">Because SPEI accounts for evaporation as well as rainfall, it captures how heat dries out soils, crops and</w:t>
-            </w:r>
-            <w:r>
-              <w:rPr>
-                <w:rFonts w:ascii="Times New Roman" w:hAnsi="Times New Roman"/>
-                <w:sz w:val="20"/>
-              </w:rPr>
-              <w:t xml:space="preserve"> </w:t>
-            </w:r>
-            <w:r>
-              <w:rPr>
-                <w:rFonts w:ascii="Times New Roman" w:hAnsi="Times New Roman"/>
-                <w:sz w:val="20"/>
-              </w:rPr>
-              <w:t xml:space="preserve">pastures. Around 96 % of the country is affected by 2030 in every scenario, so severe drought months become</w:t>
-            </w:r>
-            <w:r>
-              <w:rPr>
-                <w:rFonts w:ascii="Times New Roman" w:hAnsi="Times New Roman"/>
-                <w:sz w:val="20"/>
-              </w:rPr>
-              <w:t xml:space="preserve"> </w:t>
-            </w:r>
-            <w:r>
-              <w:rPr>
-                <w:rFonts w:ascii="Times New Roman" w:hAnsi="Times New Roman"/>
-                <w:sz w:val="20"/>
-              </w:rPr>
-              <w:t xml:space="preserve">the norm whatever the world does; only a 1.5 °C pathway brings the share back down (87 % by 2100). WASCAL</w:t>
-            </w:r>
-            <w:r>
-              <w:rPr>
-                <w:rFonts w:ascii="Times New Roman" w:hAnsi="Times New Roman"/>
-                <w:sz w:val="20"/>
-              </w:rPr>
-              <w:t xml:space="preserve"> </w:t>
-            </w:r>
-            <w:r>
-              <w:rPr>
-                <w:rFonts w:ascii="Times New Roman" w:hAnsi="Times New Roman"/>
-                <w:sz w:val="20"/>
-              </w:rPr>
-              <w:t xml:space="preserve">crop modelling projects declining millet yields in most scenarios (</w:t>
-            </w:r>
-            <w:hyperlink r:id="rId25">
-              <w:r>
-                <w:rPr>
-                  <w:rStyle w:val="Hyperlink"/>
-                </w:rPr>
-                <w:t xml:space="preserve">Mohamed et al., 2025</w:t>
-              </w:r>
-            </w:hyperlink>
-            <w:r>
-              <w:rPr>
-                <w:rFonts w:ascii="Times New Roman" w:hAnsi="Times New Roman"/>
-                <w:sz w:val="20"/>
-              </w:rPr>
-              <w:t xml:space="preserve">).</w:t>
-            </w:r>
-          </w:p>
-        </w:tc>
-      </w:tr>
-      <w:tr>
-        <w:tc>
-          <w:tcPr>
-            <w:tcW w:type="dxa" w:w="1361"/>
-          </w:tcPr>
-          <w:p>
-            <w:pPr>
-              <w:pStyle w:val="Compact"/>
-              <w:spacing w:after="20" w:before="20" w:line="240" w:lineRule="auto"/>
-              <w:jc w:val="left"/>
-            </w:pPr>
-            <w:r>
-              <w:rPr>
-                <w:bCs/>
-                <w:rFonts w:ascii="Times New Roman" w:hAnsi="Times New Roman"/>
-                <w:b/>
-                <w:sz w:val="20"/>
-              </w:rPr>
-              <w:t xml:space="preserve">3. Extreme rainfall</w:t>
-            </w:r>
-            <w:r>
-              <w:rPr>
-                <w:rFonts w:ascii="Times New Roman" w:hAnsi="Times New Roman"/>
-                <w:sz w:val="20"/>
-              </w:rPr>
-              <w:br/>
-            </w:r>
-            <w:r>
-              <w:rPr>
-                <w:iCs/>
-                <w:rFonts w:ascii="Times New Roman" w:hAnsi="Times New Roman"/>
-                <w:i/>
-                <w:sz w:val="20"/>
-              </w:rPr>
-              <w:t xml:space="preserve">Annual maximum 5-day precipitation, change from</w:t>
-            </w:r>
-            <w:r>
-              <w:rPr>
-                <w:iCs/>
-                <w:rFonts w:ascii="Times New Roman" w:hAnsi="Times New Roman"/>
-                <w:i/>
-                <w:sz w:val="20"/>
-              </w:rPr>
-              <w:t xml:space="preserve"> </w:t>
-            </w:r>
-            <w:r>
-              <w:rPr>
-                <w:iCs/>
-                <w:rFonts w:ascii="Times New Roman" w:hAnsi="Times New Roman"/>
-                <w:i/>
-                <w:sz w:val="20"/>
-              </w:rPr>
-              <w:t xml:space="preserve">1995–2014 (%)</w:t>
-            </w:r>
-          </w:p>
-        </w:tc>
-        <w:tc>
-          <w:tcPr>
-            <w:tcW w:type="dxa" w:w="794"/>
+            <w:tcW w:type="dxa" w:w="1389"/>
           </w:tcPr>
           <w:p>
             <w:pPr>
@@ -1498,12 +1168,10 @@
             </w:pPr>
             <w:r>
               <w:rPr>
-                <w:bCs/>
-                <w:rFonts w:ascii="Times New Roman" w:hAnsi="Times New Roman"/>
-                <w:b/>
-                <w:sz w:val="20"/>
-              </w:rPr>
-              <w:t xml:space="preserve">+8 %</w:t>
+                <w:rFonts w:ascii="Times New Roman" w:hAnsi="Times New Roman"/>
+                <w:sz w:val="20"/>
+              </w:rPr>
+              <w:t xml:space="preserve">+17 %</w:t>
             </w:r>
             <w:r>
               <w:rPr>
@@ -1517,13 +1185,13 @@
                 <w:rFonts w:ascii="Times New Roman" w:hAnsi="Times New Roman"/>
                 <w:sz w:val="20"/>
               </w:rPr>
-              <w:t xml:space="preserve">[−7 to +29]</w:t>
+              <w:t xml:space="preserve">[−1, +54]</w:t>
             </w:r>
           </w:p>
         </w:tc>
         <w:tc>
           <w:tcPr>
-            <w:tcW w:type="dxa" w:w="1332"/>
+            <w:tcW w:type="dxa" w:w="1389"/>
           </w:tcPr>
           <w:p>
             <w:pPr>
@@ -1536,23 +1204,7 @@
                 <w:rFonts w:ascii="Times New Roman" w:hAnsi="Times New Roman"/>
                 <w:sz w:val="20"/>
               </w:rPr>
-              <w:t xml:space="preserve">2050:</w:t>
-            </w:r>
-            <w:r>
-              <w:rPr>
-                <w:rFonts w:ascii="Times New Roman" w:hAnsi="Times New Roman"/>
-                <w:sz w:val="20"/>
-              </w:rPr>
-              <w:t xml:space="preserve"> </w:t>
-            </w:r>
-            <w:r>
-              <w:rPr>
-                <w:bCs/>
-                <w:rFonts w:ascii="Times New Roman" w:hAnsi="Times New Roman"/>
-                <w:b/>
-                <w:sz w:val="20"/>
-              </w:rPr>
-              <w:t xml:space="preserve">+18 %</w:t>
+              <w:t xml:space="preserve">+43 %</w:t>
             </w:r>
             <w:r>
               <w:rPr>
@@ -1566,220 +1218,7 @@
                 <w:rFonts w:ascii="Times New Roman" w:hAnsi="Times New Roman"/>
                 <w:sz w:val="20"/>
               </w:rPr>
-              <w:t xml:space="preserve">[0 to +55]</w:t>
-            </w:r>
-            <w:r>
-              <w:rPr>
-                <w:rFonts w:ascii="Times New Roman" w:hAnsi="Times New Roman"/>
-                <w:sz w:val="20"/>
-              </w:rPr>
-              <w:br/>
-            </w:r>
-            <w:r>
-              <w:rPr>
-                <w:rFonts w:ascii="Times New Roman" w:hAnsi="Times New Roman"/>
-                <w:sz w:val="20"/>
-              </w:rPr>
-              <w:t xml:space="preserve">2100:</w:t>
-            </w:r>
-            <w:r>
-              <w:rPr>
-                <w:rFonts w:ascii="Times New Roman" w:hAnsi="Times New Roman"/>
-                <w:sz w:val="20"/>
-              </w:rPr>
-              <w:t xml:space="preserve"> </w:t>
-            </w:r>
-            <w:r>
-              <w:rPr>
-                <w:bCs/>
-                <w:rFonts w:ascii="Times New Roman" w:hAnsi="Times New Roman"/>
-                <w:b/>
-                <w:sz w:val="20"/>
-              </w:rPr>
-              <w:t xml:space="preserve">+17 %</w:t>
-            </w:r>
-            <w:r>
-              <w:rPr>
-                <w:rFonts w:ascii="Times New Roman" w:hAnsi="Times New Roman"/>
-                <w:sz w:val="20"/>
-              </w:rPr>
-              <w:br/>
-            </w:r>
-            <w:r>
-              <w:rPr>
-                <w:rFonts w:ascii="Times New Roman" w:hAnsi="Times New Roman"/>
-                <w:sz w:val="20"/>
-              </w:rPr>
-              <w:t xml:space="preserve">[−1 to +54]</w:t>
-            </w:r>
-          </w:p>
-        </w:tc>
-        <w:tc>
-          <w:tcPr>
-            <w:tcW w:type="dxa" w:w="1332"/>
-          </w:tcPr>
-          <w:p>
-            <w:pPr>
-              <w:pStyle w:val="Compact"/>
-              <w:spacing w:after="20" w:before="20" w:line="240" w:lineRule="auto"/>
-              <w:jc w:val="center"/>
-            </w:pPr>
-            <w:r>
-              <w:rPr>
-                <w:rFonts w:ascii="Times New Roman" w:hAnsi="Times New Roman"/>
-                <w:sz w:val="20"/>
-              </w:rPr>
-              <w:t xml:space="preserve">2050:</w:t>
-            </w:r>
-            <w:r>
-              <w:rPr>
-                <w:rFonts w:ascii="Times New Roman" w:hAnsi="Times New Roman"/>
-                <w:sz w:val="20"/>
-              </w:rPr>
-              <w:t xml:space="preserve"> </w:t>
-            </w:r>
-            <w:r>
-              <w:rPr>
-                <w:bCs/>
-                <w:rFonts w:ascii="Times New Roman" w:hAnsi="Times New Roman"/>
-                <w:b/>
-                <w:sz w:val="20"/>
-              </w:rPr>
-              <w:t xml:space="preserve">+24 %</w:t>
-            </w:r>
-            <w:r>
-              <w:rPr>
-                <w:rFonts w:ascii="Times New Roman" w:hAnsi="Times New Roman"/>
-                <w:sz w:val="20"/>
-              </w:rPr>
-              <w:br/>
-            </w:r>
-            <w:r>
-              <w:rPr>
-                <w:rFonts w:ascii="Times New Roman" w:hAnsi="Times New Roman"/>
-                <w:sz w:val="20"/>
-              </w:rPr>
-              <w:t xml:space="preserve">[−1 to +67]</w:t>
-            </w:r>
-            <w:r>
-              <w:rPr>
-                <w:rFonts w:ascii="Times New Roman" w:hAnsi="Times New Roman"/>
-                <w:sz w:val="20"/>
-              </w:rPr>
-              <w:br/>
-            </w:r>
-            <w:r>
-              <w:rPr>
-                <w:rFonts w:ascii="Times New Roman" w:hAnsi="Times New Roman"/>
-                <w:sz w:val="20"/>
-              </w:rPr>
-              <w:t xml:space="preserve">2100:</w:t>
-            </w:r>
-            <w:r>
-              <w:rPr>
-                <w:rFonts w:ascii="Times New Roman" w:hAnsi="Times New Roman"/>
-                <w:sz w:val="20"/>
-              </w:rPr>
-              <w:t xml:space="preserve"> </w:t>
-            </w:r>
-            <w:r>
-              <w:rPr>
-                <w:bCs/>
-                <w:rFonts w:ascii="Times New Roman" w:hAnsi="Times New Roman"/>
-                <w:b/>
-                <w:sz w:val="20"/>
-              </w:rPr>
-              <w:t xml:space="preserve">+43 %</w:t>
-            </w:r>
-            <w:r>
-              <w:rPr>
-                <w:rFonts w:ascii="Times New Roman" w:hAnsi="Times New Roman"/>
-                <w:sz w:val="20"/>
-              </w:rPr>
-              <w:br/>
-            </w:r>
-            <w:r>
-              <w:rPr>
-                <w:rFonts w:ascii="Times New Roman" w:hAnsi="Times New Roman"/>
-                <w:sz w:val="20"/>
-              </w:rPr>
-              <w:t xml:space="preserve">[+5 to +110]</w:t>
-            </w:r>
-          </w:p>
-        </w:tc>
-        <w:tc>
-          <w:tcPr>
-            <w:tcW w:type="dxa" w:w="4252"/>
-          </w:tcPr>
-          <w:p>
-            <w:pPr>
-              <w:pStyle w:val="Compact"/>
-              <w:spacing w:after="20" w:before="20" w:line="240" w:lineRule="auto"/>
-              <w:jc w:val="left"/>
-            </w:pPr>
-            <w:r>
-              <w:rPr>
-                <w:rFonts w:ascii="Times New Roman" w:hAnsi="Times New Roman"/>
-                <w:sz w:val="20"/>
-              </w:rPr>
-              <w:t xml:space="preserve">Heavier downpours on bare, crusted soils produce the floods that strike Niamey and the Niger River valley, where</w:t>
-            </w:r>
-            <w:r>
-              <w:rPr>
-                <w:rFonts w:ascii="Times New Roman" w:hAnsi="Times New Roman"/>
-                <w:sz w:val="20"/>
-              </w:rPr>
-              <w:t xml:space="preserve"> </w:t>
-            </w:r>
-            <w:r>
-              <w:rPr>
-                <w:rFonts w:ascii="Times New Roman" w:hAnsi="Times New Roman"/>
-                <w:sz w:val="20"/>
-              </w:rPr>
-              <w:t xml:space="preserve">people, infrastructure and irrigated rice are concentrated. Under current policies, even the low end of the</w:t>
-            </w:r>
-            <w:r>
-              <w:rPr>
-                <w:rFonts w:ascii="Times New Roman" w:hAnsi="Times New Roman"/>
-                <w:sz w:val="20"/>
-              </w:rPr>
-              <w:t xml:space="preserve"> </w:t>
-            </w:r>
-            <w:r>
-              <w:rPr>
-                <w:rFonts w:ascii="Times New Roman" w:hAnsi="Times New Roman"/>
-                <w:sz w:val="20"/>
-              </w:rPr>
-              <w:t xml:space="preserve">model range shows an increase by 2100, and extreme Sahelian storms have already tripled in frequency since 1982</w:t>
-            </w:r>
-            <w:r>
-              <w:rPr>
-                <w:rFonts w:ascii="Times New Roman" w:hAnsi="Times New Roman"/>
-                <w:sz w:val="20"/>
-              </w:rPr>
-              <w:t xml:space="preserve"> </w:t>
-            </w:r>
-            <w:r>
-              <w:rPr>
-                <w:rFonts w:ascii="Times New Roman" w:hAnsi="Times New Roman"/>
-                <w:sz w:val="20"/>
-              </w:rPr>
-              <w:t xml:space="preserve">(</w:t>
-            </w:r>
-            <w:hyperlink r:id="rId26">
-              <w:r>
-                <w:rPr>
-                  <w:rStyle w:val="Hyperlink"/>
-                </w:rPr>
-                <w:t xml:space="preserve">Taylor et al., 2017</w:t>
-              </w:r>
-            </w:hyperlink>
-            <w:r>
-              <w:rPr>
-                <w:rFonts w:ascii="Times New Roman" w:hAnsi="Times New Roman"/>
-                <w:sz w:val="20"/>
-              </w:rPr>
-              <w:t xml:space="preserve">).</w:t>
+              <w:t xml:space="preserve">[+5, +110]</w:t>
             </w:r>
           </w:p>
         </w:tc>
@@ -1787,6 +1226,46 @@
     </w:tbl>
     <w:p>
       <w:pPr>
+        <w:pStyle w:val="BodyText"/>
+        <w:spacing w:line="240" w:lineRule="auto"/>
+      </w:pPr>
+      <w:r>
+        <w:rPr>
+          <w:iCs/>
+          <w:i/>
+          <w:sz w:val="20"/>
+        </w:rPr>
+        <w:t xml:space="preserve">Source:</w:t>
+      </w:r>
+      <w:r>
+        <w:rPr>
+          <w:iCs/>
+          <w:i/>
+          <w:sz w:val="20"/>
+        </w:rPr>
+        <w:t xml:space="preserve"> </w:t>
+      </w:r>
+      <w:hyperlink r:id="rId27">
+        <w:r>
+          <w:rPr>
+            <w:rStyle w:val="Hyperlink"/>
+            <w:iCs/>
+            <w:i/>
+          </w:rPr>
+          <w:t xml:space="preserve">Climate Impact Explorer</w:t>
+        </w:r>
+      </w:hyperlink>
+      <w:r>
+        <w:rPr>
+          <w:iCs/>
+          <w:i/>
+          <w:sz w:val="20"/>
+        </w:rPr>
+        <w:t xml:space="preserve">, Niger; NGFS scenarios (1.6 °C and 2.9 °C of warming in 2100); model median, 5–95 % range in brackets; values after 2060 indicative.</w:t>
+      </w:r>
+    </w:p>
+    <w:p>
+      <w:pPr>
         <w:pStyle w:val="CaptionedFigure"/>
       </w:pPr>
       <w:r>
@@ -1794,18 +1273,18 @@
           <wp:inline>
             <wp:extent cx="5334000" cy="2482040"/>
             <wp:effectExtent b="0" l="0" r="0" t="0"/>
-            <wp:docPr descr="" title="" id="28" name="Picture"/>
+            <wp:docPr descr="" title="" id="29" name="Picture"/>
             <a:graphic>
               <a:graphicData uri="http://schemas.openxmlformats.org/drawingml/2006/picture">
                 <pic:pic>
                   <pic:nvPicPr>
-                    <pic:cNvPr descr="cie_figure.png" id="29" name="Picture"/>
+                    <pic:cNvPr descr="cie_figure.png" id="30" name="Picture"/>
                     <pic:cNvPicPr>
                       <a:picLocks noChangeArrowheads="1" noChangeAspect="1"/>
                     </pic:cNvPicPr>
                   </pic:nvPicPr>
                   <pic:blipFill>
-                    <a:blip r:embed="rId27"/>
+                    <a:blip r:embed="rId28"/>
                     <a:stretch>
                       <a:fillRect/>
                     </a:stretch>
@@ -1843,50 +1322,36 @@
           <w:bCs/>
           <w:b/>
         </w:rPr>
-        <w:t xml:space="preserve">Figure 1. Days of dangerous heat per year in Niger: the gap between the two curves is</w:t>
-      </w:r>
-      <w:r>
-        <w:rPr>
-          <w:bCs/>
-          <w:b/>
-        </w:rPr>
-        <w:t xml:space="preserve"> </w:t>
-      </w:r>
-      <w:r>
-        <w:rPr>
-          <w:bCs/>
-          <w:b/>
-        </w:rPr>
-        <w:t xml:space="preserve">what limiting warming saves.</w:t>
-      </w:r>
-      <w:r>
-        <w:t xml:space="preserve"> </w:t>
-      </w:r>
-      <w:r>
-        <w:t xml:space="preserve">The two pathways are identical until about 2030 and then diverge. By 2100,</w:t>
-      </w:r>
-      <w:r>
-        <w:t xml:space="preserve"> </w:t>
-      </w:r>
-      <w:r>
-        <w:t xml:space="preserve">current policies (blue) lead to about 91 days a year, against 42 below 2 °C (green) and 31 today. The shaded</w:t>
-      </w:r>
-      <w:r>
-        <w:t xml:space="preserve"> </w:t>
-      </w:r>
-      <w:r>
-        <w:t xml:space="preserve">uncertainty bands overlap, yet even the low end of the current-policies range (59 days) exceeds the central</w:t>
-      </w:r>
-      <w:r>
-        <w:t xml:space="preserve"> </w:t>
-      </w:r>
-      <w:r>
-        <w:t xml:space="preserve">below-2 °C estimate. Hatched area: results after 2060 are indicative. Source:</w:t>
-      </w:r>
-      <w:r>
-        <w:t xml:space="preserve"> </w:t>
-      </w:r>
-      <w:hyperlink r:id="rId23">
+        <w:t xml:space="preserve">Figure 1. Days of dangerous heat per year in Niger.</w:t>
+      </w:r>
+      <w:r>
+        <w:t xml:space="preserve"> </w:t>
+      </w:r>
+      <w:r>
+        <w:t xml:space="preserve">The two pathways separate after 2030.</w:t>
+      </w:r>
+      <w:r>
+        <w:t xml:space="preserve"> </w:t>
+      </w:r>
+      <w:r>
+        <w:t xml:space="preserve">In 2100, current policies lead to about 91 days a year, against 42 below 2 °C and 31 today. The low end of</w:t>
+      </w:r>
+      <w:r>
+        <w:t xml:space="preserve"> </w:t>
+      </w:r>
+      <w:r>
+        <w:t xml:space="preserve">the current-policies range (59 days) is above the central below-2 °C value. Results after 2060 (hatched)</w:t>
+      </w:r>
+      <w:r>
+        <w:t xml:space="preserve"> </w:t>
+      </w:r>
+      <w:r>
+        <w:t xml:space="preserve">are indicative. Source:</w:t>
+      </w:r>
+      <w:r>
+        <w:t xml:space="preserve"> </w:t>
+      </w:r>
+      <w:hyperlink r:id="rId27">
         <w:r>
           <w:rPr>
             <w:rStyle w:val="Hyperlink"/>
@@ -1895,79 +1360,65 @@
         </w:r>
       </w:hyperlink>
       <w:r>
-        <w:t xml:space="preserve">, Climate Analytics</w:t>
-      </w:r>
-      <w:r>
-        <w:t xml:space="preserve"> </w:t>
-      </w:r>
-      <w:r>
-        <w:t xml:space="preserve">(ISIMIP data).</w:t>
+        <w:t xml:space="preserve">, Climate Analytics.</w:t>
       </w:r>
     </w:p>
-    <w:bookmarkEnd w:id="30"/>
-    <w:bookmarkStart w:id="32" w:name="Xffbbd2a5976d1f58f4ba17879975b42208e7042"/>
+    <w:bookmarkEnd w:id="31"/>
+    <w:bookmarkStart w:id="33" w:name="c.-assessment"/>
     <w:p>
       <w:pPr>
         <w:pStyle w:val="Heading1"/>
       </w:pPr>
       <w:r>
-        <w:t xml:space="preserve">3. What limiting warming would change for Niger</w:t>
+        <w:t xml:space="preserve">C. Assessment</w:t>
       </w:r>
     </w:p>
     <w:p>
       <w:pPr>
-        <w:pStyle w:val="FirstParagraph"/>
-      </w:pPr>
-      <w:r>
-        <w:rPr>
-          <w:bCs/>
-          <w:b/>
-        </w:rPr>
-        <w:t xml:space="preserve">The gains are large and concentrated where people live.</w:t>
-      </w:r>
-      <w:r>
-        <w:t xml:space="preserve"> </w:t>
-      </w:r>
-      <w:r>
-        <w:t xml:space="preserve">Compared with current policies, a</w:t>
-      </w:r>
-      <w:r>
-        <w:t xml:space="preserve"> </w:t>
-      </w:r>
-      <w:r>
-        <w:t xml:space="preserve">below-2 °C world would spare Niger about 49 days of dangerous heat a year by 2100, nearly two months in</w:t>
-      </w:r>
-      <w:r>
-        <w:t xml:space="preserve"> </w:t>
-      </w:r>
-      <w:r>
-        <w:t xml:space="preserve">which outdoor work, livestock and health are at risk, and would cut the intensification of extreme rainfall</w:t>
-      </w:r>
-      <w:r>
-        <w:t xml:space="preserve"> </w:t>
-      </w:r>
-      <w:r>
-        <w:t xml:space="preserve">from +43 % to +17 %. A 1.5 °C pathway would go further, holding dangerous-heat days near today’s level</w:t>
-      </w:r>
-      <w:r>
-        <w:t xml:space="preserve"> </w:t>
-      </w:r>
-      <w:r>
-        <w:t xml:space="preserve">(32 a year by 2100). The economic stakes are of the same order: climate change could reduce Niger’s annual GDP</w:t>
-      </w:r>
-      <w:r>
-        <w:t xml:space="preserve"> </w:t>
-      </w:r>
-      <w:r>
-        <w:t xml:space="preserve">by 2.2 % in a wet, optimistic scenario and by 11.9 % in a dry, pessimistic one by 2050, before counting</w:t>
-      </w:r>
-      <w:r>
-        <w:t xml:space="preserve"> </w:t>
-      </w:r>
-      <w:r>
-        <w:t xml:space="preserve">migration or conflict (</w:t>
-      </w:r>
-      <w:hyperlink r:id="rId31">
+        <w:numPr>
+          <w:ilvl w:val="0"/>
+          <w:numId w:val="1003"/>
+        </w:numPr>
+      </w:pPr>
+      <w:r>
+        <w:t xml:space="preserve">Limiting warming below 2 °C avoids about 49 days of dangerous heat a year by 2100. It also cuts the</w:t>
+      </w:r>
+      <w:r>
+        <w:t xml:space="preserve"> </w:t>
+      </w:r>
+      <w:r>
+        <w:t xml:space="preserve">rise in extreme rainfall from 43 % to 17 %. A 1.5 °C pathway keeps heat near today’s level</w:t>
+      </w:r>
+      <w:r>
+        <w:t xml:space="preserve"> </w:t>
+      </w:r>
+      <w:r>
+        <w:t xml:space="preserve">(32 days a year by 2100).</w:t>
+      </w:r>
+    </w:p>
+    <w:p>
+      <w:pPr>
+        <w:numPr>
+          <w:ilvl w:val="0"/>
+          <w:numId w:val="1003"/>
+        </w:numPr>
+      </w:pPr>
+      <w:r>
+        <w:t xml:space="preserve">The economic cost is high. Climate change could reduce Niger’s annual GDP by 2.2 % in a wet scenario</w:t>
+      </w:r>
+      <w:r>
+        <w:t xml:space="preserve"> </w:t>
+      </w:r>
+      <w:r>
+        <w:t xml:space="preserve">and by 11.9 % in a dry scenario by 2050. These estimates exclude migration and conflict</w:t>
+      </w:r>
+      <w:r>
+        <w:t xml:space="preserve"> </w:t>
+      </w:r>
+      <w:r>
+        <w:t xml:space="preserve">(</w:t>
+      </w:r>
+      <w:hyperlink r:id="rId32">
         <w:r>
           <w:rPr>
             <w:rStyle w:val="Hyperlink"/>
@@ -1981,194 +1432,178 @@
     </w:p>
     <w:p>
       <w:pPr>
-        <w:pStyle w:val="BodyText"/>
-      </w:pPr>
-      <w:r>
-        <w:rPr>
-          <w:bCs/>
-          <w:b/>
-        </w:rPr>
-        <w:t xml:space="preserve">Drought makes adaptation urgent in every scenario.</w:t>
-      </w:r>
-      <w:r>
-        <w:t xml:space="preserve"> </w:t>
-      </w:r>
-      <w:r>
-        <w:t xml:space="preserve">Because severe drought months spread to almost the</w:t>
-      </w:r>
-      <w:r>
-        <w:t xml:space="preserve"> </w:t>
-      </w:r>
-      <w:r>
-        <w:t xml:space="preserve">whole country by 2030 regardless of emissions, adaptation cannot wait for the outcome of negotiations:</w:t>
-      </w:r>
-      <w:r>
-        <w:t xml:space="preserve"> </w:t>
-      </w:r>
-      <w:r>
-        <w:t xml:space="preserve">drought-tolerant millet and sorghum, water harvesting, early warning and the protection of herders’ mobility</w:t>
-      </w:r>
-      <w:r>
-        <w:t xml:space="preserve"> </w:t>
-      </w:r>
-      <w:r>
-        <w:t xml:space="preserve">are needed now. The danger lies in a cascade rather than a single number: a hot, dry year → failed</w:t>
-      </w:r>
-      <w:r>
-        <w:t xml:space="preserve"> </w:t>
-      </w:r>
-      <w:r>
-        <w:t xml:space="preserve">harvests and pastures → higher grain prices and distress sales of livestock →</w:t>
-      </w:r>
-      <w:r>
-        <w:t xml:space="preserve"> </w:t>
-      </w:r>
-      <w:r>
-        <w:t xml:space="preserve">malnutrition, household debt and farmer–herder tensions → emergency spending that crowds out</w:t>
-      </w:r>
-      <w:r>
-        <w:t xml:space="preserve"> </w:t>
-      </w:r>
-      <w:r>
-        <w:t xml:space="preserve">investment. Every tenth of a degree avoided makes such years rarer and the adaptation bill smaller.</w:t>
+        <w:numPr>
+          <w:ilvl w:val="0"/>
+          <w:numId w:val="1003"/>
+        </w:numPr>
+      </w:pPr>
+      <w:r>
+        <w:t xml:space="preserve">Drought increases in all scenarios. A dry year reduces harvests and pastures, raises grain prices and</w:t>
+      </w:r>
+      <w:r>
+        <w:t xml:space="preserve"> </w:t>
+      </w:r>
+      <w:r>
+        <w:t xml:space="preserve">forces sales of livestock. This leads to malnutrition, debt and tension between farmers and herders.</w:t>
+      </w:r>
+      <w:r>
+        <w:t xml:space="preserve"> </w:t>
+      </w:r>
+      <w:r>
+        <w:t xml:space="preserve">Adaptation is therefore needed now, whatever the outcome of the negotiations.</w:t>
+      </w:r>
+    </w:p>
+    <w:bookmarkEnd w:id="33"/>
+    <w:bookmarkStart w:id="34" w:name="d.-recommendations"/>
+    <w:p>
+      <w:pPr>
+        <w:pStyle w:val="Heading1"/>
+      </w:pPr>
+      <w:r>
+        <w:t xml:space="preserve">D. Recommendations</w:t>
       </w:r>
     </w:p>
     <w:p>
       <w:pPr>
-        <w:pStyle w:val="KeyBoxTitle"/>
-      </w:pPr>
-      <w:r>
-        <w:rPr>
-          <w:bCs/>
-          <w:b/>
-        </w:rPr>
-        <w:t xml:space="preserve">Recommended negotiating position</w:t>
+        <w:numPr>
+          <w:ilvl w:val="0"/>
+          <w:numId w:val="1004"/>
+        </w:numPr>
+      </w:pPr>
+      <w:r>
+        <w:t xml:space="preserve">Support the 1.5 °C goal. Ask major emitters for national plans consistent with a rapid phase-out of</w:t>
+      </w:r>
+      <w:r>
+        <w:t xml:space="preserve"> </w:t>
+      </w:r>
+      <w:r>
+        <w:t xml:space="preserve">fossil fuels.</w:t>
       </w:r>
     </w:p>
     <w:p>
       <w:pPr>
         <w:numPr>
           <w:ilvl w:val="0"/>
-          <w:numId w:val="1002"/>
+          <w:numId w:val="1004"/>
         </w:numPr>
-        <w:pStyle w:val="KeyBox"/>
-      </w:pPr>
-      <w:r>
-        <w:t xml:space="preserve">Defend the 1.5 °C goal, the only pathway that keeps dangerous heat near today’s level and reverses</w:t>
-      </w:r>
-      <w:r>
-        <w:t xml:space="preserve"> </w:t>
-      </w:r>
-      <w:r>
-        <w:t xml:space="preserve">the spread of drought, and press major emitters for NDCs consistent with a rapid fossil-fuel phase-out.</w:t>
+      </w:pPr>
+      <w:r>
+        <w:t xml:space="preserve">Link Niger’s support for any agreement to more adaptation finance, with simple access for Least</w:t>
+      </w:r>
+      <w:r>
+        <w:t xml:space="preserve"> </w:t>
+      </w:r>
+      <w:r>
+        <w:t xml:space="preserve">Developed Countries.</w:t>
       </w:r>
     </w:p>
     <w:p>
       <w:pPr>
         <w:numPr>
           <w:ilvl w:val="0"/>
-          <w:numId w:val="1002"/>
+          <w:numId w:val="1004"/>
         </w:numPr>
-        <w:pStyle w:val="KeyBox"/>
-      </w:pPr>
-      <w:r>
-        <w:t xml:space="preserve">Link Niger’s support for any agreement to scaled-up adaptation finance with simplified access for Least</w:t>
-      </w:r>
-      <w:r>
-        <w:t xml:space="preserve"> </w:t>
-      </w:r>
-      <w:r>
-        <w:t xml:space="preserve">Developed Countries.</w:t>
+      </w:pPr>
+      <w:r>
+        <w:t xml:space="preserve">Seek support from the Loss and Damage Fund for droughts and floods, in coalition with the African Group</w:t>
+      </w:r>
+      <w:r>
+        <w:t xml:space="preserve"> </w:t>
+      </w:r>
+      <w:r>
+        <w:t xml:space="preserve">of Negotiators and the LDC Group.</w:t>
       </w:r>
     </w:p>
     <w:p>
       <w:pPr>
         <w:numPr>
           <w:ilvl w:val="0"/>
-          <w:numId w:val="1002"/>
+          <w:numId w:val="1004"/>
         </w:numPr>
-        <w:pStyle w:val="KeyBox"/>
-      </w:pPr>
-      <w:r>
-        <w:t xml:space="preserve">Use the Loss and Damage Fund for droughts and floods, in coalition with the African Group of Negotiators</w:t>
-      </w:r>
-      <w:r>
-        <w:t xml:space="preserve"> </w:t>
-      </w:r>
-      <w:r>
-        <w:t xml:space="preserve">and the LDC Group.</w:t>
+      </w:pPr>
+      <w:r>
+        <w:t xml:space="preserve">At national level, fund drought-tolerant millet and sorghum, water harvesting, early warning systems and</w:t>
+      </w:r>
+      <w:r>
+        <w:t xml:space="preserve"> </w:t>
+      </w:r>
+      <w:r>
+        <w:t xml:space="preserve">the protection of herders’ mobility.</w:t>
       </w:r>
     </w:p>
-    <w:bookmarkEnd w:id="32"/>
-    <w:bookmarkStart w:id="33" w:name="confidence-and-limits-of-the-evidence"/>
+    <w:bookmarkEnd w:id="34"/>
+    <w:bookmarkStart w:id="35" w:name="e.-limits-of-the-analysis"/>
     <w:p>
       <w:pPr>
         <w:pStyle w:val="Heading1"/>
       </w:pPr>
       <w:r>
-        <w:t xml:space="preserve">4. Confidence and limits of the evidence</w:t>
+        <w:t xml:space="preserve">E. Limits of the analysis</w:t>
       </w:r>
     </w:p>
     <w:p>
       <w:pPr>
-        <w:pStyle w:val="FirstParagraph"/>
-      </w:pPr>
-      <w:r>
-        <w:t xml:space="preserve">The direction of change is robust for heat, but its size is uncertain: under current policies, models span 59 to</w:t>
-      </w:r>
-      <w:r>
-        <w:t xml:space="preserve"> </w:t>
-      </w:r>
-      <w:r>
-        <w:t xml:space="preserve">134 dangerous-heat days in 2100. The heat index relies on an approximation of humidity during the hottest hour,</w:t>
-      </w:r>
-      <w:r>
-        <w:t xml:space="preserve"> </w:t>
-      </w:r>
-      <w:r>
-        <w:t xml:space="preserve">a limitation the tool acknowledges. The drought indicator counts a single month of severe drought, so it</w:t>
-      </w:r>
-      <w:r>
-        <w:t xml:space="preserve"> </w:t>
-      </w:r>
-      <w:r>
-        <w:t xml:space="preserve">saturates and barely separates the scenarios. For extreme rainfall, the model range includes no change under</w:t>
-      </w:r>
-      <w:r>
-        <w:t xml:space="preserve"> </w:t>
-      </w:r>
-      <w:r>
-        <w:t xml:space="preserve">low warming but not under current policies by 2100. The tool’s crop indicators (maize, rice, soy) were</w:t>
-      </w:r>
-      <w:r>
-        <w:t xml:space="preserve"> </w:t>
-      </w:r>
-      <w:r>
-        <w:t xml:space="preserve">deliberately set aside because Niger’s staples, millet and sorghum, are not modelled. Finally, these figures</w:t>
-      </w:r>
-      <w:r>
-        <w:t xml:space="preserve"> </w:t>
-      </w:r>
-      <w:r>
-        <w:t xml:space="preserve">are hazard projections, not forecasts: given Niger’s high social vulnerability, real impacts are likely to be</w:t>
-      </w:r>
-      <w:r>
-        <w:t xml:space="preserve"> </w:t>
-      </w:r>
-      <w:r>
-        <w:t xml:space="preserve">larger.</w:t>
+        <w:numPr>
+          <w:ilvl w:val="0"/>
+          <w:numId w:val="1005"/>
+        </w:numPr>
+      </w:pPr>
+      <w:r>
+        <w:t xml:space="preserve">These figures are projections, not forecasts. The direction of change is clear for heat, but its size</w:t>
+      </w:r>
+      <w:r>
+        <w:t xml:space="preserve"> </w:t>
+      </w:r>
+      <w:r>
+        <w:t xml:space="preserve">varies between models (59 to 134 days in 2100 under current policies).</w:t>
       </w:r>
     </w:p>
     <w:p>
-      <w:r>
-        <w:br w:type="page"/>
+      <w:pPr>
+        <w:numPr>
+          <w:ilvl w:val="0"/>
+          <w:numId w:val="1005"/>
+        </w:numPr>
+      </w:pPr>
+      <w:r>
+        <w:t xml:space="preserve">The heat index uses an estimate of humidity at the hottest hour. The drought indicator counts a single</w:t>
+      </w:r>
+      <w:r>
+        <w:t xml:space="preserve"> </w:t>
+      </w:r>
+      <w:r>
+        <w:t xml:space="preserve">month of drought, so it saturates. The tool does not model millet or sorghum, so its crop indicators</w:t>
+      </w:r>
+      <w:r>
+        <w:t xml:space="preserve"> </w:t>
+      </w:r>
+      <w:r>
+        <w:t xml:space="preserve">(maize, rice, soy) were not used.</w:t>
       </w:r>
     </w:p>
-    <w:bookmarkEnd w:id="33"/>
-    <w:bookmarkStart w:id="34" w:name="references"/>
     <w:p>
       <w:pPr>
+        <w:numPr>
+          <w:ilvl w:val="0"/>
+          <w:numId w:val="1005"/>
+        </w:numPr>
+      </w:pPr>
+      <w:r>
+        <w:t xml:space="preserve">These are hazard projections only. Given Niger’s high vulnerability, real impacts are likely to be</w:t>
+      </w:r>
+      <w:r>
+        <w:t xml:space="preserve"> </w:t>
+      </w:r>
+      <w:r>
+        <w:t xml:space="preserve">larger.</w:t>
+      </w:r>
+    </w:p>
+    <w:bookmarkEnd w:id="35"/>
+    <w:bookmarkStart w:id="36" w:name="references"/>
+    <w:p>
+      <w:pPr>
         <w:pStyle w:val="Heading1"/>
+        <w:pageBreakBefore/>
       </w:pPr>
       <w:r>
         <w:t xml:space="preserve">References</w:t>
@@ -2199,7 +1634,7 @@
       <w:r>
         <w:t xml:space="preserve"> </w:t>
       </w:r>
-      <w:hyperlink r:id="rId21">
+      <w:hyperlink r:id="rId22">
         <w:r>
           <w:rPr>
             <w:rStyle w:val="Hyperlink"/>
@@ -2245,7 +1680,7 @@
       <w:r>
         <w:t xml:space="preserve"> </w:t>
       </w:r>
-      <w:hyperlink r:id="rId23">
+      <w:hyperlink r:id="rId27">
         <w:r>
           <w:rPr>
             <w:rStyle w:val="Hyperlink"/>
@@ -2423,7 +1858,7 @@
       <w:r>
         <w:t xml:space="preserve"> </w:t>
       </w:r>
-      <w:hyperlink r:id="rId31">
+      <w:hyperlink r:id="rId32">
         <w:r>
           <w:rPr>
             <w:rStyle w:val="Hyperlink"/>
@@ -2450,7 +1885,7 @@
       <w:r>
         <w:t xml:space="preserve"> </w:t>
       </w:r>
-      <w:hyperlink r:id="rId20">
+      <w:hyperlink r:id="rId21">
         <w:r>
           <w:rPr>
             <w:rStyle w:val="Hyperlink"/>
@@ -2459,7 +1894,7 @@
         </w:r>
       </w:hyperlink>
     </w:p>
-    <w:bookmarkEnd w:id="34"/>
+    <w:bookmarkEnd w:id="36"/>
     <w:sectPr>
       <w:headerReference w:type="default" r:id="rId9"/>
       <w:footerReference w:type="default" r:id="rId10"/>
@@ -2636,82 +2071,6 @@
       </w:pPr>
     </w:lvl>
   </w:abstractNum>
-  <w:abstractNum w:abstractNumId="991">
-    <w:nsid w:val="A991"/>
-    <w:multiLevelType w:val="multilevel"/>
-    <w:lvl w:ilvl="0">
-      <w:numFmt w:val="bullet"/>
-      <w:lvlText w:val="•"/>
-      <w:lvlJc w:val="left"/>
-      <w:pPr>
-        <w:ind w:left="720" w:hanging="480"/>
-      </w:pPr>
-    </w:lvl>
-    <w:lvl w:ilvl="1">
-      <w:numFmt w:val="bullet"/>
-      <w:lvlText w:val="–"/>
-      <w:lvlJc w:val="left"/>
-      <w:pPr>
-        <w:ind w:left="1440" w:hanging="480"/>
-      </w:pPr>
-    </w:lvl>
-    <w:lvl w:ilvl="2">
-      <w:numFmt w:val="bullet"/>
-      <w:lvlText w:val="•"/>
-      <w:lvlJc w:val="left"/>
-      <w:pPr>
-        <w:ind w:left="2160" w:hanging="480"/>
-      </w:pPr>
-    </w:lvl>
-    <w:lvl w:ilvl="3">
-      <w:numFmt w:val="bullet"/>
-      <w:lvlText w:val="–"/>
-      <w:lvlJc w:val="left"/>
-      <w:pPr>
-        <w:ind w:left="2880" w:hanging="480"/>
-      </w:pPr>
-    </w:lvl>
-    <w:lvl w:ilvl="4">
-      <w:numFmt w:val="bullet"/>
-      <w:lvlText w:val="•"/>
-      <w:lvlJc w:val="left"/>
-      <w:pPr>
-        <w:ind w:left="3600" w:hanging="480"/>
-      </w:pPr>
-    </w:lvl>
-    <w:lvl w:ilvl="5">
-      <w:numFmt w:val="bullet"/>
-      <w:lvlText w:val="–"/>
-      <w:lvlJc w:val="left"/>
-      <w:pPr>
-        <w:ind w:left="4320" w:hanging="480"/>
-      </w:pPr>
-    </w:lvl>
-    <w:lvl w:ilvl="6">
-      <w:numFmt w:val="bullet"/>
-      <w:lvlText w:val="•"/>
-      <w:lvlJc w:val="left"/>
-      <w:pPr>
-        <w:ind w:left="5040" w:hanging="480"/>
-      </w:pPr>
-    </w:lvl>
-    <w:lvl w:ilvl="7">
-      <w:numFmt w:val="bullet"/>
-      <w:lvlText w:val="–"/>
-      <w:lvlJc w:val="left"/>
-      <w:pPr>
-        <w:ind w:left="5760" w:hanging="480"/>
-      </w:pPr>
-    </w:lvl>
-    <w:lvl w:ilvl="8">
-      <w:numFmt w:val="bullet"/>
-      <w:lvlText w:val="•"/>
-      <w:lvlJc w:val="left"/>
-      <w:pPr>
-        <w:ind w:left="6480" w:hanging="480"/>
-      </w:pPr>
-    </w:lvl>
-  </w:abstractNum>
   <w:abstractNum w:abstractNumId="99201">
     <w:nsid w:val="A99201"/>
     <w:multiLevelType w:val="multilevel"/>
@@ -2797,13 +2156,350 @@
       </w:pPr>
     </w:lvl>
   </w:abstractNum>
+  <w:abstractNum w:abstractNumId="99204">
+    <w:nsid w:val="A99204"/>
+    <w:multiLevelType w:val="multilevel"/>
+    <w:lvl w:ilvl="0">
+      <w:start w:val="4"/>
+      <w:numFmt w:val="decimal"/>
+      <w:lvlText w:val="%1."/>
+      <w:lvlJc w:val="left"/>
+      <w:pPr>
+        <w:ind w:left="720" w:hanging="480"/>
+      </w:pPr>
+    </w:lvl>
+    <w:lvl w:ilvl="1">
+      <w:start w:val="4"/>
+      <w:numFmt w:val="lowerLetter"/>
+      <w:lvlText w:val="%2."/>
+      <w:lvlJc w:val="left"/>
+      <w:pPr>
+        <w:ind w:left="1440" w:hanging="480"/>
+      </w:pPr>
+    </w:lvl>
+    <w:lvl w:ilvl="2">
+      <w:start w:val="4"/>
+      <w:numFmt w:val="lowerRoman"/>
+      <w:lvlText w:val="%3."/>
+      <w:lvlJc w:val="left"/>
+      <w:pPr>
+        <w:ind w:left="2160" w:hanging="480"/>
+      </w:pPr>
+    </w:lvl>
+    <w:lvl w:ilvl="3">
+      <w:start w:val="4"/>
+      <w:numFmt w:val="decimal"/>
+      <w:lvlText w:val="%4."/>
+      <w:lvlJc w:val="left"/>
+      <w:pPr>
+        <w:ind w:left="2880" w:hanging="480"/>
+      </w:pPr>
+    </w:lvl>
+    <w:lvl w:ilvl="4">
+      <w:start w:val="4"/>
+      <w:numFmt w:val="lowerLetter"/>
+      <w:lvlText w:val="%5."/>
+      <w:lvlJc w:val="left"/>
+      <w:pPr>
+        <w:ind w:left="3600" w:hanging="480"/>
+      </w:pPr>
+    </w:lvl>
+    <w:lvl w:ilvl="5">
+      <w:start w:val="4"/>
+      <w:numFmt w:val="lowerRoman"/>
+      <w:lvlText w:val="%6."/>
+      <w:lvlJc w:val="left"/>
+      <w:pPr>
+        <w:ind w:left="4320" w:hanging="480"/>
+      </w:pPr>
+    </w:lvl>
+    <w:lvl w:ilvl="6">
+      <w:start w:val="4"/>
+      <w:numFmt w:val="decimal"/>
+      <w:lvlText w:val="%7."/>
+      <w:lvlJc w:val="left"/>
+      <w:pPr>
+        <w:ind w:left="5040" w:hanging="480"/>
+      </w:pPr>
+    </w:lvl>
+    <w:lvl w:ilvl="7">
+      <w:start w:val="4"/>
+      <w:numFmt w:val="lowerLetter"/>
+      <w:lvlText w:val="%8."/>
+      <w:lvlJc w:val="left"/>
+      <w:pPr>
+        <w:ind w:left="5760" w:hanging="480"/>
+      </w:pPr>
+    </w:lvl>
+    <w:lvl w:ilvl="8">
+      <w:start w:val="4"/>
+      <w:numFmt w:val="lowerRoman"/>
+      <w:lvlText w:val="%9."/>
+      <w:lvlJc w:val="left"/>
+      <w:pPr>
+        <w:ind w:left="6480" w:hanging="480"/>
+      </w:pPr>
+    </w:lvl>
+  </w:abstractNum>
+  <w:abstractNum w:abstractNumId="99207">
+    <w:nsid w:val="A99207"/>
+    <w:multiLevelType w:val="multilevel"/>
+    <w:lvl w:ilvl="0">
+      <w:start w:val="7"/>
+      <w:numFmt w:val="decimal"/>
+      <w:lvlText w:val="%1."/>
+      <w:lvlJc w:val="left"/>
+      <w:pPr>
+        <w:ind w:left="720" w:hanging="480"/>
+      </w:pPr>
+    </w:lvl>
+    <w:lvl w:ilvl="1">
+      <w:start w:val="7"/>
+      <w:numFmt w:val="lowerLetter"/>
+      <w:lvlText w:val="%2."/>
+      <w:lvlJc w:val="left"/>
+      <w:pPr>
+        <w:ind w:left="1440" w:hanging="480"/>
+      </w:pPr>
+    </w:lvl>
+    <w:lvl w:ilvl="2">
+      <w:start w:val="7"/>
+      <w:numFmt w:val="lowerRoman"/>
+      <w:lvlText w:val="%3."/>
+      <w:lvlJc w:val="left"/>
+      <w:pPr>
+        <w:ind w:left="2160" w:hanging="480"/>
+      </w:pPr>
+    </w:lvl>
+    <w:lvl w:ilvl="3">
+      <w:start w:val="7"/>
+      <w:numFmt w:val="decimal"/>
+      <w:lvlText w:val="%4."/>
+      <w:lvlJc w:val="left"/>
+      <w:pPr>
+        <w:ind w:left="2880" w:hanging="480"/>
+      </w:pPr>
+    </w:lvl>
+    <w:lvl w:ilvl="4">
+      <w:start w:val="7"/>
+      <w:numFmt w:val="lowerLetter"/>
+      <w:lvlText w:val="%5."/>
+      <w:lvlJc w:val="left"/>
+      <w:pPr>
+        <w:ind w:left="3600" w:hanging="480"/>
+      </w:pPr>
+    </w:lvl>
+    <w:lvl w:ilvl="5">
+      <w:start w:val="7"/>
+      <w:numFmt w:val="lowerRoman"/>
+      <w:lvlText w:val="%6."/>
+      <w:lvlJc w:val="left"/>
+      <w:pPr>
+        <w:ind w:left="4320" w:hanging="480"/>
+      </w:pPr>
+    </w:lvl>
+    <w:lvl w:ilvl="6">
+      <w:start w:val="7"/>
+      <w:numFmt w:val="decimal"/>
+      <w:lvlText w:val="%7."/>
+      <w:lvlJc w:val="left"/>
+      <w:pPr>
+        <w:ind w:left="5040" w:hanging="480"/>
+      </w:pPr>
+    </w:lvl>
+    <w:lvl w:ilvl="7">
+      <w:start w:val="7"/>
+      <w:numFmt w:val="lowerLetter"/>
+      <w:lvlText w:val="%8."/>
+      <w:lvlJc w:val="left"/>
+      <w:pPr>
+        <w:ind w:left="5760" w:hanging="480"/>
+      </w:pPr>
+    </w:lvl>
+    <w:lvl w:ilvl="8">
+      <w:start w:val="7"/>
+      <w:numFmt w:val="lowerRoman"/>
+      <w:lvlText w:val="%9."/>
+      <w:lvlJc w:val="left"/>
+      <w:pPr>
+        <w:ind w:left="6480" w:hanging="480"/>
+      </w:pPr>
+    </w:lvl>
+  </w:abstractNum>
+  <w:abstractNum w:abstractNumId="99731">
+    <w:nsid w:val="A99731"/>
+    <w:multiLevelType w:val="multilevel"/>
+    <w:lvl w:ilvl="0">
+      <w:start w:val="1"/>
+      <w:numFmt w:val="lowerLetter"/>
+      <w:lvlText w:val="(%1)"/>
+      <w:lvlJc w:val="left"/>
+      <w:pPr>
+        <w:ind w:left="720" w:hanging="480"/>
+      </w:pPr>
+    </w:lvl>
+    <w:lvl w:ilvl="1">
+      <w:start w:val="1"/>
+      <w:numFmt w:val="lowerLetter"/>
+      <w:lvlText w:val="(%2)"/>
+      <w:lvlJc w:val="left"/>
+      <w:pPr>
+        <w:ind w:left="1440" w:hanging="480"/>
+      </w:pPr>
+    </w:lvl>
+    <w:lvl w:ilvl="2">
+      <w:start w:val="1"/>
+      <w:numFmt w:val="lowerLetter"/>
+      <w:lvlText w:val="(%3)"/>
+      <w:lvlJc w:val="left"/>
+      <w:pPr>
+        <w:ind w:left="2160" w:hanging="480"/>
+      </w:pPr>
+    </w:lvl>
+    <w:lvl w:ilvl="3">
+      <w:start w:val="1"/>
+      <w:numFmt w:val="lowerLetter"/>
+      <w:lvlText w:val="(%4)"/>
+      <w:lvlJc w:val="left"/>
+      <w:pPr>
+        <w:ind w:left="2880" w:hanging="480"/>
+      </w:pPr>
+    </w:lvl>
+    <w:lvl w:ilvl="4">
+      <w:start w:val="1"/>
+      <w:numFmt w:val="lowerLetter"/>
+      <w:lvlText w:val="(%5)"/>
+      <w:lvlJc w:val="left"/>
+      <w:pPr>
+        <w:ind w:left="3600" w:hanging="480"/>
+      </w:pPr>
+    </w:lvl>
+    <w:lvl w:ilvl="5">
+      <w:start w:val="1"/>
+      <w:numFmt w:val="lowerLetter"/>
+      <w:lvlText w:val="(%6)"/>
+      <w:lvlJc w:val="left"/>
+      <w:pPr>
+        <w:ind w:left="4320" w:hanging="480"/>
+      </w:pPr>
+    </w:lvl>
+    <w:lvl w:ilvl="6">
+      <w:start w:val="1"/>
+      <w:numFmt w:val="lowerLetter"/>
+      <w:lvlText w:val="(%7)"/>
+      <w:lvlJc w:val="left"/>
+      <w:pPr>
+        <w:ind w:left="5040" w:hanging="480"/>
+      </w:pPr>
+    </w:lvl>
+    <w:lvl w:ilvl="7">
+      <w:start w:val="1"/>
+      <w:numFmt w:val="lowerLetter"/>
+      <w:lvlText w:val="(%8)"/>
+      <w:lvlJc w:val="left"/>
+      <w:pPr>
+        <w:ind w:left="5760" w:hanging="480"/>
+      </w:pPr>
+    </w:lvl>
+    <w:lvl w:ilvl="8">
+      <w:start w:val="1"/>
+      <w:numFmt w:val="lowerLetter"/>
+      <w:lvlText w:val="(%9)"/>
+      <w:lvlJc w:val="left"/>
+      <w:pPr>
+        <w:ind w:left="6480" w:hanging="480"/>
+      </w:pPr>
+    </w:lvl>
+  </w:abstractNum>
+  <w:abstractNum w:abstractNumId="992010">
+    <w:nsid w:val="A992010"/>
+    <w:multiLevelType w:val="multilevel"/>
+    <w:lvl w:ilvl="0">
+      <w:start w:val="10"/>
+      <w:numFmt w:val="decimal"/>
+      <w:lvlText w:val="%1."/>
+      <w:lvlJc w:val="left"/>
+      <w:pPr>
+        <w:ind w:left="720" w:hanging="480"/>
+      </w:pPr>
+    </w:lvl>
+    <w:lvl w:ilvl="1">
+      <w:start w:val="10"/>
+      <w:numFmt w:val="lowerLetter"/>
+      <w:lvlText w:val="%2."/>
+      <w:lvlJc w:val="left"/>
+      <w:pPr>
+        <w:ind w:left="1440" w:hanging="480"/>
+      </w:pPr>
+    </w:lvl>
+    <w:lvl w:ilvl="2">
+      <w:start w:val="10"/>
+      <w:numFmt w:val="lowerRoman"/>
+      <w:lvlText w:val="%3."/>
+      <w:lvlJc w:val="left"/>
+      <w:pPr>
+        <w:ind w:left="2160" w:hanging="480"/>
+      </w:pPr>
+    </w:lvl>
+    <w:lvl w:ilvl="3">
+      <w:start w:val="10"/>
+      <w:numFmt w:val="decimal"/>
+      <w:lvlText w:val="%4."/>
+      <w:lvlJc w:val="left"/>
+      <w:pPr>
+        <w:ind w:left="2880" w:hanging="480"/>
+      </w:pPr>
+    </w:lvl>
+    <w:lvl w:ilvl="4">
+      <w:start w:val="10"/>
+      <w:numFmt w:val="lowerLetter"/>
+      <w:lvlText w:val="%5."/>
+      <w:lvlJc w:val="left"/>
+      <w:pPr>
+        <w:ind w:left="3600" w:hanging="480"/>
+      </w:pPr>
+    </w:lvl>
+    <w:lvl w:ilvl="5">
+      <w:start w:val="10"/>
+      <w:numFmt w:val="lowerRoman"/>
+      <w:lvlText w:val="%6."/>
+      <w:lvlJc w:val="left"/>
+      <w:pPr>
+        <w:ind w:left="4320" w:hanging="480"/>
+      </w:pPr>
+    </w:lvl>
+    <w:lvl w:ilvl="6">
+      <w:start w:val="10"/>
+      <w:numFmt w:val="decimal"/>
+      <w:lvlText w:val="%7."/>
+      <w:lvlJc w:val="left"/>
+      <w:pPr>
+        <w:ind w:left="5040" w:hanging="480"/>
+      </w:pPr>
+    </w:lvl>
+    <w:lvl w:ilvl="7">
+      <w:start w:val="10"/>
+      <w:numFmt w:val="lowerLetter"/>
+      <w:lvlText w:val="%8."/>
+      <w:lvlJc w:val="left"/>
+      <w:pPr>
+        <w:ind w:left="5760" w:hanging="480"/>
+      </w:pPr>
+    </w:lvl>
+    <w:lvl w:ilvl="8">
+      <w:start w:val="10"/>
+      <w:numFmt w:val="lowerRoman"/>
+      <w:lvlText w:val="%9."/>
+      <w:lvlJc w:val="left"/>
+      <w:pPr>
+        <w:ind w:left="6480" w:hanging="480"/>
+      </w:pPr>
+    </w:lvl>
+  </w:abstractNum>
   <w:num w:numId="1000">
     <w:abstractNumId w:val="990"/>
   </w:num>
   <w:num w:numId="1001">
-    <w:abstractNumId w:val="991"/>
-  </w:num>
-  <w:num w:numId="1002">
     <w:abstractNumId w:val="99201"/>
     <w:lvlOverride w:ilvl="0">
       <w:startOverride w:val="1"/>
@@ -2831,6 +2527,126 @@
     </w:lvlOverride>
     <w:lvlOverride w:ilvl="8">
       <w:startOverride w:val="1"/>
+    </w:lvlOverride>
+  </w:num>
+  <w:num w:numId="1002">
+    <w:abstractNumId w:val="99204"/>
+    <w:lvlOverride w:ilvl="0">
+      <w:startOverride w:val="4"/>
+    </w:lvlOverride>
+    <w:lvlOverride w:ilvl="1">
+      <w:startOverride w:val="4"/>
+    </w:lvlOverride>
+    <w:lvlOverride w:ilvl="2">
+      <w:startOverride w:val="4"/>
+    </w:lvlOverride>
+    <w:lvlOverride w:ilvl="3">
+      <w:startOverride w:val="4"/>
+    </w:lvlOverride>
+    <w:lvlOverride w:ilvl="4">
+      <w:startOverride w:val="4"/>
+    </w:lvlOverride>
+    <w:lvlOverride w:ilvl="5">
+      <w:startOverride w:val="4"/>
+    </w:lvlOverride>
+    <w:lvlOverride w:ilvl="6">
+      <w:startOverride w:val="4"/>
+    </w:lvlOverride>
+    <w:lvlOverride w:ilvl="7">
+      <w:startOverride w:val="4"/>
+    </w:lvlOverride>
+    <w:lvlOverride w:ilvl="8">
+      <w:startOverride w:val="4"/>
+    </w:lvlOverride>
+  </w:num>
+  <w:num w:numId="1003">
+    <w:abstractNumId w:val="99207"/>
+    <w:lvlOverride w:ilvl="0">
+      <w:startOverride w:val="7"/>
+    </w:lvlOverride>
+    <w:lvlOverride w:ilvl="1">
+      <w:startOverride w:val="7"/>
+    </w:lvlOverride>
+    <w:lvlOverride w:ilvl="2">
+      <w:startOverride w:val="7"/>
+    </w:lvlOverride>
+    <w:lvlOverride w:ilvl="3">
+      <w:startOverride w:val="7"/>
+    </w:lvlOverride>
+    <w:lvlOverride w:ilvl="4">
+      <w:startOverride w:val="7"/>
+    </w:lvlOverride>
+    <w:lvlOverride w:ilvl="5">
+      <w:startOverride w:val="7"/>
+    </w:lvlOverride>
+    <w:lvlOverride w:ilvl="6">
+      <w:startOverride w:val="7"/>
+    </w:lvlOverride>
+    <w:lvlOverride w:ilvl="7">
+      <w:startOverride w:val="7"/>
+    </w:lvlOverride>
+    <w:lvlOverride w:ilvl="8">
+      <w:startOverride w:val="7"/>
+    </w:lvlOverride>
+  </w:num>
+  <w:num w:numId="1004">
+    <w:abstractNumId w:val="99731"/>
+    <w:lvlOverride w:ilvl="0">
+      <w:startOverride w:val="1"/>
+    </w:lvlOverride>
+    <w:lvlOverride w:ilvl="1">
+      <w:startOverride w:val="1"/>
+    </w:lvlOverride>
+    <w:lvlOverride w:ilvl="2">
+      <w:startOverride w:val="1"/>
+    </w:lvlOverride>
+    <w:lvlOverride w:ilvl="3">
+      <w:startOverride w:val="1"/>
+    </w:lvlOverride>
+    <w:lvlOverride w:ilvl="4">
+      <w:startOverride w:val="1"/>
+    </w:lvlOverride>
+    <w:lvlOverride w:ilvl="5">
+      <w:startOverride w:val="1"/>
+    </w:lvlOverride>
+    <w:lvlOverride w:ilvl="6">
+      <w:startOverride w:val="1"/>
+    </w:lvlOverride>
+    <w:lvlOverride w:ilvl="7">
+      <w:startOverride w:val="1"/>
+    </w:lvlOverride>
+    <w:lvlOverride w:ilvl="8">
+      <w:startOverride w:val="1"/>
+    </w:lvlOverride>
+  </w:num>
+  <w:num w:numId="1005">
+    <w:abstractNumId w:val="992010"/>
+    <w:lvlOverride w:ilvl="0">
+      <w:startOverride w:val="10"/>
+    </w:lvlOverride>
+    <w:lvlOverride w:ilvl="1">
+      <w:startOverride w:val="10"/>
+    </w:lvlOverride>
+    <w:lvlOverride w:ilvl="2">
+      <w:startOverride w:val="10"/>
+    </w:lvlOverride>
+    <w:lvlOverride w:ilvl="3">
+      <w:startOverride w:val="10"/>
+    </w:lvlOverride>
+    <w:lvlOverride w:ilvl="4">
+      <w:startOverride w:val="10"/>
+    </w:lvlOverride>
+    <w:lvlOverride w:ilvl="5">
+      <w:startOverride w:val="10"/>
+    </w:lvlOverride>
+    <w:lvlOverride w:ilvl="6">
+      <w:startOverride w:val="10"/>
+    </w:lvlOverride>
+    <w:lvlOverride w:ilvl="7">
+      <w:startOverride w:val="10"/>
+    </w:lvlOverride>
+    <w:lvlOverride w:ilvl="8">
+      <w:startOverride w:val="10"/>
     </w:lvlOverride>
   </w:num>
 </w:numbering>
@@ -3360,7 +3176,7 @@
     <w:name w:val="Hyperlink"/>
     <w:basedOn w:val="BodyTextChar"/>
     <w:rPr>
-      <w:color w:val="1F4E9A"/>
+      <w:color w:val="000000"/>
       <w:u w:val="none"/>
     </w:rPr>
   </w:style>

</xml_diff>

<commit_message>
Note Niger : corrections d'exactitude et figure lisible
- Citation exacte du communiqué de la Banque mondiale (l'agriculture
  emploie plus de 80 % de la population) ; « without cooling » retiré.
- Sécheresse : chevauchement des fourchettes 1,5 °C et 2 °C explicité.
- Chaîne de conséquences présentée comme analyse propre, non attribuée.
- Message clé : jugement sur la chaleur reformulé et justifié par la
  séparation des fourchettes.
- Note du tableau : 18 modèles pour les pluies extrêmes (5 pour la chaleur
  et la sécheresse) ; réchauffement en 2100 tel que donné par le CIE.
- Figure redessinée à partir des données du CIE (tools/make_figure.py) :
  texte lisible, repères +1,5/+2,0/+2,5 °C expliqués dans la légende.

Co-Authored-By: Claude Opus 5.5 <noreply@anthropic.com>
Claude-Session: https://claude.ai/code/session_01KUsbuaysKhPQSJCGSc45ce
</commit_message>
<xml_diff>
--- a/devoir-niger/memo-final/word/Niger_Policy_Memo.docx
+++ b/devoir-niger/memo-final/word/Niger_Policy_Memo.docx
@@ -208,19 +208,19 @@
         <w:t xml:space="preserve"> </w:t>
       </w:r>
       <w:r>
-        <w:t xml:space="preserve">pathway. Because most Nigeriens farm and herd outdoors, this is the largest loss that faster global emission</w:t>
-      </w:r>
-      <w:r>
-        <w:t xml:space="preserve"> </w:t>
-      </w:r>
-      <w:r>
-        <w:t xml:space="preserve">cuts can still avoid. Severe drought, by contrast, is projected to become near-universal in every scenario, so</w:t>
-      </w:r>
-      <w:r>
-        <w:t xml:space="preserve"> </w:t>
-      </w:r>
-      <w:r>
-        <w:t xml:space="preserve">Niger also needs adaptation finance now.</w:t>
+        <w:t xml:space="preserve">pathway. Heat is where faster global emission cuts make the clearest difference: even the low end of the</w:t>
+      </w:r>
+      <w:r>
+        <w:t xml:space="preserve"> </w:t>
+      </w:r>
+      <w:r>
+        <w:t xml:space="preserve">current-policies range is above the central below-2 °C value. Severe drought, by contrast, is projected to</w:t>
+      </w:r>
+      <w:r>
+        <w:t xml:space="preserve"> </w:t>
+      </w:r>
+      <w:r>
+        <w:t xml:space="preserve">affect most of the country in every scenario, so Niger also needs adaptation finance now.</w:t>
       </w:r>
     </w:p>
     <w:bookmarkEnd w:id="20"/>
@@ -903,7 +903,7 @@
           <w:i/>
           <w:sz w:val="20"/>
         </w:rPr>
-        <w:t xml:space="preserve">(1.6 °C) and Current policies (2.9 °C). Median of five models; 5–95 % range in brackets. Values after</w:t>
+        <w:t xml:space="preserve">(1.6 °C) and Current policies (2.9 °C), as given in the CIE data. Median of five climate models (18 for</w:t>
       </w:r>
       <w:r>
         <w:rPr>
@@ -919,7 +919,7 @@
           <w:i/>
           <w:sz w:val="20"/>
         </w:rPr>
-        <w:t xml:space="preserve">2060 are indicative.</w:t>
+        <w:t xml:space="preserve">extreme rainfall); 5–95 % range in brackets. Values after 2060 are indicative.</w:t>
       </w:r>
     </w:p>
     <w:p>
@@ -967,13 +967,7 @@
         <w:t xml:space="preserve"> </w:t>
       </w:r>
       <w:r>
-        <w:t xml:space="preserve">agriculture and livestock employ more than 80 % of the population, mostly outdoors and without cooling</w:t>
-      </w:r>
-      <w:r>
-        <w:t xml:space="preserve"> </w:t>
-      </w:r>
-      <w:r>
-        <w:t xml:space="preserve">(</w:t>
+        <w:t xml:space="preserve">agriculture employs over 80 % of the population (</w:t>
       </w:r>
       <w:hyperlink r:id="rId22">
         <w:r>
@@ -984,7 +978,7 @@
         </w:r>
       </w:hyperlink>
       <w:r>
-        <w:t xml:space="preserve">).</w:t>
+        <w:t xml:space="preserve">), and farming and herding are outdoor work.</w:t>
       </w:r>
     </w:p>
     <w:p>
@@ -1014,13 +1008,25 @@
         <w:t xml:space="preserve"> </w:t>
       </w:r>
       <w:r>
-        <w:t xml:space="preserve">below 2 °C and under current policies; only the 1.5 °C pathway keeps the share lower (87 %). Rain-fed</w:t>
-      </w:r>
-      <w:r>
-        <w:t xml:space="preserve"> </w:t>
-      </w:r>
-      <w:r>
-        <w:t xml:space="preserve">millet, sorghum and pastures are therefore likely to face more frequent water stress whatever the global outcome.</w:t>
+        <w:t xml:space="preserve">below 2 °C and under current policies. The 1.5 °C pathway has a lower central value (87 %), but its range</w:t>
+      </w:r>
+      <w:r>
+        <w:t xml:space="preserve"> </w:t>
+      </w:r>
+      <w:r>
+        <w:t xml:space="preserve">(66–100 %) largely overlaps that of the below-2 °C scenario (81–100 %), so the models do not clearly</w:t>
+      </w:r>
+      <w:r>
+        <w:t xml:space="preserve"> </w:t>
+      </w:r>
+      <w:r>
+        <w:t xml:space="preserve">separate the two. Rain-fed millet, sorghum and pastures are therefore likely to face more frequent water stress</w:t>
+      </w:r>
+      <w:r>
+        <w:t xml:space="preserve"> </w:t>
+      </w:r>
+      <w:r>
+        <w:t xml:space="preserve">whatever the global outcome.</w:t>
       </w:r>
     </w:p>
     <w:p>
@@ -1066,14 +1072,14 @@
       <w:r>
         <w:drawing>
           <wp:inline>
-            <wp:extent cx="5760720" cy="2716288"/>
+            <wp:extent cx="5760720" cy="2651759"/>
             <wp:effectExtent b="0" l="0" r="0" t="0"/>
             <wp:docPr descr="" title="" id="24" name="Picture"/>
             <a:graphic>
               <a:graphicData uri="http://schemas.openxmlformats.org/drawingml/2006/picture">
                 <pic:pic>
                   <pic:nvPicPr>
-                    <pic:cNvPr descr="cie_figure_clean.png" id="25" name="Picture"/>
+                    <pic:cNvPr descr="fig_heat.png" id="25" name="Picture"/>
                     <pic:cNvPicPr>
                       <a:picLocks noChangeArrowheads="1" noChangeAspect="1"/>
                     </pic:cNvPicPr>
@@ -1087,7 +1093,7 @@
                   <pic:spPr bwMode="auto">
                     <a:xfrm>
                       <a:off x="0" y="0"/>
-                      <a:ext cx="5760720" cy="2716288"/>
+                      <a:ext cx="5760720" cy="2651759"/>
                     </a:xfrm>
                     <a:prstGeom prst="rect">
                       <a:avLst/>
@@ -1117,7 +1123,7 @@
           <w:bCs/>
           <w:b/>
         </w:rPr>
-        <w:t xml:space="preserve">Figure 1. Days of dangerous heat per year in Niger, below 2 °C (green) and under current</w:t>
+        <w:t xml:space="preserve">Figure 1. Days of dangerous heat per year in Niger, below 2 °C and under current</w:t>
       </w:r>
       <w:r>
         <w:rPr>
@@ -1131,25 +1137,37 @@
           <w:bCs/>
           <w:b/>
         </w:rPr>
-        <w:t xml:space="preserve">policies (blue).</w:t>
-      </w:r>
-      <w:r>
-        <w:t xml:space="preserve"> </w:t>
-      </w:r>
-      <w:r>
-        <w:t xml:space="preserve">The curves are identical until about 2030; the gap that opens afterwards is what limiting</w:t>
-      </w:r>
-      <w:r>
-        <w:t xml:space="preserve"> </w:t>
-      </w:r>
-      <w:r>
-        <w:t xml:space="preserve">warming avoids. Even the low end of the current-policies range in 2100 (59 days) lies above the central</w:t>
-      </w:r>
-      <w:r>
-        <w:t xml:space="preserve"> </w:t>
-      </w:r>
-      <w:r>
-        <w:t xml:space="preserve">below-2 °C value (42 days). Source: Climate Impact Explorer (</w:t>
+        <w:t xml:space="preserve">policies.</w:t>
+      </w:r>
+      <w:r>
+        <w:t xml:space="preserve"> </w:t>
+      </w:r>
+      <w:r>
+        <w:t xml:space="preserve">The curves are identical until about 2030; the gap that opens afterwards is what limiting warming</w:t>
+      </w:r>
+      <w:r>
+        <w:t xml:space="preserve"> </w:t>
+      </w:r>
+      <w:r>
+        <w:t xml:space="preserve">avoids. Open circles mark the years in which global warming reaches +1.5 °C (about 2030), +2.0 °C</w:t>
+      </w:r>
+      <w:r>
+        <w:t xml:space="preserve"> </w:t>
+      </w:r>
+      <w:r>
+        <w:t xml:space="preserve">(about 2049) and +2.5 °C (about 2074) on the current-policies pathway. Shaded bands show the 5–95 % model</w:t>
+      </w:r>
+      <w:r>
+        <w:t xml:space="preserve"> </w:t>
+      </w:r>
+      <w:r>
+        <w:t xml:space="preserve">range; dashed lines and the grey area show indicative results after 2060. Chart drawn from Climate Impact</w:t>
+      </w:r>
+      <w:r>
+        <w:t xml:space="preserve"> </w:t>
+      </w:r>
+      <w:r>
+        <w:t xml:space="preserve">Explorer data (</w:t>
       </w:r>
       <w:hyperlink r:id="rId21">
         <w:r>
@@ -1213,13 +1231,19 @@
         </w:r>
       </w:hyperlink>
       <w:r>
-        <w:t xml:space="preserve">). These losses can cascade: a hot, dry year cuts harvests and pasture, raises grain prices,</w:t>
-      </w:r>
-      <w:r>
-        <w:t xml:space="preserve"> </w:t>
-      </w:r>
-      <w:r>
-        <w:t xml:space="preserve">forces households to sell livestock, and can deepen malnutrition and tensions between farmers and herders.</w:t>
+        <w:t xml:space="preserve">). Given the country’s dependence on rain-fed farming and herding, these losses are likely to</w:t>
+      </w:r>
+      <w:r>
+        <w:t xml:space="preserve"> </w:t>
+      </w:r>
+      <w:r>
+        <w:t xml:space="preserve">cascade: a hot, dry year cuts harvests and pasture, raises grain prices, forces households to sell livestock,</w:t>
+      </w:r>
+      <w:r>
+        <w:t xml:space="preserve"> </w:t>
+      </w:r>
+      <w:r>
+        <w:t xml:space="preserve">and can deepen malnutrition and tensions between farmers and herders.</w:t>
       </w:r>
       <w:r>
         <w:t xml:space="preserve"> </w:t>

</xml_diff>

<commit_message>
Note Niger : intègre la relecture de la version du 13 octobre
- Message centré sur 2050 (hors période indicative) avec 2100 en
  complément ; contradiction sur la sécheresse levée (≈ 96 % dès 2030
  dans tous les scénarios, plages qui se recouvrent).
- Tableau : colonnes 2050 pour les trois scénarios NGFS et 2100 pour
  deux ; noms de scénarios uniformes ; fourchettes au format « a to b ».
- Valeurs des pluies extrêmes revérifiées dans l'export CSV du CIE.
- Seuil « danger » attribué au CIE ; cascade appuyée sur le CCDR
  (production agricole, prix alimentaires, compétition agriculteurs
  et pasteurs) ; jugement sur la chaleur limité aux trois indicateurs.
- Référence Banque mondiale 2024 : date de mise en ligne précisée.
- Version Word relue archivée dans archive/.

Co-Authored-By: Claude Opus 5.5 <noreply@anthropic.com>
Claude-Session: https://claude.ai/code/session_01KUsbuaysKhPQSJCGSc45ce
</commit_message>
<xml_diff>
--- a/devoir-niger/memo-final/word/Niger_Policy_Memo.docx
+++ b/devoir-niger/memo-final/word/Niger_Policy_Memo.docx
@@ -196,31 +196,31 @@
         <w:pStyle w:val="FirstParagraph"/>
       </w:pPr>
       <w:r>
-        <w:t xml:space="preserve">Models indicate that, under current global policies, Niger could face about 91 days of dangerous heat a year</w:t>
-      </w:r>
-      <w:r>
-        <w:t xml:space="preserve"> </w:t>
-      </w:r>
-      <w:r>
-        <w:t xml:space="preserve">by 2100, three times today’s level, against about 42 if warming is held below 2 °C and 32 on a 1.5 °C</w:t>
-      </w:r>
-      <w:r>
-        <w:t xml:space="preserve"> </w:t>
-      </w:r>
-      <w:r>
-        <w:t xml:space="preserve">pathway. Heat is where faster global emission cuts make the clearest difference: even the low end of the</w:t>
-      </w:r>
-      <w:r>
-        <w:t xml:space="preserve"> </w:t>
-      </w:r>
-      <w:r>
-        <w:t xml:space="preserve">current-policies range is above the central below-2 °C value. Severe drought, by contrast, is projected to</w:t>
-      </w:r>
-      <w:r>
-        <w:t xml:space="preserve"> </w:t>
-      </w:r>
-      <w:r>
-        <w:t xml:space="preserve">affect most of the country in every scenario, so Niger also needs adaptation finance now.</w:t>
+        <w:t xml:space="preserve">Models indicate that dangerous heat in Niger is projected to rise in every scenario, but far less if warming is</w:t>
+      </w:r>
+      <w:r>
+        <w:t xml:space="preserve"> </w:t>
+      </w:r>
+      <w:r>
+        <w:t xml:space="preserve">limited: about 54 days a year by 2050 under Current policies against 45 under Below 2 °C (31 today), a gap</w:t>
+      </w:r>
+      <w:r>
+        <w:t xml:space="preserve"> </w:t>
+      </w:r>
+      <w:r>
+        <w:t xml:space="preserve">that widens to 91 against 42 days by 2100. Extreme rainfall follows the same pattern, whereas severe drought is</w:t>
+      </w:r>
+      <w:r>
+        <w:t xml:space="preserve"> </w:t>
+      </w:r>
+      <w:r>
+        <w:t xml:space="preserve">projected to affect almost all of the country by 2050 in all three scenarios. Niger therefore has a direct</w:t>
+      </w:r>
+      <w:r>
+        <w:t xml:space="preserve"> </w:t>
+      </w:r>
+      <w:r>
+        <w:t xml:space="preserve">interest both in faster global emission cuts and in adaptation finance now.</w:t>
       </w:r>
     </w:p>
     <w:bookmarkEnd w:id="20"/>
@@ -250,11 +250,13 @@
         <w:tblLayout w:type="fixed"/>
       </w:tblPr>
       <w:tblGrid>
-        <w:gridCol w:w="2835"/>
-        <w:gridCol w:w="1134"/>
-        <w:gridCol w:w="1701"/>
-        <w:gridCol w:w="1701"/>
-        <w:gridCol w:w="1701"/>
+        <w:gridCol w:w="2268"/>
+        <w:gridCol w:w="1048"/>
+        <w:gridCol w:w="1048"/>
+        <w:gridCol w:w="1048"/>
+        <w:gridCol w:w="1048"/>
+        <w:gridCol w:w="1048"/>
+        <w:gridCol w:w="1048"/>
       </w:tblGrid>
       <w:tr>
         <w:trPr>
@@ -262,7 +264,7 @@
         </w:trPr>
         <w:tc>
           <w:tcPr>
-            <w:tcW w:type="dxa" w:w="2835"/>
+            <w:tcW w:type="dxa" w:w="2268"/>
             <w:tcBorders>
               <w:bottom w:val="single" w:sz="6" w:color="000000"/>
             </w:tcBorders>
@@ -286,7 +288,7 @@
         </w:tc>
         <w:tc>
           <w:tcPr>
-            <w:tcW w:type="dxa" w:w="1134"/>
+            <w:tcW w:type="dxa" w:w="1049"/>
             <w:tcBorders>
               <w:bottom w:val="single" w:sz="6" w:color="000000"/>
             </w:tcBorders>
@@ -310,7 +312,7 @@
         </w:tc>
         <w:tc>
           <w:tcPr>
-            <w:tcW w:type="dxa" w:w="1701"/>
+            <w:tcW w:type="dxa" w:w="1049"/>
             <w:tcBorders>
               <w:bottom w:val="single" w:sz="6" w:color="000000"/>
             </w:tcBorders>
@@ -328,13 +330,29 @@
                 <w:b/>
                 <w:sz w:val="20"/>
               </w:rPr>
-              <w:t xml:space="preserve">2100: 1.5 °C path</w:t>
+              <w:t xml:space="preserve">2050</w:t>
+            </w:r>
+            <w:r>
+              <w:rPr>
+                <w:rFonts w:ascii="Times New Roman" w:hAnsi="Times New Roman"/>
+                <w:sz w:val="20"/>
+              </w:rPr>
+              <w:br/>
+            </w:r>
+            <w:r>
+              <w:rPr>
+                <w:bCs/>
+                <w:rFonts w:ascii="Times New Roman" w:hAnsi="Times New Roman"/>
+                <w:b/>
+                <w:sz w:val="20"/>
+              </w:rPr>
+              <w:t xml:space="preserve">Net Zero 2050</w:t>
             </w:r>
           </w:p>
         </w:tc>
         <w:tc>
           <w:tcPr>
-            <w:tcW w:type="dxa" w:w="1701"/>
+            <w:tcW w:type="dxa" w:w="1049"/>
             <w:tcBorders>
               <w:bottom w:val="single" w:sz="6" w:color="000000"/>
             </w:tcBorders>
@@ -352,13 +370,29 @@
                 <w:b/>
                 <w:sz w:val="20"/>
               </w:rPr>
-              <w:t xml:space="preserve">2100: below 2 °C</w:t>
+              <w:t xml:space="preserve">2050</w:t>
+            </w:r>
+            <w:r>
+              <w:rPr>
+                <w:rFonts w:ascii="Times New Roman" w:hAnsi="Times New Roman"/>
+                <w:sz w:val="20"/>
+              </w:rPr>
+              <w:br/>
+            </w:r>
+            <w:r>
+              <w:rPr>
+                <w:bCs/>
+                <w:rFonts w:ascii="Times New Roman" w:hAnsi="Times New Roman"/>
+                <w:b/>
+                <w:sz w:val="20"/>
+              </w:rPr>
+              <w:t xml:space="preserve">Below 2 °C</w:t>
             </w:r>
           </w:p>
         </w:tc>
         <w:tc>
           <w:tcPr>
-            <w:tcW w:type="dxa" w:w="1701"/>
+            <w:tcW w:type="dxa" w:w="1049"/>
             <w:tcBorders>
               <w:bottom w:val="single" w:sz="6" w:color="000000"/>
             </w:tcBorders>
@@ -376,7 +410,103 @@
                 <w:b/>
                 <w:sz w:val="20"/>
               </w:rPr>
-              <w:t xml:space="preserve">2100: current policies</w:t>
+              <w:t xml:space="preserve">2050</w:t>
+            </w:r>
+            <w:r>
+              <w:rPr>
+                <w:rFonts w:ascii="Times New Roman" w:hAnsi="Times New Roman"/>
+                <w:sz w:val="20"/>
+              </w:rPr>
+              <w:br/>
+            </w:r>
+            <w:r>
+              <w:rPr>
+                <w:bCs/>
+                <w:rFonts w:ascii="Times New Roman" w:hAnsi="Times New Roman"/>
+                <w:b/>
+                <w:sz w:val="20"/>
+              </w:rPr>
+              <w:t xml:space="preserve">Current policies</w:t>
+            </w:r>
+          </w:p>
+        </w:tc>
+        <w:tc>
+          <w:tcPr>
+            <w:tcW w:type="dxa" w:w="1049"/>
+            <w:tcBorders>
+              <w:bottom w:val="single" w:sz="6" w:color="000000"/>
+            </w:tcBorders>
+          </w:tcPr>
+          <w:p>
+            <w:pPr>
+              <w:pStyle w:val="Compact"/>
+              <w:spacing w:after="20" w:before="20" w:line="240" w:lineRule="auto"/>
+              <w:jc w:val="center"/>
+            </w:pPr>
+            <w:r>
+              <w:rPr>
+                <w:bCs/>
+                <w:rFonts w:ascii="Times New Roman" w:hAnsi="Times New Roman"/>
+                <w:b/>
+                <w:sz w:val="20"/>
+              </w:rPr>
+              <w:t xml:space="preserve">2100</w:t>
+            </w:r>
+            <w:r>
+              <w:rPr>
+                <w:rFonts w:ascii="Times New Roman" w:hAnsi="Times New Roman"/>
+                <w:sz w:val="20"/>
+              </w:rPr>
+              <w:br/>
+            </w:r>
+            <w:r>
+              <w:rPr>
+                <w:bCs/>
+                <w:rFonts w:ascii="Times New Roman" w:hAnsi="Times New Roman"/>
+                <w:b/>
+                <w:sz w:val="20"/>
+              </w:rPr>
+              <w:t xml:space="preserve">Below 2 °C</w:t>
+            </w:r>
+          </w:p>
+        </w:tc>
+        <w:tc>
+          <w:tcPr>
+            <w:tcW w:type="dxa" w:w="1049"/>
+            <w:tcBorders>
+              <w:bottom w:val="single" w:sz="6" w:color="000000"/>
+            </w:tcBorders>
+          </w:tcPr>
+          <w:p>
+            <w:pPr>
+              <w:pStyle w:val="Compact"/>
+              <w:spacing w:after="20" w:before="20" w:line="240" w:lineRule="auto"/>
+              <w:jc w:val="center"/>
+            </w:pPr>
+            <w:r>
+              <w:rPr>
+                <w:bCs/>
+                <w:rFonts w:ascii="Times New Roman" w:hAnsi="Times New Roman"/>
+                <w:b/>
+                <w:sz w:val="20"/>
+              </w:rPr>
+              <w:t xml:space="preserve">2100</w:t>
+            </w:r>
+            <w:r>
+              <w:rPr>
+                <w:rFonts w:ascii="Times New Roman" w:hAnsi="Times New Roman"/>
+                <w:sz w:val="20"/>
+              </w:rPr>
+              <w:br/>
+            </w:r>
+            <w:r>
+              <w:rPr>
+                <w:bCs/>
+                <w:rFonts w:ascii="Times New Roman" w:hAnsi="Times New Roman"/>
+                <w:b/>
+                <w:sz w:val="20"/>
+              </w:rPr>
+              <w:t xml:space="preserve">Current policies</w:t>
             </w:r>
           </w:p>
         </w:tc>
@@ -384,7 +514,7 @@
       <w:tr>
         <w:tc>
           <w:tcPr>
-            <w:tcW w:type="dxa" w:w="2835"/>
+            <w:tcW w:type="dxa" w:w="2268"/>
           </w:tcPr>
           <w:p>
             <w:pPr>
@@ -403,7 +533,7 @@
         </w:tc>
         <w:tc>
           <w:tcPr>
-            <w:tcW w:type="dxa" w:w="1134"/>
+            <w:tcW w:type="dxa" w:w="1049"/>
           </w:tcPr>
           <w:p>
             <w:pPr>
@@ -430,13 +560,13 @@
                 <w:rFonts w:ascii="Times New Roman" w:hAnsi="Times New Roman"/>
                 <w:sz w:val="20"/>
               </w:rPr>
-              <w:t xml:space="preserve">[25–38]</w:t>
+              <w:t xml:space="preserve">[25 to 38]</w:t>
             </w:r>
           </w:p>
         </w:tc>
         <w:tc>
           <w:tcPr>
-            <w:tcW w:type="dxa" w:w="1701"/>
+            <w:tcW w:type="dxa" w:w="1049"/>
           </w:tcPr>
           <w:p>
             <w:pPr>
@@ -449,7 +579,7 @@
                 <w:rFonts w:ascii="Times New Roman" w:hAnsi="Times New Roman"/>
                 <w:sz w:val="20"/>
               </w:rPr>
-              <w:t xml:space="preserve">32</w:t>
+              <w:t xml:space="preserve">41</w:t>
             </w:r>
             <w:r>
               <w:rPr>
@@ -463,13 +593,13 @@
                 <w:rFonts w:ascii="Times New Roman" w:hAnsi="Times New Roman"/>
                 <w:sz w:val="20"/>
               </w:rPr>
-              <w:t xml:space="preserve">[24–50]</w:t>
+              <w:t xml:space="preserve">[29 to 60]</w:t>
             </w:r>
           </w:p>
         </w:tc>
         <w:tc>
           <w:tcPr>
-            <w:tcW w:type="dxa" w:w="1701"/>
+            <w:tcW w:type="dxa" w:w="1049"/>
           </w:tcPr>
           <w:p>
             <w:pPr>
@@ -482,7 +612,7 @@
                 <w:rFonts w:ascii="Times New Roman" w:hAnsi="Times New Roman"/>
                 <w:sz w:val="20"/>
               </w:rPr>
-              <w:t xml:space="preserve">42</w:t>
+              <w:t xml:space="preserve">45</w:t>
             </w:r>
             <w:r>
               <w:rPr>
@@ -496,13 +626,13 @@
                 <w:rFonts w:ascii="Times New Roman" w:hAnsi="Times New Roman"/>
                 <w:sz w:val="20"/>
               </w:rPr>
-              <w:t xml:space="preserve">[29–72]</w:t>
+              <w:t xml:space="preserve">[33 to 69]</w:t>
             </w:r>
           </w:p>
         </w:tc>
         <w:tc>
           <w:tcPr>
-            <w:tcW w:type="dxa" w:w="1701"/>
+            <w:tcW w:type="dxa" w:w="1049"/>
           </w:tcPr>
           <w:p>
             <w:pPr>
@@ -515,6 +645,72 @@
                 <w:rFonts w:ascii="Times New Roman" w:hAnsi="Times New Roman"/>
                 <w:sz w:val="20"/>
               </w:rPr>
+              <w:t xml:space="preserve">54</w:t>
+            </w:r>
+            <w:r>
+              <w:rPr>
+                <w:rFonts w:ascii="Times New Roman" w:hAnsi="Times New Roman"/>
+                <w:sz w:val="20"/>
+              </w:rPr>
+              <w:br/>
+            </w:r>
+            <w:r>
+              <w:rPr>
+                <w:rFonts w:ascii="Times New Roman" w:hAnsi="Times New Roman"/>
+                <w:sz w:val="20"/>
+              </w:rPr>
+              <w:t xml:space="preserve">[41 to 84]</w:t>
+            </w:r>
+          </w:p>
+        </w:tc>
+        <w:tc>
+          <w:tcPr>
+            <w:tcW w:type="dxa" w:w="1049"/>
+          </w:tcPr>
+          <w:p>
+            <w:pPr>
+              <w:pStyle w:val="Compact"/>
+              <w:spacing w:after="20" w:before="20" w:line="240" w:lineRule="auto"/>
+              <w:jc w:val="center"/>
+            </w:pPr>
+            <w:r>
+              <w:rPr>
+                <w:rFonts w:ascii="Times New Roman" w:hAnsi="Times New Roman"/>
+                <w:sz w:val="20"/>
+              </w:rPr>
+              <w:t xml:space="preserve">42</w:t>
+            </w:r>
+            <w:r>
+              <w:rPr>
+                <w:rFonts w:ascii="Times New Roman" w:hAnsi="Times New Roman"/>
+                <w:sz w:val="20"/>
+              </w:rPr>
+              <w:br/>
+            </w:r>
+            <w:r>
+              <w:rPr>
+                <w:rFonts w:ascii="Times New Roman" w:hAnsi="Times New Roman"/>
+                <w:sz w:val="20"/>
+              </w:rPr>
+              <w:t xml:space="preserve">[29 to 72]</w:t>
+            </w:r>
+          </w:p>
+        </w:tc>
+        <w:tc>
+          <w:tcPr>
+            <w:tcW w:type="dxa" w:w="1049"/>
+          </w:tcPr>
+          <w:p>
+            <w:pPr>
+              <w:pStyle w:val="Compact"/>
+              <w:spacing w:after="20" w:before="20" w:line="240" w:lineRule="auto"/>
+              <w:jc w:val="center"/>
+            </w:pPr>
+            <w:r>
+              <w:rPr>
+                <w:rFonts w:ascii="Times New Roman" w:hAnsi="Times New Roman"/>
+                <w:sz w:val="20"/>
+              </w:rPr>
               <w:t xml:space="preserve">91</w:t>
             </w:r>
             <w:r>
@@ -529,7 +725,7 @@
                 <w:rFonts w:ascii="Times New Roman" w:hAnsi="Times New Roman"/>
                 <w:sz w:val="20"/>
               </w:rPr>
-              <w:t xml:space="preserve">[59–134]</w:t>
+              <w:t xml:space="preserve">[59 to 134]</w:t>
             </w:r>
           </w:p>
         </w:tc>
@@ -537,7 +733,7 @@
       <w:tr>
         <w:tc>
           <w:tcPr>
-            <w:tcW w:type="dxa" w:w="2835"/>
+            <w:tcW w:type="dxa" w:w="2268"/>
           </w:tcPr>
           <w:p>
             <w:pPr>
@@ -556,7 +752,7 @@
         </w:tc>
         <w:tc>
           <w:tcPr>
-            <w:tcW w:type="dxa" w:w="1134"/>
+            <w:tcW w:type="dxa" w:w="1049"/>
           </w:tcPr>
           <w:p>
             <w:pPr>
@@ -583,13 +779,13 @@
                 <w:rFonts w:ascii="Times New Roman" w:hAnsi="Times New Roman"/>
                 <w:sz w:val="20"/>
               </w:rPr>
-              <w:t xml:space="preserve">[72–97]</w:t>
+              <w:t xml:space="preserve">[72 to 97]</w:t>
             </w:r>
           </w:p>
         </w:tc>
         <w:tc>
           <w:tcPr>
-            <w:tcW w:type="dxa" w:w="1701"/>
+            <w:tcW w:type="dxa" w:w="1049"/>
           </w:tcPr>
           <w:p>
             <w:pPr>
@@ -602,7 +798,7 @@
                 <w:rFonts w:ascii="Times New Roman" w:hAnsi="Times New Roman"/>
                 <w:sz w:val="20"/>
               </w:rPr>
-              <w:t xml:space="preserve">87 %</w:t>
+              <w:t xml:space="preserve">97 %</w:t>
             </w:r>
             <w:r>
               <w:rPr>
@@ -616,13 +812,13 @@
                 <w:rFonts w:ascii="Times New Roman" w:hAnsi="Times New Roman"/>
                 <w:sz w:val="20"/>
               </w:rPr>
-              <w:t xml:space="preserve">[66–100]</w:t>
+              <w:t xml:space="preserve">[82 to 100]</w:t>
             </w:r>
           </w:p>
         </w:tc>
         <w:tc>
           <w:tcPr>
-            <w:tcW w:type="dxa" w:w="1701"/>
+            <w:tcW w:type="dxa" w:w="1049"/>
           </w:tcPr>
           <w:p>
             <w:pPr>
@@ -635,7 +831,7 @@
                 <w:rFonts w:ascii="Times New Roman" w:hAnsi="Times New Roman"/>
                 <w:sz w:val="20"/>
               </w:rPr>
-              <w:t xml:space="preserve">98 %</w:t>
+              <w:t xml:space="preserve">99 %</w:t>
             </w:r>
             <w:r>
               <w:rPr>
@@ -649,13 +845,13 @@
                 <w:rFonts w:ascii="Times New Roman" w:hAnsi="Times New Roman"/>
                 <w:sz w:val="20"/>
               </w:rPr>
-              <w:t xml:space="preserve">[81–100]</w:t>
+              <w:t xml:space="preserve">[85 to 100]</w:t>
             </w:r>
           </w:p>
         </w:tc>
         <w:tc>
           <w:tcPr>
-            <w:tcW w:type="dxa" w:w="1701"/>
+            <w:tcW w:type="dxa" w:w="1049"/>
           </w:tcPr>
           <w:p>
             <w:pPr>
@@ -682,7 +878,73 @@
                 <w:rFonts w:ascii="Times New Roman" w:hAnsi="Times New Roman"/>
                 <w:sz w:val="20"/>
               </w:rPr>
-              <w:t xml:space="preserve">[98–100]</w:t>
+              <w:t xml:space="preserve">[96 to 100]</w:t>
+            </w:r>
+          </w:p>
+        </w:tc>
+        <w:tc>
+          <w:tcPr>
+            <w:tcW w:type="dxa" w:w="1049"/>
+          </w:tcPr>
+          <w:p>
+            <w:pPr>
+              <w:pStyle w:val="Compact"/>
+              <w:spacing w:after="20" w:before="20" w:line="240" w:lineRule="auto"/>
+              <w:jc w:val="center"/>
+            </w:pPr>
+            <w:r>
+              <w:rPr>
+                <w:rFonts w:ascii="Times New Roman" w:hAnsi="Times New Roman"/>
+                <w:sz w:val="20"/>
+              </w:rPr>
+              <w:t xml:space="preserve">98 %</w:t>
+            </w:r>
+            <w:r>
+              <w:rPr>
+                <w:rFonts w:ascii="Times New Roman" w:hAnsi="Times New Roman"/>
+                <w:sz w:val="20"/>
+              </w:rPr>
+              <w:br/>
+            </w:r>
+            <w:r>
+              <w:rPr>
+                <w:rFonts w:ascii="Times New Roman" w:hAnsi="Times New Roman"/>
+                <w:sz w:val="20"/>
+              </w:rPr>
+              <w:t xml:space="preserve">[81 to 100]</w:t>
+            </w:r>
+          </w:p>
+        </w:tc>
+        <w:tc>
+          <w:tcPr>
+            <w:tcW w:type="dxa" w:w="1049"/>
+          </w:tcPr>
+          <w:p>
+            <w:pPr>
+              <w:pStyle w:val="Compact"/>
+              <w:spacing w:after="20" w:before="20" w:line="240" w:lineRule="auto"/>
+              <w:jc w:val="center"/>
+            </w:pPr>
+            <w:r>
+              <w:rPr>
+                <w:rFonts w:ascii="Times New Roman" w:hAnsi="Times New Roman"/>
+                <w:sz w:val="20"/>
+              </w:rPr>
+              <w:t xml:space="preserve">100 %</w:t>
+            </w:r>
+            <w:r>
+              <w:rPr>
+                <w:rFonts w:ascii="Times New Roman" w:hAnsi="Times New Roman"/>
+                <w:sz w:val="20"/>
+              </w:rPr>
+              <w:br/>
+            </w:r>
+            <w:r>
+              <w:rPr>
+                <w:rFonts w:ascii="Times New Roman" w:hAnsi="Times New Roman"/>
+                <w:sz w:val="20"/>
+              </w:rPr>
+              <w:t xml:space="preserve">[98 to 100]</w:t>
             </w:r>
           </w:p>
         </w:tc>
@@ -690,7 +952,7 @@
       <w:tr>
         <w:tc>
           <w:tcPr>
-            <w:tcW w:type="dxa" w:w="2835"/>
+            <w:tcW w:type="dxa" w:w="2268"/>
           </w:tcPr>
           <w:p>
             <w:pPr>
@@ -709,7 +971,7 @@
         </w:tc>
         <w:tc>
           <w:tcPr>
-            <w:tcW w:type="dxa" w:w="1134"/>
+            <w:tcW w:type="dxa" w:w="1049"/>
           </w:tcPr>
           <w:p>
             <w:pPr>
@@ -736,13 +998,13 @@
                 <w:rFonts w:ascii="Times New Roman" w:hAnsi="Times New Roman"/>
                 <w:sz w:val="20"/>
               </w:rPr>
-              <w:t xml:space="preserve">[−7, +29]</w:t>
+              <w:t xml:space="preserve">[−7 to +29]</w:t>
             </w:r>
           </w:p>
         </w:tc>
         <w:tc>
           <w:tcPr>
-            <w:tcW w:type="dxa" w:w="1701"/>
+            <w:tcW w:type="dxa" w:w="1049"/>
           </w:tcPr>
           <w:p>
             <w:pPr>
@@ -755,7 +1017,7 @@
                 <w:rFonts w:ascii="Times New Roman" w:hAnsi="Times New Roman"/>
                 <w:sz w:val="20"/>
               </w:rPr>
-              <w:t xml:space="preserve">+9 %</w:t>
+              <w:t xml:space="preserve">+16 %</w:t>
             </w:r>
             <w:r>
               <w:rPr>
@@ -769,13 +1031,13 @@
                 <w:rFonts w:ascii="Times New Roman" w:hAnsi="Times New Roman"/>
                 <w:sz w:val="20"/>
               </w:rPr>
-              <w:t xml:space="preserve">[−6, +38]</w:t>
+              <w:t xml:space="preserve">[−1 to +49]</w:t>
             </w:r>
           </w:p>
         </w:tc>
         <w:tc>
           <w:tcPr>
-            <w:tcW w:type="dxa" w:w="1701"/>
+            <w:tcW w:type="dxa" w:w="1049"/>
           </w:tcPr>
           <w:p>
             <w:pPr>
@@ -788,7 +1050,7 @@
                 <w:rFonts w:ascii="Times New Roman" w:hAnsi="Times New Roman"/>
                 <w:sz w:val="20"/>
               </w:rPr>
-              <w:t xml:space="preserve">+17 %</w:t>
+              <w:t xml:space="preserve">+18 %</w:t>
             </w:r>
             <w:r>
               <w:rPr>
@@ -802,13 +1064,13 @@
                 <w:rFonts w:ascii="Times New Roman" w:hAnsi="Times New Roman"/>
                 <w:sz w:val="20"/>
               </w:rPr>
-              <w:t xml:space="preserve">[−1, +54]</w:t>
+              <w:t xml:space="preserve">[0 to +55]</w:t>
             </w:r>
           </w:p>
         </w:tc>
         <w:tc>
           <w:tcPr>
-            <w:tcW w:type="dxa" w:w="1701"/>
+            <w:tcW w:type="dxa" w:w="1049"/>
           </w:tcPr>
           <w:p>
             <w:pPr>
@@ -821,6 +1083,72 @@
                 <w:rFonts w:ascii="Times New Roman" w:hAnsi="Times New Roman"/>
                 <w:sz w:val="20"/>
               </w:rPr>
+              <w:t xml:space="preserve">+24 %</w:t>
+            </w:r>
+            <w:r>
+              <w:rPr>
+                <w:rFonts w:ascii="Times New Roman" w:hAnsi="Times New Roman"/>
+                <w:sz w:val="20"/>
+              </w:rPr>
+              <w:br/>
+            </w:r>
+            <w:r>
+              <w:rPr>
+                <w:rFonts w:ascii="Times New Roman" w:hAnsi="Times New Roman"/>
+                <w:sz w:val="20"/>
+              </w:rPr>
+              <w:t xml:space="preserve">[−1 to +67]</w:t>
+            </w:r>
+          </w:p>
+        </w:tc>
+        <w:tc>
+          <w:tcPr>
+            <w:tcW w:type="dxa" w:w="1049"/>
+          </w:tcPr>
+          <w:p>
+            <w:pPr>
+              <w:pStyle w:val="Compact"/>
+              <w:spacing w:after="20" w:before="20" w:line="240" w:lineRule="auto"/>
+              <w:jc w:val="center"/>
+            </w:pPr>
+            <w:r>
+              <w:rPr>
+                <w:rFonts w:ascii="Times New Roman" w:hAnsi="Times New Roman"/>
+                <w:sz w:val="20"/>
+              </w:rPr>
+              <w:t xml:space="preserve">+17 %</w:t>
+            </w:r>
+            <w:r>
+              <w:rPr>
+                <w:rFonts w:ascii="Times New Roman" w:hAnsi="Times New Roman"/>
+                <w:sz w:val="20"/>
+              </w:rPr>
+              <w:br/>
+            </w:r>
+            <w:r>
+              <w:rPr>
+                <w:rFonts w:ascii="Times New Roman" w:hAnsi="Times New Roman"/>
+                <w:sz w:val="20"/>
+              </w:rPr>
+              <w:t xml:space="preserve">[−1 to +54]</w:t>
+            </w:r>
+          </w:p>
+        </w:tc>
+        <w:tc>
+          <w:tcPr>
+            <w:tcW w:type="dxa" w:w="1049"/>
+          </w:tcPr>
+          <w:p>
+            <w:pPr>
+              <w:pStyle w:val="Compact"/>
+              <w:spacing w:after="20" w:before="20" w:line="240" w:lineRule="auto"/>
+              <w:jc w:val="center"/>
+            </w:pPr>
+            <w:r>
+              <w:rPr>
+                <w:rFonts w:ascii="Times New Roman" w:hAnsi="Times New Roman"/>
+                <w:sz w:val="20"/>
+              </w:rPr>
               <w:t xml:space="preserve">+43 %</w:t>
             </w:r>
             <w:r>
@@ -835,7 +1163,7 @@
                 <w:rFonts w:ascii="Times New Roman" w:hAnsi="Times New Roman"/>
                 <w:sz w:val="20"/>
               </w:rPr>
-              <w:t xml:space="preserve">[+5, +110]</w:t>
+              <w:t xml:space="preserve">[+5 to +110]</w:t>
             </w:r>
           </w:p>
         </w:tc>
@@ -887,7 +1215,7 @@
           <w:i/>
           <w:sz w:val="20"/>
         </w:rPr>
-        <w:t xml:space="preserve">area-weighted average. NGFS scenarios: Net Zero 2050 (1.3 °C of global warming in 2100), Below 2 °C</w:t>
+        <w:t xml:space="preserve">area-weighted average. NGFS scenarios, with global warming in 2100 as given in the CIE data: Net Zero 2050</w:t>
       </w:r>
       <w:r>
         <w:rPr>
@@ -903,7 +1231,7 @@
           <w:i/>
           <w:sz w:val="20"/>
         </w:rPr>
-        <w:t xml:space="preserve">(1.6 °C) and Current policies (2.9 °C), as given in the CIE data. Median of five climate models (18 for</w:t>
+        <w:t xml:space="preserve">(1.3 °C), Below 2 °C (1.6 °C) and Current policies (2.9 °C). Median of five climate models (18 for</w:t>
       </w:r>
       <w:r>
         <w:rPr>
@@ -919,7 +1247,7 @@
           <w:i/>
           <w:sz w:val="20"/>
         </w:rPr>
-        <w:t xml:space="preserve">extreme rainfall); 5–95 % range in brackets. Values after 2060 are indicative.</w:t>
+        <w:t xml:space="preserve">extreme rainfall); 5–95 % range in brackets. The tool marks values after 2060 as indicative.</w:t>
       </w:r>
     </w:p>
     <w:p>
@@ -937,7 +1265,7 @@
         <w:t xml:space="preserve"> </w:t>
       </w:r>
       <w:r>
-        <w:t xml:space="preserve">The number of days with a daily maximum heat index above 40 °C, the</w:t>
+        <w:t xml:space="preserve">The indicator counts days on which the daily maximum heat index exceeds the</w:t>
       </w:r>
       <w:r>
         <w:t xml:space="preserve"> </w:t>
@@ -955,19 +1283,30 @@
         <w:t xml:space="preserve"> </w:t>
       </w:r>
       <w:r>
-        <w:t xml:space="preserve">threshold used in heat warnings, is projected to rise from about 31 today to 91 by 2100 under current</w:t>
-      </w:r>
-      <w:r>
-        <w:t xml:space="preserve"> </w:t>
-      </w:r>
-      <w:r>
-        <w:t xml:space="preserve">policies, against 42 below 2 °C. The two pathways only separate after 2030 (Figure 1). This matters because</w:t>
-      </w:r>
-      <w:r>
-        <w:t xml:space="preserve"> </w:t>
-      </w:r>
-      <w:r>
-        <w:t xml:space="preserve">agriculture employs over 80 % of the population (</w:t>
+        <w:t xml:space="preserve">threshold of 40 °C (</w:t>
+      </w:r>
+      <w:hyperlink r:id="rId21">
+        <w:r>
+          <w:rPr>
+            <w:rStyle w:val="Hyperlink"/>
+          </w:rPr>
+          <w:t xml:space="preserve">Climate Analytics, 2026</w:t>
+        </w:r>
+      </w:hyperlink>
+      <w:r>
+        <w:t xml:space="preserve">). By 2050, models project about 54 such days a year under Current policies,</w:t>
+      </w:r>
+      <w:r>
+        <w:t xml:space="preserve"> </w:t>
+      </w:r>
+      <w:r>
+        <w:t xml:space="preserve">against 45 under Below 2 °C and 41 under Net Zero 2050; by 2100 the gap widens to 91 against 42 days. This</w:t>
+      </w:r>
+      <w:r>
+        <w:t xml:space="preserve"> </w:t>
+      </w:r>
+      <w:r>
+        <w:t xml:space="preserve">matters because agriculture employs over 80 % of the population (</w:t>
       </w:r>
       <w:hyperlink r:id="rId22">
         <w:r>
@@ -978,7 +1317,13 @@
         </w:r>
       </w:hyperlink>
       <w:r>
-        <w:t xml:space="preserve">), and farming and herding are outdoor work.</w:t>
+        <w:t xml:space="preserve">), and farming and herding are</w:t>
+      </w:r>
+      <w:r>
+        <w:t xml:space="preserve"> </w:t>
+      </w:r>
+      <w:r>
+        <w:t xml:space="preserve">outdoor work.</w:t>
       </w:r>
     </w:p>
     <w:p>
@@ -1002,31 +1347,25 @@
         <w:t xml:space="preserve"> </w:t>
       </w:r>
       <w:r>
-        <w:t xml:space="preserve">already experiences at least one month of severe drought a year, and models project 98 to 100 % by 2100 both</w:t>
-      </w:r>
-      <w:r>
-        <w:t xml:space="preserve"> </w:t>
-      </w:r>
-      <w:r>
-        <w:t xml:space="preserve">below 2 °C and under current policies. The 1.5 °C pathway has a lower central value (87 %), but its range</w:t>
-      </w:r>
-      <w:r>
-        <w:t xml:space="preserve"> </w:t>
-      </w:r>
-      <w:r>
-        <w:t xml:space="preserve">(66–100 %) largely overlaps that of the below-2 °C scenario (81–100 %), so the models do not clearly</w:t>
-      </w:r>
-      <w:r>
-        <w:t xml:space="preserve"> </w:t>
-      </w:r>
-      <w:r>
-        <w:t xml:space="preserve">separate the two. Rain-fed millet, sorghum and pastures are therefore likely to face more frequent water stress</w:t>
-      </w:r>
-      <w:r>
-        <w:t xml:space="preserve"> </w:t>
-      </w:r>
-      <w:r>
-        <w:t xml:space="preserve">whatever the global outcome.</w:t>
+        <w:t xml:space="preserve">already experiences at least one month of severe drought a year; models project about 96 % by 2030 and 97 to</w:t>
+      </w:r>
+      <w:r>
+        <w:t xml:space="preserve"> </w:t>
+      </w:r>
+      <w:r>
+        <w:t xml:space="preserve">100 % by 2050 in all three scenarios, with largely overlapping ranges. On this indicator, limiting warming</w:t>
+      </w:r>
+      <w:r>
+        <w:t xml:space="preserve"> </w:t>
+      </w:r>
+      <w:r>
+        <w:t xml:space="preserve">makes little difference before mid-century, so rain-fed millet, sorghum and pastures are likely to face more</w:t>
+      </w:r>
+      <w:r>
+        <w:t xml:space="preserve"> </w:t>
+      </w:r>
+      <w:r>
+        <w:t xml:space="preserve">frequent water stress whatever the global outcome.</w:t>
       </w:r>
     </w:p>
     <w:p>
@@ -1044,25 +1383,25 @@
         <w:t xml:space="preserve"> </w:t>
       </w:r>
       <w:r>
-        <w:t xml:space="preserve">The heaviest five-day rainfall of the year could intensify by about 43 % by 2100</w:t>
-      </w:r>
-      <w:r>
-        <w:t xml:space="preserve"> </w:t>
-      </w:r>
-      <w:r>
-        <w:t xml:space="preserve">under current policies, against 17 % below 2 °C, although the model range is wide. Heavier downpours would</w:t>
-      </w:r>
-      <w:r>
-        <w:t xml:space="preserve"> </w:t>
-      </w:r>
-      <w:r>
-        <w:t xml:space="preserve">raise flood risk in Niamey and the Niger River valley, where people, infrastructure and irrigated rice are</w:t>
-      </w:r>
-      <w:r>
-        <w:t xml:space="preserve"> </w:t>
-      </w:r>
-      <w:r>
-        <w:t xml:space="preserve">concentrated.</w:t>
+        <w:t xml:space="preserve">The heaviest five-day rainfall of the year could intensify by about 24 % by 2050</w:t>
+      </w:r>
+      <w:r>
+        <w:t xml:space="preserve"> </w:t>
+      </w:r>
+      <w:r>
+        <w:t xml:space="preserve">under Current policies, against 18 % under Below 2 °C; by 2100 the projected change is +43 % against</w:t>
+      </w:r>
+      <w:r>
+        <w:t xml:space="preserve"> </w:t>
+      </w:r>
+      <w:r>
+        <w:t xml:space="preserve">+17 %, although ranges are wide. Heavier downpours would raise flood risk in Niamey and the Niger River valley,</w:t>
+      </w:r>
+      <w:r>
+        <w:t xml:space="preserve"> </w:t>
+      </w:r>
+      <w:r>
+        <w:t xml:space="preserve">where people, infrastructure and irrigated rice are concentrated.</w:t>
       </w:r>
     </w:p>
     <w:p>
@@ -1072,7 +1411,7 @@
       <w:r>
         <w:drawing>
           <wp:inline>
-            <wp:extent cx="5760720" cy="2651759"/>
+            <wp:extent cx="5760720" cy="2331720"/>
             <wp:effectExtent b="0" l="0" r="0" t="0"/>
             <wp:docPr descr="" title="" id="24" name="Picture"/>
             <a:graphic>
@@ -1093,7 +1432,7 @@
                   <pic:spPr bwMode="auto">
                     <a:xfrm>
                       <a:off x="0" y="0"/>
-                      <a:ext cx="5760720" cy="2651759"/>
+                      <a:ext cx="5760720" cy="2331720"/>
                     </a:xfrm>
                     <a:prstGeom prst="rect">
                       <a:avLst/>
@@ -1123,7 +1462,7 @@
           <w:bCs/>
           <w:b/>
         </w:rPr>
-        <w:t xml:space="preserve">Figure 1. Days of dangerous heat per year in Niger, below 2 °C and under current</w:t>
+        <w:t xml:space="preserve">Figure 1. Days of dangerous heat per year in Niger under Below 2 °C and Current</w:t>
       </w:r>
       <w:r>
         <w:rPr>
@@ -1143,31 +1482,25 @@
         <w:t xml:space="preserve"> </w:t>
       </w:r>
       <w:r>
-        <w:t xml:space="preserve">The curves are identical until about 2030; the gap that opens afterwards is what limiting warming</w:t>
-      </w:r>
-      <w:r>
-        <w:t xml:space="preserve"> </w:t>
-      </w:r>
-      <w:r>
-        <w:t xml:space="preserve">avoids. Open circles mark the years in which global warming reaches +1.5 °C (about 2030), +2.0 °C</w:t>
-      </w:r>
-      <w:r>
-        <w:t xml:space="preserve"> </w:t>
-      </w:r>
-      <w:r>
-        <w:t xml:space="preserve">(about 2049) and +2.5 °C (about 2074) on the current-policies pathway. Shaded bands show the 5–95 % model</w:t>
-      </w:r>
-      <w:r>
-        <w:t xml:space="preserve"> </w:t>
-      </w:r>
-      <w:r>
-        <w:t xml:space="preserve">range; dashed lines and the grey area show indicative results after 2060. Chart drawn from Climate Impact</w:t>
-      </w:r>
-      <w:r>
-        <w:t xml:space="preserve"> </w:t>
-      </w:r>
-      <w:r>
-        <w:t xml:space="preserve">Explorer data (</w:t>
+        <w:t xml:space="preserve">The curves separate after 2030; the gap is what limiting warming avoids. Open circles mark the years</w:t>
+      </w:r>
+      <w:r>
+        <w:t xml:space="preserve"> </w:t>
+      </w:r>
+      <w:r>
+        <w:t xml:space="preserve">in which global warming reaches +1.5 °C (about 2030), +2.0 °C (2049) and +2.5 °C (2074) under</w:t>
+      </w:r>
+      <w:r>
+        <w:t xml:space="preserve"> </w:t>
+      </w:r>
+      <w:r>
+        <w:t xml:space="preserve">Current policies. Bands: 5–95 % model range; dashed lines: indicative results after 2060. Chart drawn from</w:t>
+      </w:r>
+      <w:r>
+        <w:t xml:space="preserve"> </w:t>
+      </w:r>
+      <w:r>
+        <w:t xml:space="preserve">Climate Impact Explorer data (</w:t>
       </w:r>
       <w:hyperlink r:id="rId21">
         <w:r>
@@ -1196,31 +1529,49 @@
         <w:pStyle w:val="FirstParagraph"/>
       </w:pPr>
       <w:r>
-        <w:t xml:space="preserve">Limiting warming is in Niger’s direct interest. Compared with current policies, a below-2 °C world would</w:t>
-      </w:r>
-      <w:r>
-        <w:t xml:space="preserve"> </w:t>
-      </w:r>
-      <w:r>
-        <w:t xml:space="preserve">avoid about 49 days of dangerous heat a year by 2100 and reduce the projected intensification of extreme rainfall</w:t>
-      </w:r>
-      <w:r>
-        <w:t xml:space="preserve"> </w:t>
-      </w:r>
-      <w:r>
-        <w:t xml:space="preserve">from 43 % to 17 %; a 1.5 °C pathway would keep heat close to today’s level. The World Bank estimates that</w:t>
-      </w:r>
-      <w:r>
-        <w:t xml:space="preserve"> </w:t>
-      </w:r>
-      <w:r>
-        <w:t xml:space="preserve">climate change could reduce Niger’s annual GDP by 2.2 % in wetter scenarios and by 11.9 % in drier ones by</w:t>
-      </w:r>
-      <w:r>
-        <w:t xml:space="preserve"> </w:t>
-      </w:r>
-      <w:r>
-        <w:t xml:space="preserve">2050 (</w:t>
+        <w:t xml:space="preserve">Compared with Current policies, Below 2 °C would avoid about</w:t>
+      </w:r>
+      <w:r>
+        <w:t xml:space="preserve"> </w:t>
+      </w:r>
+      <w:r>
+        <w:t xml:space="preserve">9 days of dangerous heat a year by 2050 and about 49 by 2100, and would limit the intensification of extreme</w:t>
+      </w:r>
+      <w:r>
+        <w:t xml:space="preserve"> </w:t>
+      </w:r>
+      <w:r>
+        <w:t xml:space="preserve">rainfall to +17 % instead of +43 % by 2100. Of the three indicators, heat separates the scenarios most</w:t>
+      </w:r>
+      <w:r>
+        <w:t xml:space="preserve"> </w:t>
+      </w:r>
+      <w:r>
+        <w:t xml:space="preserve">clearly: by 2100, even the low end of the Current policies range (59 days) lies above the central Below 2 °C</w:t>
+      </w:r>
+      <w:r>
+        <w:t xml:space="preserve"> </w:t>
+      </w:r>
+      <w:r>
+        <w:t xml:space="preserve">value (42 days), whereas the rainfall ranges overlap. The World Bank estimates that climate change could reduce</w:t>
+      </w:r>
+      <w:r>
+        <w:t xml:space="preserve"> </w:t>
+      </w:r>
+      <w:r>
+        <w:t xml:space="preserve">Niger’s annual GDP by 2.2 % in wetter scenarios and by 11.9 % in drier ones by 2050. It links extreme</w:t>
+      </w:r>
+      <w:r>
+        <w:t xml:space="preserve"> </w:t>
+      </w:r>
+      <w:r>
+        <w:t xml:space="preserve">weather to low agricultural production, high food prices and food insecurity, and notes growing competition</w:t>
+      </w:r>
+      <w:r>
+        <w:t xml:space="preserve"> </w:t>
+      </w:r>
+      <w:r>
+        <w:t xml:space="preserve">between farmers and pastoralists for scarce resources (</w:t>
       </w:r>
       <w:hyperlink r:id="rId27">
         <w:r>
@@ -1231,31 +1582,19 @@
         </w:r>
       </w:hyperlink>
       <w:r>
-        <w:t xml:space="preserve">). Given the country’s dependence on rain-fed farming and herding, these losses are likely to</w:t>
-      </w:r>
-      <w:r>
-        <w:t xml:space="preserve"> </w:t>
-      </w:r>
-      <w:r>
-        <w:t xml:space="preserve">cascade: a hot, dry year cuts harvests and pasture, raises grain prices, forces households to sell livestock,</w:t>
-      </w:r>
-      <w:r>
-        <w:t xml:space="preserve"> </w:t>
-      </w:r>
-      <w:r>
-        <w:t xml:space="preserve">and can deepen malnutrition and tensions between farmers and herders.</w:t>
-      </w:r>
-      <w:r>
-        <w:t xml:space="preserve"> </w:t>
-      </w:r>
-      <w:r>
-        <w:t xml:space="preserve">Because drought is projected to spread in every scenario, Niger should defend the 1.5 °C goal in the</w:t>
-      </w:r>
-      <w:r>
-        <w:t xml:space="preserve"> </w:t>
-      </w:r>
-      <w:r>
-        <w:t xml:space="preserve">negotiations while seeking adaptation finance for drought-tolerant crops, water harvesting and early warning.</w:t>
+        <w:t xml:space="preserve">). Because drought is projected to spread in</w:t>
+      </w:r>
+      <w:r>
+        <w:t xml:space="preserve"> </w:t>
+      </w:r>
+      <w:r>
+        <w:t xml:space="preserve">every scenario, Niger should defend the 1.5 °C goal in the negotiations while seeking adaptation finance for</w:t>
+      </w:r>
+      <w:r>
+        <w:t xml:space="preserve"> </w:t>
+      </w:r>
+      <w:r>
+        <w:t xml:space="preserve">drought-tolerant crops, water harvesting and early warning.</w:t>
       </w:r>
     </w:p>
     <w:bookmarkEnd w:id="28"/>
@@ -1273,25 +1612,19 @@
         <w:pStyle w:val="FirstParagraph"/>
       </w:pPr>
       <w:r>
-        <w:t xml:space="preserve">These figures are projections, not forecasts, and model ranges are wide (59 to 134 heat days in 2100 under</w:t>
-      </w:r>
-      <w:r>
-        <w:t xml:space="preserve"> </w:t>
-      </w:r>
-      <w:r>
-        <w:t xml:space="preserve">current policies). The heat index relies on an estimate of humidity, and the drought indicator counts a single</w:t>
-      </w:r>
-      <w:r>
-        <w:t xml:space="preserve"> </w:t>
-      </w:r>
-      <w:r>
-        <w:t xml:space="preserve">month of drought, so it saturates. Given Niger’s high vulnerability, actual impacts may exceed what these hazard</w:t>
-      </w:r>
-      <w:r>
-        <w:t xml:space="preserve"> </w:t>
-      </w:r>
-      <w:r>
-        <w:t xml:space="preserve">indicators suggest.</w:t>
+        <w:t xml:space="preserve">These are projections, not forecasts, with wide model ranges; this memo emphasises 2050 because results after</w:t>
+      </w:r>
+      <w:r>
+        <w:t xml:space="preserve"> </w:t>
+      </w:r>
+      <w:r>
+        <w:t xml:space="preserve">2060 are indicative. The heat index relies on estimated humidity, and the drought indicator saturates. Given</w:t>
+      </w:r>
+      <w:r>
+        <w:t xml:space="preserve"> </w:t>
+      </w:r>
+      <w:r>
+        <w:t xml:space="preserve">Niger’s high vulnerability, actual impacts may exceed what these hazard indicators suggest.</w:t>
       </w:r>
     </w:p>
     <w:bookmarkEnd w:id="29"/>
@@ -1410,7 +1743,7 @@
         <w:t xml:space="preserve"> </w:t>
       </w:r>
       <w:r>
-        <w:t xml:space="preserve">in Niger [Press release].</w:t>
+        <w:t xml:space="preserve">in Niger [Press release, posted online 1 July 2024].</w:t>
       </w:r>
       <w:r>
         <w:t xml:space="preserve"> </w:t>

</xml_diff>

<commit_message>
Note Niger : capture du CIE comme figure unique, message aligné sur les preuves
- Figure : capture originale du CIE en pleine largeur (recadrée,
  agrandie), légende décrivant ce qu'elle montre ; graphique redessiné
  retiré (tools/make_figure.py conservé).
- Message clé : pluies extrêmes présentées avec chevauchement des
  fourchettes ; 2050 au premier plan, 2100 signalé comme indicatif.
- Tableau ramené à aujourd'hui et aux trois scénarios en 2050.
- Net Zero 2050 utilisé dans le texte pour justifier l'objectif 1,5 °C.
- Nombre de modèles retiré de la note du tableau (non donné par
  l'export en séries temporelles).

Co-Authored-By: Claude Opus 5.5 <noreply@anthropic.com>
Claude-Session: https://claude.ai/code/session_01KUsbuaysKhPQSJCGSc45ce
</commit_message>
<xml_diff>
--- a/devoir-niger/memo-final/word/Niger_Policy_Memo.docx
+++ b/devoir-niger/memo-final/word/Niger_Policy_Memo.docx
@@ -196,31 +196,31 @@
         <w:pStyle w:val="FirstParagraph"/>
       </w:pPr>
       <w:r>
-        <w:t xml:space="preserve">Models indicate that dangerous heat in Niger is projected to rise in every scenario, but far less if warming is</w:t>
-      </w:r>
-      <w:r>
-        <w:t xml:space="preserve"> </w:t>
-      </w:r>
-      <w:r>
-        <w:t xml:space="preserve">limited: about 54 days a year by 2050 under Current policies against 45 under Below 2 °C (31 today), a gap</w:t>
-      </w:r>
-      <w:r>
-        <w:t xml:space="preserve"> </w:t>
-      </w:r>
-      <w:r>
-        <w:t xml:space="preserve">that widens to 91 against 42 days by 2100. Extreme rainfall follows the same pattern, whereas severe drought is</w:t>
-      </w:r>
-      <w:r>
-        <w:t xml:space="preserve"> </w:t>
-      </w:r>
-      <w:r>
-        <w:t xml:space="preserve">projected to affect almost all of the country by 2050 in all three scenarios. Niger therefore has a direct</w:t>
-      </w:r>
-      <w:r>
-        <w:t xml:space="preserve"> </w:t>
-      </w:r>
-      <w:r>
-        <w:t xml:space="preserve">interest both in faster global emission cuts and in adaptation finance now.</w:t>
+        <w:t xml:space="preserve">Models indicate that dangerous heat in Niger is projected to rise from about 31 days a year today to 54 by 2050</w:t>
+      </w:r>
+      <w:r>
+        <w:t xml:space="preserve"> </w:t>
+      </w:r>
+      <w:r>
+        <w:t xml:space="preserve">under Current policies, against 45 under Below 2 °C and 41 under Net Zero 2050, the scenario consistent with</w:t>
+      </w:r>
+      <w:r>
+        <w:t xml:space="preserve"> </w:t>
+      </w:r>
+      <w:r>
+        <w:t xml:space="preserve">the 1.5 °C goal. Extreme rainfall is also projected to intensify more under Current policies, but model ranges</w:t>
+      </w:r>
+      <w:r>
+        <w:t xml:space="preserve"> </w:t>
+      </w:r>
+      <w:r>
+        <w:t xml:space="preserve">overlap, while severe drought is projected to affect almost the whole country in all three scenarios. Niger</w:t>
+      </w:r>
+      <w:r>
+        <w:t xml:space="preserve"> </w:t>
+      </w:r>
+      <w:r>
+        <w:t xml:space="preserve">therefore has a direct interest both in faster global emission cuts and in adaptation finance now.</w:t>
       </w:r>
     </w:p>
     <w:bookmarkEnd w:id="20"/>
@@ -250,13 +250,11 @@
         <w:tblLayout w:type="fixed"/>
       </w:tblPr>
       <w:tblGrid>
-        <w:gridCol w:w="2268"/>
-        <w:gridCol w:w="1048"/>
-        <w:gridCol w:w="1048"/>
-        <w:gridCol w:w="1048"/>
-        <w:gridCol w:w="1048"/>
-        <w:gridCol w:w="1048"/>
-        <w:gridCol w:w="1048"/>
+        <w:gridCol w:w="3628"/>
+        <w:gridCol w:w="1190"/>
+        <w:gridCol w:w="1417"/>
+        <w:gridCol w:w="1417"/>
+        <w:gridCol w:w="1417"/>
       </w:tblGrid>
       <w:tr>
         <w:trPr>
@@ -264,7 +262,7 @@
         </w:trPr>
         <w:tc>
           <w:tcPr>
-            <w:tcW w:type="dxa" w:w="2268"/>
+            <w:tcW w:type="dxa" w:w="3628"/>
             <w:tcBorders>
               <w:bottom w:val="single" w:sz="6" w:color="000000"/>
             </w:tcBorders>
@@ -288,7 +286,7 @@
         </w:tc>
         <w:tc>
           <w:tcPr>
-            <w:tcW w:type="dxa" w:w="1049"/>
+            <w:tcW w:type="dxa" w:w="1191"/>
             <w:tcBorders>
               <w:bottom w:val="single" w:sz="6" w:color="000000"/>
             </w:tcBorders>
@@ -312,7 +310,7 @@
         </w:tc>
         <w:tc>
           <w:tcPr>
-            <w:tcW w:type="dxa" w:w="1049"/>
+            <w:tcW w:type="dxa" w:w="1417"/>
             <w:tcBorders>
               <w:bottom w:val="single" w:sz="6" w:color="000000"/>
             </w:tcBorders>
@@ -330,29 +328,13 @@
                 <w:b/>
                 <w:sz w:val="20"/>
               </w:rPr>
-              <w:t xml:space="preserve">2050</w:t>
-            </w:r>
-            <w:r>
-              <w:rPr>
-                <w:rFonts w:ascii="Times New Roman" w:hAnsi="Times New Roman"/>
-                <w:sz w:val="20"/>
-              </w:rPr>
-              <w:br/>
-            </w:r>
-            <w:r>
-              <w:rPr>
-                <w:bCs/>
-                <w:rFonts w:ascii="Times New Roman" w:hAnsi="Times New Roman"/>
-                <w:b/>
-                <w:sz w:val="20"/>
-              </w:rPr>
-              <w:t xml:space="preserve">Net Zero 2050</w:t>
+              <w:t xml:space="preserve">2050: Net Zero 2050</w:t>
             </w:r>
           </w:p>
         </w:tc>
         <w:tc>
           <w:tcPr>
-            <w:tcW w:type="dxa" w:w="1049"/>
+            <w:tcW w:type="dxa" w:w="1417"/>
             <w:tcBorders>
               <w:bottom w:val="single" w:sz="6" w:color="000000"/>
             </w:tcBorders>
@@ -370,29 +352,13 @@
                 <w:b/>
                 <w:sz w:val="20"/>
               </w:rPr>
-              <w:t xml:space="preserve">2050</w:t>
-            </w:r>
-            <w:r>
-              <w:rPr>
-                <w:rFonts w:ascii="Times New Roman" w:hAnsi="Times New Roman"/>
-                <w:sz w:val="20"/>
-              </w:rPr>
-              <w:br/>
-            </w:r>
-            <w:r>
-              <w:rPr>
-                <w:bCs/>
-                <w:rFonts w:ascii="Times New Roman" w:hAnsi="Times New Roman"/>
-                <w:b/>
-                <w:sz w:val="20"/>
-              </w:rPr>
-              <w:t xml:space="preserve">Below 2 °C</w:t>
+              <w:t xml:space="preserve">2050: Below 2 °C</w:t>
             </w:r>
           </w:p>
         </w:tc>
         <w:tc>
           <w:tcPr>
-            <w:tcW w:type="dxa" w:w="1049"/>
+            <w:tcW w:type="dxa" w:w="1417"/>
             <w:tcBorders>
               <w:bottom w:val="single" w:sz="6" w:color="000000"/>
             </w:tcBorders>
@@ -410,32 +376,34 @@
                 <w:b/>
                 <w:sz w:val="20"/>
               </w:rPr>
-              <w:t xml:space="preserve">2050</w:t>
-            </w:r>
-            <w:r>
-              <w:rPr>
-                <w:rFonts w:ascii="Times New Roman" w:hAnsi="Times New Roman"/>
-                <w:sz w:val="20"/>
-              </w:rPr>
-              <w:br/>
-            </w:r>
-            <w:r>
-              <w:rPr>
-                <w:bCs/>
-                <w:rFonts w:ascii="Times New Roman" w:hAnsi="Times New Roman"/>
-                <w:b/>
-                <w:sz w:val="20"/>
-              </w:rPr>
-              <w:t xml:space="preserve">Current policies</w:t>
+              <w:t xml:space="preserve">2050: Current policies</w:t>
+            </w:r>
+          </w:p>
+        </w:tc>
+      </w:tr>
+      <w:tr>
+        <w:tc>
+          <w:tcPr>
+            <w:tcW w:type="dxa" w:w="3628"/>
+          </w:tcPr>
+          <w:p>
+            <w:pPr>
+              <w:pStyle w:val="Compact"/>
+              <w:spacing w:after="20" w:before="20" w:line="240" w:lineRule="auto"/>
+              <w:jc w:val="left"/>
+            </w:pPr>
+            <w:r>
+              <w:rPr>
+                <w:rFonts w:ascii="Times New Roman" w:hAnsi="Times New Roman"/>
+                <w:sz w:val="20"/>
+              </w:rPr>
+              <w:t xml:space="preserve">Dangerous heat: days per year with a daily maximum heat index above 40 °C</w:t>
             </w:r>
           </w:p>
         </w:tc>
         <w:tc>
           <w:tcPr>
-            <w:tcW w:type="dxa" w:w="1049"/>
-            <w:tcBorders>
-              <w:bottom w:val="single" w:sz="6" w:color="000000"/>
-            </w:tcBorders>
+            <w:tcW w:type="dxa" w:w="1191"/>
           </w:tcPr>
           <w:p>
             <w:pPr>
@@ -445,12 +413,10 @@
             </w:pPr>
             <w:r>
               <w:rPr>
-                <w:bCs/>
-                <w:rFonts w:ascii="Times New Roman" w:hAnsi="Times New Roman"/>
-                <w:b/>
-                <w:sz w:val="20"/>
-              </w:rPr>
-              <w:t xml:space="preserve">2100</w:t>
+                <w:rFonts w:ascii="Times New Roman" w:hAnsi="Times New Roman"/>
+                <w:sz w:val="20"/>
+              </w:rPr>
+              <w:t xml:space="preserve">31</w:t>
             </w:r>
             <w:r>
               <w:rPr>
@@ -461,21 +427,16 @@
             </w:r>
             <w:r>
               <w:rPr>
-                <w:bCs/>
-                <w:rFonts w:ascii="Times New Roman" w:hAnsi="Times New Roman"/>
-                <w:b/>
-                <w:sz w:val="20"/>
-              </w:rPr>
-              <w:t xml:space="preserve">Below 2 °C</w:t>
+                <w:rFonts w:ascii="Times New Roman" w:hAnsi="Times New Roman"/>
+                <w:sz w:val="20"/>
+              </w:rPr>
+              <w:t xml:space="preserve">[25 to 38]</w:t>
             </w:r>
           </w:p>
         </w:tc>
         <w:tc>
           <w:tcPr>
-            <w:tcW w:type="dxa" w:w="1049"/>
-            <w:tcBorders>
-              <w:bottom w:val="single" w:sz="6" w:color="000000"/>
-            </w:tcBorders>
+            <w:tcW w:type="dxa" w:w="1417"/>
           </w:tcPr>
           <w:p>
             <w:pPr>
@@ -485,12 +446,10 @@
             </w:pPr>
             <w:r>
               <w:rPr>
-                <w:bCs/>
-                <w:rFonts w:ascii="Times New Roman" w:hAnsi="Times New Roman"/>
-                <w:b/>
-                <w:sz w:val="20"/>
-              </w:rPr>
-              <w:t xml:space="preserve">2100</w:t>
+                <w:rFonts w:ascii="Times New Roman" w:hAnsi="Times New Roman"/>
+                <w:sz w:val="20"/>
+              </w:rPr>
+              <w:t xml:space="preserve">41</w:t>
             </w:r>
             <w:r>
               <w:rPr>
@@ -501,12 +460,76 @@
             </w:r>
             <w:r>
               <w:rPr>
-                <w:bCs/>
-                <w:rFonts w:ascii="Times New Roman" w:hAnsi="Times New Roman"/>
-                <w:b/>
-                <w:sz w:val="20"/>
-              </w:rPr>
-              <w:t xml:space="preserve">Current policies</w:t>
+                <w:rFonts w:ascii="Times New Roman" w:hAnsi="Times New Roman"/>
+                <w:sz w:val="20"/>
+              </w:rPr>
+              <w:t xml:space="preserve">[29 to 60]</w:t>
+            </w:r>
+          </w:p>
+        </w:tc>
+        <w:tc>
+          <w:tcPr>
+            <w:tcW w:type="dxa" w:w="1417"/>
+          </w:tcPr>
+          <w:p>
+            <w:pPr>
+              <w:pStyle w:val="Compact"/>
+              <w:spacing w:after="20" w:before="20" w:line="240" w:lineRule="auto"/>
+              <w:jc w:val="center"/>
+            </w:pPr>
+            <w:r>
+              <w:rPr>
+                <w:rFonts w:ascii="Times New Roman" w:hAnsi="Times New Roman"/>
+                <w:sz w:val="20"/>
+              </w:rPr>
+              <w:t xml:space="preserve">45</w:t>
+            </w:r>
+            <w:r>
+              <w:rPr>
+                <w:rFonts w:ascii="Times New Roman" w:hAnsi="Times New Roman"/>
+                <w:sz w:val="20"/>
+              </w:rPr>
+              <w:br/>
+            </w:r>
+            <w:r>
+              <w:rPr>
+                <w:rFonts w:ascii="Times New Roman" w:hAnsi="Times New Roman"/>
+                <w:sz w:val="20"/>
+              </w:rPr>
+              <w:t xml:space="preserve">[33 to 69]</w:t>
+            </w:r>
+          </w:p>
+        </w:tc>
+        <w:tc>
+          <w:tcPr>
+            <w:tcW w:type="dxa" w:w="1417"/>
+          </w:tcPr>
+          <w:p>
+            <w:pPr>
+              <w:pStyle w:val="Compact"/>
+              <w:spacing w:after="20" w:before="20" w:line="240" w:lineRule="auto"/>
+              <w:jc w:val="center"/>
+            </w:pPr>
+            <w:r>
+              <w:rPr>
+                <w:rFonts w:ascii="Times New Roman" w:hAnsi="Times New Roman"/>
+                <w:sz w:val="20"/>
+              </w:rPr>
+              <w:t xml:space="preserve">54</w:t>
+            </w:r>
+            <w:r>
+              <w:rPr>
+                <w:rFonts w:ascii="Times New Roman" w:hAnsi="Times New Roman"/>
+                <w:sz w:val="20"/>
+              </w:rPr>
+              <w:br/>
+            </w:r>
+            <w:r>
+              <w:rPr>
+                <w:rFonts w:ascii="Times New Roman" w:hAnsi="Times New Roman"/>
+                <w:sz w:val="20"/>
+              </w:rPr>
+              <w:t xml:space="preserve">[41 to 84]</w:t>
             </w:r>
           </w:p>
         </w:tc>
@@ -514,7 +537,7 @@
       <w:tr>
         <w:tc>
           <w:tcPr>
-            <w:tcW w:type="dxa" w:w="2268"/>
+            <w:tcW w:type="dxa" w:w="3628"/>
           </w:tcPr>
           <w:p>
             <w:pPr>
@@ -527,13 +550,13 @@
                 <w:rFonts w:ascii="Times New Roman" w:hAnsi="Times New Roman"/>
                 <w:sz w:val="20"/>
               </w:rPr>
-              <w:t xml:space="preserve">Dangerous heat: days per year with a daily maximum heat index above 40 °C</w:t>
+              <w:t xml:space="preserve">Severe drought: share of land with at least one month of SPEI below −1.5</w:t>
             </w:r>
           </w:p>
         </w:tc>
         <w:tc>
           <w:tcPr>
-            <w:tcW w:type="dxa" w:w="1049"/>
+            <w:tcW w:type="dxa" w:w="1191"/>
           </w:tcPr>
           <w:p>
             <w:pPr>
@@ -546,7 +569,7 @@
                 <w:rFonts w:ascii="Times New Roman" w:hAnsi="Times New Roman"/>
                 <w:sz w:val="20"/>
               </w:rPr>
-              <w:t xml:space="preserve">31</w:t>
+              <w:t xml:space="preserve">84 %</w:t>
             </w:r>
             <w:r>
               <w:rPr>
@@ -560,13 +583,13 @@
                 <w:rFonts w:ascii="Times New Roman" w:hAnsi="Times New Roman"/>
                 <w:sz w:val="20"/>
               </w:rPr>
-              <w:t xml:space="preserve">[25 to 38]</w:t>
+              <w:t xml:space="preserve">[72 to 97]</w:t>
             </w:r>
           </w:p>
         </w:tc>
         <w:tc>
           <w:tcPr>
-            <w:tcW w:type="dxa" w:w="1049"/>
+            <w:tcW w:type="dxa" w:w="1417"/>
           </w:tcPr>
           <w:p>
             <w:pPr>
@@ -579,7 +602,7 @@
                 <w:rFonts w:ascii="Times New Roman" w:hAnsi="Times New Roman"/>
                 <w:sz w:val="20"/>
               </w:rPr>
-              <w:t xml:space="preserve">41</w:t>
+              <w:t xml:space="preserve">97 %</w:t>
             </w:r>
             <w:r>
               <w:rPr>
@@ -593,13 +616,13 @@
                 <w:rFonts w:ascii="Times New Roman" w:hAnsi="Times New Roman"/>
                 <w:sz w:val="20"/>
               </w:rPr>
-              <w:t xml:space="preserve">[29 to 60]</w:t>
+              <w:t xml:space="preserve">[82 to 100]</w:t>
             </w:r>
           </w:p>
         </w:tc>
         <w:tc>
           <w:tcPr>
-            <w:tcW w:type="dxa" w:w="1049"/>
+            <w:tcW w:type="dxa" w:w="1417"/>
           </w:tcPr>
           <w:p>
             <w:pPr>
@@ -612,7 +635,7 @@
                 <w:rFonts w:ascii="Times New Roman" w:hAnsi="Times New Roman"/>
                 <w:sz w:val="20"/>
               </w:rPr>
-              <w:t xml:space="preserve">45</w:t>
+              <w:t xml:space="preserve">99 %</w:t>
             </w:r>
             <w:r>
               <w:rPr>
@@ -626,13 +649,13 @@
                 <w:rFonts w:ascii="Times New Roman" w:hAnsi="Times New Roman"/>
                 <w:sz w:val="20"/>
               </w:rPr>
-              <w:t xml:space="preserve">[33 to 69]</w:t>
+              <w:t xml:space="preserve">[85 to 100]</w:t>
             </w:r>
           </w:p>
         </w:tc>
         <w:tc>
           <w:tcPr>
-            <w:tcW w:type="dxa" w:w="1049"/>
+            <w:tcW w:type="dxa" w:w="1417"/>
           </w:tcPr>
           <w:p>
             <w:pPr>
@@ -645,7 +668,7 @@
                 <w:rFonts w:ascii="Times New Roman" w:hAnsi="Times New Roman"/>
                 <w:sz w:val="20"/>
               </w:rPr>
-              <w:t xml:space="preserve">54</w:t>
+              <w:t xml:space="preserve">100 %</w:t>
             </w:r>
             <w:r>
               <w:rPr>
@@ -659,13 +682,34 @@
                 <w:rFonts w:ascii="Times New Roman" w:hAnsi="Times New Roman"/>
                 <w:sz w:val="20"/>
               </w:rPr>
-              <w:t xml:space="preserve">[41 to 84]</w:t>
+              <w:t xml:space="preserve">[96 to 100]</w:t>
+            </w:r>
+          </w:p>
+        </w:tc>
+      </w:tr>
+      <w:tr>
+        <w:tc>
+          <w:tcPr>
+            <w:tcW w:type="dxa" w:w="3628"/>
+          </w:tcPr>
+          <w:p>
+            <w:pPr>
+              <w:pStyle w:val="Compact"/>
+              <w:spacing w:after="20" w:before="20" w:line="240" w:lineRule="auto"/>
+              <w:jc w:val="left"/>
+            </w:pPr>
+            <w:r>
+              <w:rPr>
+                <w:rFonts w:ascii="Times New Roman" w:hAnsi="Times New Roman"/>
+                <w:sz w:val="20"/>
+              </w:rPr>
+              <w:t xml:space="preserve">Extreme rainfall: annual maximum 5-day rainfall, change from 1995–2014</w:t>
             </w:r>
           </w:p>
         </w:tc>
         <w:tc>
           <w:tcPr>
-            <w:tcW w:type="dxa" w:w="1049"/>
+            <w:tcW w:type="dxa" w:w="1191"/>
           </w:tcPr>
           <w:p>
             <w:pPr>
@@ -678,7 +722,7 @@
                 <w:rFonts w:ascii="Times New Roman" w:hAnsi="Times New Roman"/>
                 <w:sz w:val="20"/>
               </w:rPr>
-              <w:t xml:space="preserve">42</w:t>
+              <w:t xml:space="preserve">+8 %</w:t>
             </w:r>
             <w:r>
               <w:rPr>
@@ -692,13 +736,13 @@
                 <w:rFonts w:ascii="Times New Roman" w:hAnsi="Times New Roman"/>
                 <w:sz w:val="20"/>
               </w:rPr>
-              <w:t xml:space="preserve">[29 to 72]</w:t>
+              <w:t xml:space="preserve">[−7 to +29]</w:t>
             </w:r>
           </w:p>
         </w:tc>
         <w:tc>
           <w:tcPr>
-            <w:tcW w:type="dxa" w:w="1049"/>
+            <w:tcW w:type="dxa" w:w="1417"/>
           </w:tcPr>
           <w:p>
             <w:pPr>
@@ -711,7 +755,7 @@
                 <w:rFonts w:ascii="Times New Roman" w:hAnsi="Times New Roman"/>
                 <w:sz w:val="20"/>
               </w:rPr>
-              <w:t xml:space="preserve">91</w:t>
+              <w:t xml:space="preserve">+16 %</w:t>
             </w:r>
             <w:r>
               <w:rPr>
@@ -725,34 +769,13 @@
                 <w:rFonts w:ascii="Times New Roman" w:hAnsi="Times New Roman"/>
                 <w:sz w:val="20"/>
               </w:rPr>
-              <w:t xml:space="preserve">[59 to 134]</w:t>
-            </w:r>
-          </w:p>
-        </w:tc>
-      </w:tr>
-      <w:tr>
-        <w:tc>
-          <w:tcPr>
-            <w:tcW w:type="dxa" w:w="2268"/>
-          </w:tcPr>
-          <w:p>
-            <w:pPr>
-              <w:pStyle w:val="Compact"/>
-              <w:spacing w:after="20" w:before="20" w:line="240" w:lineRule="auto"/>
-              <w:jc w:val="left"/>
-            </w:pPr>
-            <w:r>
-              <w:rPr>
-                <w:rFonts w:ascii="Times New Roman" w:hAnsi="Times New Roman"/>
-                <w:sz w:val="20"/>
-              </w:rPr>
-              <w:t xml:space="preserve">Severe drought: share of land with at least one month of SPEI below −1.5</w:t>
+              <w:t xml:space="preserve">[−1 to +49]</w:t>
             </w:r>
           </w:p>
         </w:tc>
         <w:tc>
           <w:tcPr>
-            <w:tcW w:type="dxa" w:w="1049"/>
+            <w:tcW w:type="dxa" w:w="1417"/>
           </w:tcPr>
           <w:p>
             <w:pPr>
@@ -765,7 +788,7 @@
                 <w:rFonts w:ascii="Times New Roman" w:hAnsi="Times New Roman"/>
                 <w:sz w:val="20"/>
               </w:rPr>
-              <w:t xml:space="preserve">84 %</w:t>
+              <w:t xml:space="preserve">+18 %</w:t>
             </w:r>
             <w:r>
               <w:rPr>
@@ -779,13 +802,13 @@
                 <w:rFonts w:ascii="Times New Roman" w:hAnsi="Times New Roman"/>
                 <w:sz w:val="20"/>
               </w:rPr>
-              <w:t xml:space="preserve">[72 to 97]</w:t>
+              <w:t xml:space="preserve">[0 to +55]</w:t>
             </w:r>
           </w:p>
         </w:tc>
         <w:tc>
           <w:tcPr>
-            <w:tcW w:type="dxa" w:w="1049"/>
+            <w:tcW w:type="dxa" w:w="1417"/>
           </w:tcPr>
           <w:p>
             <w:pPr>
@@ -798,7 +821,7 @@
                 <w:rFonts w:ascii="Times New Roman" w:hAnsi="Times New Roman"/>
                 <w:sz w:val="20"/>
               </w:rPr>
-              <w:t xml:space="preserve">97 %</w:t>
+              <w:t xml:space="preserve">+24 %</w:t>
             </w:r>
             <w:r>
               <w:rPr>
@@ -812,358 +835,7 @@
                 <w:rFonts w:ascii="Times New Roman" w:hAnsi="Times New Roman"/>
                 <w:sz w:val="20"/>
               </w:rPr>
-              <w:t xml:space="preserve">[82 to 100]</w:t>
-            </w:r>
-          </w:p>
-        </w:tc>
-        <w:tc>
-          <w:tcPr>
-            <w:tcW w:type="dxa" w:w="1049"/>
-          </w:tcPr>
-          <w:p>
-            <w:pPr>
-              <w:pStyle w:val="Compact"/>
-              <w:spacing w:after="20" w:before="20" w:line="240" w:lineRule="auto"/>
-              <w:jc w:val="center"/>
-            </w:pPr>
-            <w:r>
-              <w:rPr>
-                <w:rFonts w:ascii="Times New Roman" w:hAnsi="Times New Roman"/>
-                <w:sz w:val="20"/>
-              </w:rPr>
-              <w:t xml:space="preserve">99 %</w:t>
-            </w:r>
-            <w:r>
-              <w:rPr>
-                <w:rFonts w:ascii="Times New Roman" w:hAnsi="Times New Roman"/>
-                <w:sz w:val="20"/>
-              </w:rPr>
-              <w:br/>
-            </w:r>
-            <w:r>
-              <w:rPr>
-                <w:rFonts w:ascii="Times New Roman" w:hAnsi="Times New Roman"/>
-                <w:sz w:val="20"/>
-              </w:rPr>
-              <w:t xml:space="preserve">[85 to 100]</w:t>
-            </w:r>
-          </w:p>
-        </w:tc>
-        <w:tc>
-          <w:tcPr>
-            <w:tcW w:type="dxa" w:w="1049"/>
-          </w:tcPr>
-          <w:p>
-            <w:pPr>
-              <w:pStyle w:val="Compact"/>
-              <w:spacing w:after="20" w:before="20" w:line="240" w:lineRule="auto"/>
-              <w:jc w:val="center"/>
-            </w:pPr>
-            <w:r>
-              <w:rPr>
-                <w:rFonts w:ascii="Times New Roman" w:hAnsi="Times New Roman"/>
-                <w:sz w:val="20"/>
-              </w:rPr>
-              <w:t xml:space="preserve">100 %</w:t>
-            </w:r>
-            <w:r>
-              <w:rPr>
-                <w:rFonts w:ascii="Times New Roman" w:hAnsi="Times New Roman"/>
-                <w:sz w:val="20"/>
-              </w:rPr>
-              <w:br/>
-            </w:r>
-            <w:r>
-              <w:rPr>
-                <w:rFonts w:ascii="Times New Roman" w:hAnsi="Times New Roman"/>
-                <w:sz w:val="20"/>
-              </w:rPr>
-              <w:t xml:space="preserve">[96 to 100]</w:t>
-            </w:r>
-          </w:p>
-        </w:tc>
-        <w:tc>
-          <w:tcPr>
-            <w:tcW w:type="dxa" w:w="1049"/>
-          </w:tcPr>
-          <w:p>
-            <w:pPr>
-              <w:pStyle w:val="Compact"/>
-              <w:spacing w:after="20" w:before="20" w:line="240" w:lineRule="auto"/>
-              <w:jc w:val="center"/>
-            </w:pPr>
-            <w:r>
-              <w:rPr>
-                <w:rFonts w:ascii="Times New Roman" w:hAnsi="Times New Roman"/>
-                <w:sz w:val="20"/>
-              </w:rPr>
-              <w:t xml:space="preserve">98 %</w:t>
-            </w:r>
-            <w:r>
-              <w:rPr>
-                <w:rFonts w:ascii="Times New Roman" w:hAnsi="Times New Roman"/>
-                <w:sz w:val="20"/>
-              </w:rPr>
-              <w:br/>
-            </w:r>
-            <w:r>
-              <w:rPr>
-                <w:rFonts w:ascii="Times New Roman" w:hAnsi="Times New Roman"/>
-                <w:sz w:val="20"/>
-              </w:rPr>
-              <w:t xml:space="preserve">[81 to 100]</w:t>
-            </w:r>
-          </w:p>
-        </w:tc>
-        <w:tc>
-          <w:tcPr>
-            <w:tcW w:type="dxa" w:w="1049"/>
-          </w:tcPr>
-          <w:p>
-            <w:pPr>
-              <w:pStyle w:val="Compact"/>
-              <w:spacing w:after="20" w:before="20" w:line="240" w:lineRule="auto"/>
-              <w:jc w:val="center"/>
-            </w:pPr>
-            <w:r>
-              <w:rPr>
-                <w:rFonts w:ascii="Times New Roman" w:hAnsi="Times New Roman"/>
-                <w:sz w:val="20"/>
-              </w:rPr>
-              <w:t xml:space="preserve">100 %</w:t>
-            </w:r>
-            <w:r>
-              <w:rPr>
-                <w:rFonts w:ascii="Times New Roman" w:hAnsi="Times New Roman"/>
-                <w:sz w:val="20"/>
-              </w:rPr>
-              <w:br/>
-            </w:r>
-            <w:r>
-              <w:rPr>
-                <w:rFonts w:ascii="Times New Roman" w:hAnsi="Times New Roman"/>
-                <w:sz w:val="20"/>
-              </w:rPr>
-              <w:t xml:space="preserve">[98 to 100]</w:t>
-            </w:r>
-          </w:p>
-        </w:tc>
-      </w:tr>
-      <w:tr>
-        <w:tc>
-          <w:tcPr>
-            <w:tcW w:type="dxa" w:w="2268"/>
-          </w:tcPr>
-          <w:p>
-            <w:pPr>
-              <w:pStyle w:val="Compact"/>
-              <w:spacing w:after="20" w:before="20" w:line="240" w:lineRule="auto"/>
-              <w:jc w:val="left"/>
-            </w:pPr>
-            <w:r>
-              <w:rPr>
-                <w:rFonts w:ascii="Times New Roman" w:hAnsi="Times New Roman"/>
-                <w:sz w:val="20"/>
-              </w:rPr>
-              <w:t xml:space="preserve">Extreme rainfall: annual maximum 5-day rainfall, change from 1995–2014</w:t>
-            </w:r>
-          </w:p>
-        </w:tc>
-        <w:tc>
-          <w:tcPr>
-            <w:tcW w:type="dxa" w:w="1049"/>
-          </w:tcPr>
-          <w:p>
-            <w:pPr>
-              <w:pStyle w:val="Compact"/>
-              <w:spacing w:after="20" w:before="20" w:line="240" w:lineRule="auto"/>
-              <w:jc w:val="center"/>
-            </w:pPr>
-            <w:r>
-              <w:rPr>
-                <w:rFonts w:ascii="Times New Roman" w:hAnsi="Times New Roman"/>
-                <w:sz w:val="20"/>
-              </w:rPr>
-              <w:t xml:space="preserve">+8 %</w:t>
-            </w:r>
-            <w:r>
-              <w:rPr>
-                <w:rFonts w:ascii="Times New Roman" w:hAnsi="Times New Roman"/>
-                <w:sz w:val="20"/>
-              </w:rPr>
-              <w:br/>
-            </w:r>
-            <w:r>
-              <w:rPr>
-                <w:rFonts w:ascii="Times New Roman" w:hAnsi="Times New Roman"/>
-                <w:sz w:val="20"/>
-              </w:rPr>
-              <w:t xml:space="preserve">[−7 to +29]</w:t>
-            </w:r>
-          </w:p>
-        </w:tc>
-        <w:tc>
-          <w:tcPr>
-            <w:tcW w:type="dxa" w:w="1049"/>
-          </w:tcPr>
-          <w:p>
-            <w:pPr>
-              <w:pStyle w:val="Compact"/>
-              <w:spacing w:after="20" w:before="20" w:line="240" w:lineRule="auto"/>
-              <w:jc w:val="center"/>
-            </w:pPr>
-            <w:r>
-              <w:rPr>
-                <w:rFonts w:ascii="Times New Roman" w:hAnsi="Times New Roman"/>
-                <w:sz w:val="20"/>
-              </w:rPr>
-              <w:t xml:space="preserve">+16 %</w:t>
-            </w:r>
-            <w:r>
-              <w:rPr>
-                <w:rFonts w:ascii="Times New Roman" w:hAnsi="Times New Roman"/>
-                <w:sz w:val="20"/>
-              </w:rPr>
-              <w:br/>
-            </w:r>
-            <w:r>
-              <w:rPr>
-                <w:rFonts w:ascii="Times New Roman" w:hAnsi="Times New Roman"/>
-                <w:sz w:val="20"/>
-              </w:rPr>
-              <w:t xml:space="preserve">[−1 to +49]</w:t>
-            </w:r>
-          </w:p>
-        </w:tc>
-        <w:tc>
-          <w:tcPr>
-            <w:tcW w:type="dxa" w:w="1049"/>
-          </w:tcPr>
-          <w:p>
-            <w:pPr>
-              <w:pStyle w:val="Compact"/>
-              <w:spacing w:after="20" w:before="20" w:line="240" w:lineRule="auto"/>
-              <w:jc w:val="center"/>
-            </w:pPr>
-            <w:r>
-              <w:rPr>
-                <w:rFonts w:ascii="Times New Roman" w:hAnsi="Times New Roman"/>
-                <w:sz w:val="20"/>
-              </w:rPr>
-              <w:t xml:space="preserve">+18 %</w:t>
-            </w:r>
-            <w:r>
-              <w:rPr>
-                <w:rFonts w:ascii="Times New Roman" w:hAnsi="Times New Roman"/>
-                <w:sz w:val="20"/>
-              </w:rPr>
-              <w:br/>
-            </w:r>
-            <w:r>
-              <w:rPr>
-                <w:rFonts w:ascii="Times New Roman" w:hAnsi="Times New Roman"/>
-                <w:sz w:val="20"/>
-              </w:rPr>
-              <w:t xml:space="preserve">[0 to +55]</w:t>
-            </w:r>
-          </w:p>
-        </w:tc>
-        <w:tc>
-          <w:tcPr>
-            <w:tcW w:type="dxa" w:w="1049"/>
-          </w:tcPr>
-          <w:p>
-            <w:pPr>
-              <w:pStyle w:val="Compact"/>
-              <w:spacing w:after="20" w:before="20" w:line="240" w:lineRule="auto"/>
-              <w:jc w:val="center"/>
-            </w:pPr>
-            <w:r>
-              <w:rPr>
-                <w:rFonts w:ascii="Times New Roman" w:hAnsi="Times New Roman"/>
-                <w:sz w:val="20"/>
-              </w:rPr>
-              <w:t xml:space="preserve">+24 %</w:t>
-            </w:r>
-            <w:r>
-              <w:rPr>
-                <w:rFonts w:ascii="Times New Roman" w:hAnsi="Times New Roman"/>
-                <w:sz w:val="20"/>
-              </w:rPr>
-              <w:br/>
-            </w:r>
-            <w:r>
-              <w:rPr>
-                <w:rFonts w:ascii="Times New Roman" w:hAnsi="Times New Roman"/>
-                <w:sz w:val="20"/>
-              </w:rPr>
               <w:t xml:space="preserve">[−1 to +67]</w:t>
-            </w:r>
-          </w:p>
-        </w:tc>
-        <w:tc>
-          <w:tcPr>
-            <w:tcW w:type="dxa" w:w="1049"/>
-          </w:tcPr>
-          <w:p>
-            <w:pPr>
-              <w:pStyle w:val="Compact"/>
-              <w:spacing w:after="20" w:before="20" w:line="240" w:lineRule="auto"/>
-              <w:jc w:val="center"/>
-            </w:pPr>
-            <w:r>
-              <w:rPr>
-                <w:rFonts w:ascii="Times New Roman" w:hAnsi="Times New Roman"/>
-                <w:sz w:val="20"/>
-              </w:rPr>
-              <w:t xml:space="preserve">+17 %</w:t>
-            </w:r>
-            <w:r>
-              <w:rPr>
-                <w:rFonts w:ascii="Times New Roman" w:hAnsi="Times New Roman"/>
-                <w:sz w:val="20"/>
-              </w:rPr>
-              <w:br/>
-            </w:r>
-            <w:r>
-              <w:rPr>
-                <w:rFonts w:ascii="Times New Roman" w:hAnsi="Times New Roman"/>
-                <w:sz w:val="20"/>
-              </w:rPr>
-              <w:t xml:space="preserve">[−1 to +54]</w:t>
-            </w:r>
-          </w:p>
-        </w:tc>
-        <w:tc>
-          <w:tcPr>
-            <w:tcW w:type="dxa" w:w="1049"/>
-          </w:tcPr>
-          <w:p>
-            <w:pPr>
-              <w:pStyle w:val="Compact"/>
-              <w:spacing w:after="20" w:before="20" w:line="240" w:lineRule="auto"/>
-              <w:jc w:val="center"/>
-            </w:pPr>
-            <w:r>
-              <w:rPr>
-                <w:rFonts w:ascii="Times New Roman" w:hAnsi="Times New Roman"/>
-                <w:sz w:val="20"/>
-              </w:rPr>
-              <w:t xml:space="preserve">+43 %</w:t>
-            </w:r>
-            <w:r>
-              <w:rPr>
-                <w:rFonts w:ascii="Times New Roman" w:hAnsi="Times New Roman"/>
-                <w:sz w:val="20"/>
-              </w:rPr>
-              <w:br/>
-            </w:r>
-            <w:r>
-              <w:rPr>
-                <w:rFonts w:ascii="Times New Roman" w:hAnsi="Times New Roman"/>
-                <w:sz w:val="20"/>
-              </w:rPr>
-              <w:t xml:space="preserve">[+5 to +110]</w:t>
             </w:r>
           </w:p>
         </w:tc>
@@ -1231,7 +903,7 @@
           <w:i/>
           <w:sz w:val="20"/>
         </w:rPr>
-        <w:t xml:space="preserve">(1.3 °C), Below 2 °C (1.6 °C) and Current policies (2.9 °C). Median of five climate models (18 for</w:t>
+        <w:t xml:space="preserve">(1.3 °C), Below 2 °C (1.6 °C) and Current policies (2.9 °C). Multi-model median, with the 5–95 %</w:t>
       </w:r>
       <w:r>
         <w:rPr>
@@ -1247,7 +919,7 @@
           <w:i/>
           <w:sz w:val="20"/>
         </w:rPr>
-        <w:t xml:space="preserve">extreme rainfall); 5–95 % range in brackets. The tool marks values after 2060 as indicative.</w:t>
+        <w:t xml:space="preserve">range in brackets.</w:t>
       </w:r>
     </w:p>
     <w:p>
@@ -1294,13 +966,19 @@
         </w:r>
       </w:hyperlink>
       <w:r>
-        <w:t xml:space="preserve">). By 2050, models project about 54 such days a year under Current policies,</w:t>
-      </w:r>
-      <w:r>
-        <w:t xml:space="preserve"> </w:t>
-      </w:r>
-      <w:r>
-        <w:t xml:space="preserve">against 45 under Below 2 °C and 41 under Net Zero 2050; by 2100 the gap widens to 91 against 42 days. This</w:t>
+        <w:t xml:space="preserve">). By 2050, models project about 54 such days a year under Current policies, against</w:t>
+      </w:r>
+      <w:r>
+        <w:t xml:space="preserve"> </w:t>
+      </w:r>
+      <w:r>
+        <w:t xml:space="preserve">45 under Below 2 °C and 41 under Net Zero 2050, close to the 2030 level of about 39 days. Results after 2060</w:t>
+      </w:r>
+      <w:r>
+        <w:t xml:space="preserve"> </w:t>
+      </w:r>
+      <w:r>
+        <w:t xml:space="preserve">are only indicative, but the gap keeps widening: about 91 days [59 to 134] against 42 [29 to 72] by 2100. This</w:t>
       </w:r>
       <w:r>
         <w:t xml:space="preserve"> </w:t>
@@ -1353,19 +1031,13 @@
         <w:t xml:space="preserve"> </w:t>
       </w:r>
       <w:r>
-        <w:t xml:space="preserve">100 % by 2050 in all three scenarios, with largely overlapping ranges. On this indicator, limiting warming</w:t>
-      </w:r>
-      <w:r>
-        <w:t xml:space="preserve"> </w:t>
-      </w:r>
-      <w:r>
-        <w:t xml:space="preserve">makes little difference before mid-century, so rain-fed millet, sorghum and pastures are likely to face more</w:t>
-      </w:r>
-      <w:r>
-        <w:t xml:space="preserve"> </w:t>
-      </w:r>
-      <w:r>
-        <w:t xml:space="preserve">frequent water stress whatever the global outcome.</w:t>
+        <w:t xml:space="preserve">100 % by 2050 in all three scenarios, with largely overlapping ranges. Rain-fed millet, sorghum and pastures</w:t>
+      </w:r>
+      <w:r>
+        <w:t xml:space="preserve"> </w:t>
+      </w:r>
+      <w:r>
+        <w:t xml:space="preserve">are therefore likely to face more frequent water stress whatever the global outcome.</w:t>
       </w:r>
     </w:p>
     <w:p>
@@ -1389,19 +1061,19 @@
         <w:t xml:space="preserve"> </w:t>
       </w:r>
       <w:r>
-        <w:t xml:space="preserve">under Current policies, against 18 % under Below 2 °C; by 2100 the projected change is +43 % against</w:t>
-      </w:r>
-      <w:r>
-        <w:t xml:space="preserve"> </w:t>
-      </w:r>
-      <w:r>
-        <w:t xml:space="preserve">+17 %, although ranges are wide. Heavier downpours would raise flood risk in Niamey and the Niger River valley,</w:t>
-      </w:r>
-      <w:r>
-        <w:t xml:space="preserve"> </w:t>
-      </w:r>
-      <w:r>
-        <w:t xml:space="preserve">where people, infrastructure and irrigated rice are concentrated.</w:t>
+        <w:t xml:space="preserve">under Current policies, against 18 % under Below 2 °C and 16 % under Net Zero 2050. The ranges overlap</w:t>
+      </w:r>
+      <w:r>
+        <w:t xml:space="preserve"> </w:t>
+      </w:r>
+      <w:r>
+        <w:t xml:space="preserve">and their low ends are close to zero, so this difference is uncertain. Heavier downpours would raise flood risk</w:t>
+      </w:r>
+      <w:r>
+        <w:t xml:space="preserve"> </w:t>
+      </w:r>
+      <w:r>
+        <w:t xml:space="preserve">in Niamey and the Niger River valley, where people, infrastructure and irrigated rice are concentrated.</w:t>
       </w:r>
     </w:p>
     <w:p>
@@ -1411,14 +1083,14 @@
       <w:r>
         <w:drawing>
           <wp:inline>
-            <wp:extent cx="5760720" cy="2331720"/>
+            <wp:extent cx="5760720" cy="2706623"/>
             <wp:effectExtent b="0" l="0" r="0" t="0"/>
             <wp:docPr descr="" title="" id="24" name="Picture"/>
             <a:graphic>
               <a:graphicData uri="http://schemas.openxmlformats.org/drawingml/2006/picture">
                 <pic:pic>
                   <pic:nvPicPr>
-                    <pic:cNvPr descr="fig_heat.png" id="25" name="Picture"/>
+                    <pic:cNvPr descr="cie_heat_capture.png" id="25" name="Picture"/>
                     <pic:cNvPicPr>
                       <a:picLocks noChangeArrowheads="1" noChangeAspect="1"/>
                     </pic:cNvPicPr>
@@ -1432,7 +1104,7 @@
                   <pic:spPr bwMode="auto">
                     <a:xfrm>
                       <a:off x="0" y="0"/>
-                      <a:ext cx="5760720" cy="2331720"/>
+                      <a:ext cx="5760720" cy="2706623"/>
                     </a:xfrm>
                     <a:prstGeom prst="rect">
                       <a:avLst/>
@@ -1462,7 +1134,7 @@
           <w:bCs/>
           <w:b/>
         </w:rPr>
-        <w:t xml:space="preserve">Figure 1. Days of dangerous heat per year in Niger under Below 2 °C and Current</w:t>
+        <w:t xml:space="preserve">Figure 1. Days per year with dangerous heat risk in Niger, NGFS Current policies (blue) and</w:t>
       </w:r>
       <w:r>
         <w:rPr>
@@ -1476,31 +1148,13 @@
           <w:bCs/>
           <w:b/>
         </w:rPr>
-        <w:t xml:space="preserve">policies.</w:t>
-      </w:r>
-      <w:r>
-        <w:t xml:space="preserve"> </w:t>
-      </w:r>
-      <w:r>
-        <w:t xml:space="preserve">The curves separate after 2030; the gap is what limiting warming avoids. Open circles mark the years</w:t>
-      </w:r>
-      <w:r>
-        <w:t xml:space="preserve"> </w:t>
-      </w:r>
-      <w:r>
-        <w:t xml:space="preserve">in which global warming reaches +1.5 °C (about 2030), +2.0 °C (2049) and +2.5 °C (2074) under</w:t>
-      </w:r>
-      <w:r>
-        <w:t xml:space="preserve"> </w:t>
-      </w:r>
-      <w:r>
-        <w:t xml:space="preserve">Current policies. Bands: 5–95 % model range; dashed lines: indicative results after 2060. Chart drawn from</w:t>
-      </w:r>
-      <w:r>
-        <w:t xml:space="preserve"> </w:t>
-      </w:r>
-      <w:r>
-        <w:t xml:space="preserve">Climate Impact Explorer data (</w:t>
+        <w:t xml:space="preserve">Below 2 °C (green).</w:t>
+      </w:r>
+      <w:r>
+        <w:t xml:space="preserve"> </w:t>
+      </w:r>
+      <w:r>
+        <w:t xml:space="preserve">Screenshot from the Climate Impact Explorer (</w:t>
       </w:r>
       <w:hyperlink r:id="rId21">
         <w:r>
@@ -1511,7 +1165,25 @@
         </w:r>
       </w:hyperlink>
       <w:r>
-        <w:t xml:space="preserve">).</w:t>
+        <w:t xml:space="preserve">). The two curves are identical until</w:t>
+      </w:r>
+      <w:r>
+        <w:t xml:space="preserve"> </w:t>
+      </w:r>
+      <w:r>
+        <w:t xml:space="preserve">about 2030 and then separate; the gap is what limiting warming avoids. Dots on the blue curve mark the years in</w:t>
+      </w:r>
+      <w:r>
+        <w:t xml:space="preserve"> </w:t>
+      </w:r>
+      <w:r>
+        <w:t xml:space="preserve">which global warming reaches 1.5, 2.0 and 2.5 °C under Current policies. Shaded bands show the 5–95 % model</w:t>
+      </w:r>
+      <w:r>
+        <w:t xml:space="preserve"> </w:t>
+      </w:r>
+      <w:r>
+        <w:t xml:space="preserve">range; after 2060 the lines are dotted and the bands hatched because results are indicative.</w:t>
       </w:r>
     </w:p>
     <w:bookmarkEnd w:id="26"/>
@@ -1529,49 +1201,43 @@
         <w:pStyle w:val="FirstParagraph"/>
       </w:pPr>
       <w:r>
-        <w:t xml:space="preserve">Compared with Current policies, Below 2 °C would avoid about</w:t>
-      </w:r>
-      <w:r>
-        <w:t xml:space="preserve"> </w:t>
-      </w:r>
-      <w:r>
-        <w:t xml:space="preserve">9 days of dangerous heat a year by 2050 and about 49 by 2100, and would limit the intensification of extreme</w:t>
-      </w:r>
-      <w:r>
-        <w:t xml:space="preserve"> </w:t>
-      </w:r>
-      <w:r>
-        <w:t xml:space="preserve">rainfall to +17 % instead of +43 % by 2100. Of the three indicators, heat separates the scenarios most</w:t>
-      </w:r>
-      <w:r>
-        <w:t xml:space="preserve"> </w:t>
-      </w:r>
-      <w:r>
-        <w:t xml:space="preserve">clearly: by 2100, even the low end of the Current policies range (59 days) lies above the central Below 2 °C</w:t>
-      </w:r>
-      <w:r>
-        <w:t xml:space="preserve"> </w:t>
-      </w:r>
-      <w:r>
-        <w:t xml:space="preserve">value (42 days), whereas the rainfall ranges overlap. The World Bank estimates that climate change could reduce</w:t>
-      </w:r>
-      <w:r>
-        <w:t xml:space="preserve"> </w:t>
-      </w:r>
-      <w:r>
-        <w:t xml:space="preserve">Niger’s annual GDP by 2.2 % in wetter scenarios and by 11.9 % in drier ones by 2050. It links extreme</w:t>
-      </w:r>
-      <w:r>
-        <w:t xml:space="preserve"> </w:t>
-      </w:r>
-      <w:r>
-        <w:t xml:space="preserve">weather to low agricultural production, high food prices and food insecurity, and notes growing competition</w:t>
-      </w:r>
-      <w:r>
-        <w:t xml:space="preserve"> </w:t>
-      </w:r>
-      <w:r>
-        <w:t xml:space="preserve">between farmers and pastoralists for scarce resources (</w:t>
+        <w:t xml:space="preserve">Of the three indicators, heat is the one on which global emission cuts make the clearest difference. By 2050,</w:t>
+      </w:r>
+      <w:r>
+        <w:t xml:space="preserve"> </w:t>
+      </w:r>
+      <w:r>
+        <w:t xml:space="preserve">Below 2 °C would avoid about 9 days of dangerous heat a year compared with Current policies, and Net Zero 2050</w:t>
+      </w:r>
+      <w:r>
+        <w:t xml:space="preserve"> </w:t>
+      </w:r>
+      <w:r>
+        <w:t xml:space="preserve">about 13; after 2050, Net Zero 2050 is the only scenario in which heat days fall back towards today’s level</w:t>
+      </w:r>
+      <w:r>
+        <w:t xml:space="preserve"> </w:t>
+      </w:r>
+      <w:r>
+        <w:t xml:space="preserve">(about 32 by 2100, indicative). The World Bank estimates that climate change could reduce Niger’s annual GDP by</w:t>
+      </w:r>
+      <w:r>
+        <w:t xml:space="preserve"> </w:t>
+      </w:r>
+      <w:r>
+        <w:t xml:space="preserve">2.2 % in wetter scenarios and by 11.9 % in drier ones by 2050. It links extreme weather to low agricultural</w:t>
+      </w:r>
+      <w:r>
+        <w:t xml:space="preserve"> </w:t>
+      </w:r>
+      <w:r>
+        <w:t xml:space="preserve">production, high food prices and food insecurity, and notes growing competition between farmers and</w:t>
+      </w:r>
+      <w:r>
+        <w:t xml:space="preserve"> </w:t>
+      </w:r>
+      <w:r>
+        <w:t xml:space="preserve">pastoralists for scarce resources (</w:t>
       </w:r>
       <w:hyperlink r:id="rId27">
         <w:r>
@@ -1582,13 +1248,13 @@
         </w:r>
       </w:hyperlink>
       <w:r>
-        <w:t xml:space="preserve">). Because drought is projected to spread in</w:t>
-      </w:r>
-      <w:r>
-        <w:t xml:space="preserve"> </w:t>
-      </w:r>
-      <w:r>
-        <w:t xml:space="preserve">every scenario, Niger should defend the 1.5 °C goal in the negotiations while seeking adaptation finance for</w:t>
+        <w:t xml:space="preserve">). Niger should therefore defend the 1.5 °C goal in the</w:t>
+      </w:r>
+      <w:r>
+        <w:t xml:space="preserve"> </w:t>
+      </w:r>
+      <w:r>
+        <w:t xml:space="preserve">negotiations and, because drought is projected to spread in every scenario, seek adaptation finance for</w:t>
       </w:r>
       <w:r>
         <w:t xml:space="preserve"> </w:t>
@@ -1612,19 +1278,19 @@
         <w:pStyle w:val="FirstParagraph"/>
       </w:pPr>
       <w:r>
-        <w:t xml:space="preserve">These are projections, not forecasts, with wide model ranges; this memo emphasises 2050 because results after</w:t>
-      </w:r>
-      <w:r>
-        <w:t xml:space="preserve"> </w:t>
-      </w:r>
-      <w:r>
-        <w:t xml:space="preserve">2060 are indicative. The heat index relies on estimated humidity, and the drought indicator saturates. Given</w:t>
-      </w:r>
-      <w:r>
-        <w:t xml:space="preserve"> </w:t>
-      </w:r>
-      <w:r>
-        <w:t xml:space="preserve">Niger’s high vulnerability, actual impacts may exceed what these hazard indicators suggest.</w:t>
+        <w:t xml:space="preserve">These are projections, not forecasts, with wide model ranges; this memo relies mainly on 2050 because the tool</w:t>
+      </w:r>
+      <w:r>
+        <w:t xml:space="preserve"> </w:t>
+      </w:r>
+      <w:r>
+        <w:t xml:space="preserve">marks results after 2060 as indicative. The heat index relies on estimated humidity, and the drought indicator</w:t>
+      </w:r>
+      <w:r>
+        <w:t xml:space="preserve"> </w:t>
+      </w:r>
+      <w:r>
+        <w:t xml:space="preserve">saturates. Given Niger’s high vulnerability, actual impacts may exceed what these hazard indicators suggest.</w:t>
       </w:r>
     </w:p>
     <w:bookmarkEnd w:id="29"/>

</xml_diff>